<commit_message>
Fill in personal learning drafts
Co-Authored-By: Claude Opus 5.5 <noreply@anthropic.com>
Claude-Session: https://claude.ai/code/session_013eZbSDorZB8dhyvM8NFPNW
</commit_message>
<xml_diff>
--- a/negotiation-final-project/למידה_אישית_כותבת_1.docx
+++ b/negotiation-final-project/למידה_אישית_כותבת_1.docx
@@ -51,16 +51,6 @@
         <w:rPr>
           <w:b w:val="0"/>
           <w:i w:val="0"/>
-          <w:highlight w:val="yellow"/>
-        </w:rPr>
-        <w:t>[טיוטה לעריכה אישית: להשלים את החלקים בצהוב ולהתאים את הניסוח לחוויה שלך.]</w:t>
-      </w:r>
-    </w:p>
-    <w:p>
-      <w:r>
-        <w:rPr>
-          <w:b w:val="0"/>
-          <w:i w:val="0"/>
         </w:rPr>
         <w:t>נכנסתי לקורס עם הנחה שמשא ומתן הוא בעיקר עניין של כוח ושל עקשנות: מי שמחזיקה מעמד יותר זמן משיגה יותר. הקורס והעבודה ערערו את ההנחה הזאת, ובפרק זה אציג את ההיבטים המרכזיים של מה שלמדתי.</w:t>
       </w:r>
@@ -79,7 +69,7 @@
           <w:b w:val="0"/>
           <w:i w:val="0"/>
         </w:rPr>
-        <w:t xml:space="preserve"> בשאלון TKI שמילאתי בתחילת הקורס קיבלתי את הציון הגבוה ביותר בסגנון [הסגנון שיצא לך: תחרותי / שיתופי / פשרני / מוותר / נמנע], ובמקום השני [הסגנון השני]. בהתחלה ראיתי בזה תיאור של מי שאני. אחרי הראיונות הבנתי שזה תיאור של הרגל. שלושת המנהלים שראיינו עוברים בין סגנונות לפי הצד שמולם: קשוחים מול ספק, פורמליים מול הרשות, רכים וסבלניים מול הורים. הבנתי שהשאלה אינה איזה סגנון יש לי, אלא האם אני בוחרת אותו לפי המצב או נגררת אליו מתוך הרגל.</w:t>
+        <w:t xml:space="preserve"> בשאלון TKI שמילאתי בתחילת הקורס קיבלתי את הציון הגבוה ביותר בסגנון הפשרני, ובמקום השני בסגנון התחרותי. בהתחלה ראיתי בזה תיאור של מי שאני. אחרי הראיונות הבנתי שזה תיאור של הרגל. שלושת המנהלים שראיינו עוברים בין סגנונות לפי הצד שמולם: קשוחים מול ספק, פורמליים מול הרשות, רכים וסבלניים מול הורים. הבנתי שהשאלה אינה איזה סגנון יש לי, אלא האם אני בוחרת אותו לפי המצב או נגררת אליו מתוך הרגל.</w:t>
       </w:r>
     </w:p>
     <w:p>
@@ -96,7 +86,7 @@
           <w:b w:val="0"/>
           <w:i w:val="0"/>
         </w:rPr>
-        <w:t xml:space="preserve"> המיומנות שהכי חסרה לי, ושהקורס חשף, היא לעצור ולשאול למה הצד השני רוצה את מה שהוא רוצה. בוויכוחים שלי בעבודה ובבית אני נוטה לענות לעמדה ולא לאינטרס. [דוגמה קצרה מהחיים שלך: ויכוח או משא ומתן שבו התעקשת על עמדה, ומה היה קורה אילו שאלת "למה".] בכל ששת המקרים בעבודה, נקודת המפנה הייתה בדיוק הרגע הזה, והוא הגיע לרוב בשיחה לא פורמלית: פגישה אישית עם גזבר, ערב עם מורות אחרי אזעקה, קפה בבית של משפחה.</w:t>
+        <w:t xml:space="preserve"> המיומנות שהכי חסרה לי, ושהקורס חשף, היא לעצור ולשאול למה הצד השני רוצה את מה שהוא רוצה. בוויכוחים שלי בעבודה ובבית אני נוטה לענות לעמדה ולא לאינטרס. כך, למשל, כשהתבקשתי בעבודה לקחת על עצמי משמרות נוספות בתקופה עמוסה, עניתי מיד "לא" והתעקשתי על כך. רק אחר כך הבנתי שמה שהמנהלת שלי צריכה היה כיסוי ליומיים ספציפיים, ושיכולנו להגיע להסדר שמתאים לשתינו, אילו שאלתי למה היא מבקשת. בכל ששת המקרים בעבודה, נקודת המפנה הייתה בדיוק הרגע הזה, והוא הגיע לרוב בשיחה לא פורמלית: פגישה אישית עם גזבר, ערב עם מורות אחרי אזעקה, קפה בבית של משפחה.</w:t>
       </w:r>
     </w:p>
     <w:p>

</xml_diff>

<commit_message>
Use colons after bold lead-ins in personal learning drafts
Co-Authored-By: Claude Opus 5.5 <noreply@anthropic.com>
Claude-Session: https://claude.ai/code/session_013eZbSDorZB8dhyvM8NFPNW
</commit_message>
<xml_diff>
--- a/negotiation-final-project/למידה_אישית_כותבת_1.docx
+++ b/negotiation-final-project/למידה_אישית_כותבת_1.docx
@@ -62,7 +62,7 @@
           <w:i w:val="0"/>
           <w:bCs/>
         </w:rPr>
-        <w:t>מסגנון אחד לכמה סגנונות.</w:t>
+        <w:t>מסגנון אחד לכמה סגנונות:</w:t>
       </w:r>
       <w:r>
         <w:rPr>
@@ -79,7 +79,7 @@
           <w:i w:val="0"/>
           <w:bCs/>
         </w:rPr>
-        <w:t>השאלה "למה".</w:t>
+        <w:t>השאלה "למה":</w:t>
       </w:r>
       <w:r>
         <w:rPr>
@@ -96,7 +96,7 @@
           <w:i w:val="0"/>
           <w:bCs/>
         </w:rPr>
-        <w:t>חוויה משמעותית: הריאיון על התלמידה.</w:t>
+        <w:t>חוויה משמעותית: הריאיון על התלמידה:</w:t>
       </w:r>
       <w:r>
         <w:rPr>
@@ -113,7 +113,7 @@
           <w:i w:val="0"/>
           <w:bCs/>
         </w:rPr>
-        <w:t>שינוי עמדה: נתונים במקום כעס.</w:t>
+        <w:t>שינוי עמדה: נתונים במקום כעס:</w:t>
       </w:r>
       <w:r>
         <w:rPr>
@@ -130,7 +130,7 @@
           <w:i w:val="0"/>
           <w:bCs/>
         </w:rPr>
-        <w:t>מה נדרש ממני כדי להיות אשת מקצוע.</w:t>
+        <w:t>מה נדרש ממני כדי להיות אשת מקצוע:</w:t>
       </w:r>
       <w:r>
         <w:rPr>
@@ -147,7 +147,7 @@
           <w:i w:val="0"/>
           <w:bCs/>
         </w:rPr>
-        <w:t>תובנה על התחום.</w:t>
+        <w:t>תובנה על התחום:</w:t>
       </w:r>
       <w:r>
         <w:rPr>

</xml_diff>

<commit_message>
Avoid double colons in personal learning headings
Co-Authored-By: Claude Opus 5.5 <noreply@anthropic.com>
Claude-Session: https://claude.ai/code/session_013eZbSDorZB8dhyvM8NFPNW
</commit_message>
<xml_diff>
--- a/negotiation-final-project/למידה_אישית_כותבת_1.docx
+++ b/negotiation-final-project/למידה_אישית_כותבת_1.docx
@@ -96,7 +96,7 @@
           <w:i w:val="0"/>
           <w:bCs/>
         </w:rPr>
-        <w:t>חוויה משמעותית: הריאיון על התלמידה:</w:t>
+        <w:t>חוויה משמעותית, הריאיון על התלמידה:</w:t>
       </w:r>
       <w:r>
         <w:rPr>
@@ -113,7 +113,7 @@
           <w:i w:val="0"/>
           <w:bCs/>
         </w:rPr>
-        <w:t>שינוי עמדה: נתונים במקום כעס:</w:t>
+        <w:t>שינוי עמדה, נתונים במקום כעס:</w:t>
       </w:r>
       <w:r>
         <w:rPr>

</xml_diff>

<commit_message>
Tie personal learning drafts to course concepts with citations
Co-Authored-By: Claude Opus 5.5 <noreply@anthropic.com>
Claude-Session: https://claude.ai/code/session_013eZbSDorZB8dhyvM8NFPNW
</commit_message>
<xml_diff>
--- a/negotiation-final-project/למידה_אישית_כותבת_1.docx
+++ b/negotiation-final-project/למידה_אישית_כותבת_1.docx
@@ -69,7 +69,7 @@
           <w:b w:val="0"/>
           <w:i w:val="0"/>
         </w:rPr>
-        <w:t xml:space="preserve"> בשאלון TKI שמילאתי בתחילת הקורס קיבלתי את הציון הגבוה ביותר בסגנון הפשרני, ובמקום השני בסגנון התחרותי. בהתחלה ראיתי בזה תיאור של מי שאני. אחרי הראיונות הבנתי שזה תיאור של הרגל. שלושת המנהלים שראיינו עוברים בין סגנונות לפי הצד שמולם: קשוחים מול ספק, פורמליים מול הרשות, רכים וסבלניים מול הורים. הבנתי שהשאלה אינה איזה סגנון יש לי, אלא האם אני בוחרת אותו לפי המצב או נגררת אליו מתוך הרגל.</w:t>
+        <w:t xml:space="preserve"> בשאלון TKI שמילאתי בתחילת הקורס קיבלתי את הציון הגבוה ביותר בסגנון הפשרני, ובמקום השני בסגנון התחרותי. בהתחלה ראיתי בזה תיאור של מי שאני. אחרי הראיונות הבנתי שזה תיאור של הרגל. שלושת המנהלים שראיינו עוברים בין סגנונות לפי הצד שמולם: קשוחים מול ספק, פורמליים מול הרשות, רכים וסבלניים מול הורים. הבנתי שהשאלה אינה איזה סגנון יש לי, אלא האם אני בוחרת אותו לפי המצב או נגררת אליו מתוך הרגל. מודל העניין הכפול, שלמדנו בקורס, נתן לזה שפה: הבחירה בסגנון תלויה במשקל שאני נותנת לתוצאה שלי ולתוצאה של הצד השני (Rahim, 1983, כפי שמצוטט אצל הוכמן, 2026). גם הממצא שהוצג בשיעור, שיש פער בין הסגנון שאנשים מצהירים עליו לבין מה שהם עושים בפועל (Miller, 2014, כפי שמצוטט אצל הוכמן, 2026), תיאר אותי בדיוק: אני רואה את עצמי כפשרנית, אבל בלחץ אני הופכת לתחרותית.</w:t>
       </w:r>
     </w:p>
     <w:p>
@@ -86,7 +86,7 @@
           <w:b w:val="0"/>
           <w:i w:val="0"/>
         </w:rPr>
-        <w:t xml:space="preserve"> המיומנות שהכי חסרה לי, ושהקורס חשף, היא לעצור ולשאול למה הצד השני רוצה את מה שהוא רוצה. בוויכוחים שלי בעבודה ובבית אני נוטה לענות לעמדה ולא לאינטרס. כך, למשל, כשהתבקשתי בעבודה לקחת על עצמי משמרות נוספות בתקופה עמוסה, עניתי מיד "לא" והתעקשתי על כך. רק אחר כך הבנתי שמה שהמנהלת שלי צריכה היה כיסוי ליומיים ספציפיים, ושיכולנו להגיע להסדר שמתאים לשתינו, אילו שאלתי למה היא מבקשת. בכל ששת המקרים בעבודה, נקודת המפנה הייתה בדיוק הרגע הזה, והוא הגיע לרוב בשיחה לא פורמלית: פגישה אישית עם גזבר, ערב עם מורות אחרי אזעקה, קפה בבית של משפחה.</w:t>
+        <w:t xml:space="preserve"> המיומנות שהכי חסרה לי, ושהקורס חשף, היא לעצור ולשאול למה הצד השני רוצה את מה שהוא רוצה. בשיעור למדנו שעמדה היא "מה אני רוצה" ואינטרס הוא "למה אני רוצה את מה שאני רוצה", ושמאחורי עמדות מנוגדות מסתתרים לעיתים קרובות אינטרסים משותפים (הוכמן, 2026). בוויכוחים שלי בעבודה ובבית אני נוטה לענות לעמדה ולא לאינטרס. כך, למשל, כשהתבקשתי בעבודה לקחת על עצמי משמרות נוספות בתקופה עמוסה, עניתי מיד "לא" והתעקשתי על כך. רק אחר כך הבנתי שמה שהמנהלת שלי צריכה היה כיסוי ליומיים ספציפיים, ושיכולנו להגיע להסדר שמתאים לשתינו, אילו שאלתי למה היא מבקשת. בכל ששת המקרים בעבודה, נקודת המפנה הייתה בדיוק הרגע הזה, והוא הגיע לרוב בשיחה לא פורמלית: פגישה אישית עם גזבר, ערב עם מורות אחרי אזעקה, קפה בבית של משפחה.</w:t>
       </w:r>
     </w:p>
     <w:p>
@@ -103,7 +103,7 @@
           <w:b w:val="0"/>
           <w:i w:val="0"/>
         </w:rPr>
-        <w:t xml:space="preserve"> הרגע שהכי נשאר איתי מהעבודה הוא הסיפור של ח'אלד על התלמידה שאביה רצה להוציא אותה מבית הספר. זה היה משא ומתן בלי כסף, בלי חוזה וכמעט בלי כוח, ובכל זאת הוא הסתיים בתעודת בגרות. הבנתי ממנו שכשאין לי BATNA טובה, הכלי החזק ביותר הוא לתת לצד השני דרך לצאת בכבוד. הבנתי גם שיש לזה מחיר: ח'אלד עצמו לא שלם עם חלק מהוויתורים. לא ידעתי לפני הקורס שאפשר להצליח במשא ומתן ועדיין להרגיש אי־נוחות עם התוצאה, ושגם זה חלק מהעבודה.</w:t>
+        <w:t xml:space="preserve"> הרגע שהכי נשאר איתי מהעבודה הוא הסיפור של ח'אלד על התלמידה שאביה רצה להוציא אותה מבית הספר. זה היה משא ומתן בלי כסף, בלי חוזה וכמעט בלי כוח, ובכל זאת הוא הסתיים בתעודת בגרות. הבנתי ממנו שכשאין לי BATNA טובה, הכלי החזק ביותר הוא לתת לצד השני דרך לצאת בכבוד. זה בדיוק מה שפישר, יורי ופאטון (2013) מתכוונים אליו כשהם כותבים שהאינטרסים החזקים ביותר הם צרכים אנושיים בסיסיים כמו הכרה וכבוד, ושצריך להפריד בין האנשים לבין הבעיה. הבנתי גם שיש לזה מחיר: ח'אלד עצמו לא שלם עם חלק מהוויתורים. לא ידעתי לפני הקורס שאפשר להצליח במשא ומתן ועדיין להרגיש אי־נוחות עם התוצאה, ושגם זה חלק מהעבודה.</w:t>
       </w:r>
     </w:p>
     <w:p>
@@ -120,7 +120,7 @@
           <w:b w:val="0"/>
           <w:i w:val="0"/>
         </w:rPr>
-        <w:t xml:space="preserve"> לפני הקורס חשבתי שמי שמרגישה צודקת צריכה להראות את זה. המנהלים שראיינו אמרו שוב ושוב שהכעס שלהם היה מוצדק ולא היה שימושי, ושטבלה אחת של ימים ללא הסעה או מיפוי של תלמידים עשו יותר מכל הטענות. זה שינה את הדרך שבה אני מתכוננת: לפני שיחה חשובה אני שואלת את עצמי איזה קריטריון אובייקטיבי אני יכולה להביא, ומה החלופה שלי אם לא נגיע להסכמה (פישר ואחרים, 2013).</w:t>
+        <w:t xml:space="preserve"> לפני הקורס חשבתי שמי שמרגישה צודקת צריכה להראות את זה. המנהלים שראיינו אמרו שוב ושוב שהכעס שלהם היה מוצדק ולא היה שימושי, ושטבלה אחת של ימים ללא הסעה או מיפוי של תלמידים עשו יותר מכל הטענות. זה שינה את הדרך שבה אני מתכוננת: לפני שיחה חשובה אני שואלת את עצמי איזה קריטריון אובייקטיבי אני יכולה להביא, ומה החלופה שלי אם לא נגיע להסכמה (פישר ואחרים, 2013). מודל שבעת הרכיבים שלמדנו, אינטרסים, חלופות, קריטריונים, אופציות, יחסים, תקשורת ומחויבות (הוכמן, 2026), הפך אצלי לרשימת הכנה של ממש.</w:t>
       </w:r>
     </w:p>
     <w:p>
@@ -137,7 +137,7 @@
           <w:b w:val="0"/>
           <w:i w:val="0"/>
         </w:rPr>
-        <w:t xml:space="preserve"> אני יוצאת מהקורס עם שלוש משימות אישיות. הראשונה, להתכונן לכל משא ומתן משמעותי עם BATNA כתובה וקו אדום ברור. השנייה, לשאול בהתחלה מי מוסמך לאשר את ההסכם ומי יכול לפוצץ אותו. השלישית, והקשה ביותר עבורי, לדחות את התגובה הרגשית לפגישה הראשונה ולהתחיל בשאלה ולא בדרישה.</w:t>
+        <w:t xml:space="preserve"> אני יוצאת מהקורס עם שלוש משימות אישיות. הראשונה, להשקיע בשלב ההכנה, שהוא לפי גלין השלב הראשון והמכריע במשא ומתן (גלין, 1996, כפי שמצוטט אצל הוכמן, 2026): להגיע עם BATNA כתובה וקו אדום ברור. השנייה, לשאול בהתחלה מי מוסמך לאשר את ההסכם ומי יכול לפוצץ אותו. כשסמיר סיפר שהגזבר פתח מחדש הסכמה שכבר סגר, זיהיתי את טקטיקת "המדרג הניהולי" שלמדנו בשיעור (הוכמן, 2026), ואני רוצה לדעת לזהות אותה בזמן אמת ולא רק בדיעבד. השלישית, והקשה ביותר עבורי, לדחות את התגובה הרגשית לפגישה הראשונה ולהתחיל בשאלה ולא בדרישה.</w:t>
       </w:r>
     </w:p>
     <w:p>
@@ -163,6 +163,19 @@
       </w:pPr>
       <w:r>
         <w:t>מקורות</w:t>
+      </w:r>
+    </w:p>
+    <w:p>
+      <w:pPr>
+        <w:ind w:hanging="709" w:right="709"/>
+        <w:jc w:val="right"/>
+      </w:pPr>
+      <w:r>
+        <w:rPr>
+          <w:b w:val="0"/>
+          <w:i w:val="0"/>
+        </w:rPr>
+        <w:t>הוכמן, ר' (2026). מבוא למו"מ; ניהול מו"מ [מצגות הרצאה]. ניהול משא ומתן, הקריה האקדמית אונו.</w:t>
       </w:r>
     </w:p>
     <w:p>

</xml_diff>

<commit_message>
Add Ono logo, set Hebrew proofing language, hide spelling squiggles, fix XML order
Co-Authored-By: Claude Opus 5.5 <noreply@anthropic.com>
Claude-Session: https://claude.ai/code/session_013eZbSDorZB8dhyvM8NFPNW
</commit_message>
<xml_diff>
--- a/negotiation-final-project/למידה_אישית_כותבת_1.docx
+++ b/negotiation-final-project/למידה_אישית_כותבת_1.docx
@@ -7,10 +7,49 @@
         <w:jc w:val="center"/>
       </w:pPr>
       <w:r>
+        <w:drawing>
+          <wp:inline xmlns:a="http://schemas.openxmlformats.org/drawingml/2006/main" xmlns:pic="http://schemas.openxmlformats.org/drawingml/2006/picture">
+            <wp:extent cx="1620000" cy="1620000"/>
+            <wp:docPr id="1" name="Picture 1"/>
+            <wp:cNvGraphicFramePr>
+              <a:graphicFrameLocks noChangeAspect="1"/>
+            </wp:cNvGraphicFramePr>
+            <a:graphic>
+              <a:graphicData uri="http://schemas.openxmlformats.org/drawingml/2006/picture">
+                <pic:pic>
+                  <pic:nvPicPr>
+                    <pic:cNvPr id="0" name="ono_logo.jpg"/>
+                    <pic:cNvPicPr/>
+                  </pic:nvPicPr>
+                  <pic:blipFill>
+                    <a:blip r:embed="rId10"/>
+                    <a:stretch>
+                      <a:fillRect/>
+                    </a:stretch>
+                  </pic:blipFill>
+                  <pic:spPr>
+                    <a:xfrm>
+                      <a:off x="0" y="0"/>
+                      <a:ext cx="1620000" cy="1620000"/>
+                    </a:xfrm>
+                    <a:prstGeom prst="rect"/>
+                  </pic:spPr>
+                </pic:pic>
+              </a:graphicData>
+            </a:graphic>
+          </wp:inline>
+        </w:drawing>
+      </w:r>
+    </w:p>
+    <w:p>
+      <w:pPr>
+        <w:jc w:val="center"/>
+      </w:pPr>
+      <w:r>
         <w:rPr>
           <w:b/>
+          <w:bCs/>
           <w:i w:val="0"/>
-          <w:bCs/>
           <w:sz w:val="32"/>
           <w:szCs w:val="32"/>
         </w:rPr>
@@ -59,8 +98,8 @@
       <w:r>
         <w:rPr>
           <w:b/>
+          <w:bCs/>
           <w:i w:val="0"/>
-          <w:bCs/>
         </w:rPr>
         <w:t>מסגנון אחד לכמה סגנונות:</w:t>
       </w:r>
@@ -76,8 +115,8 @@
       <w:r>
         <w:rPr>
           <w:b/>
+          <w:bCs/>
           <w:i w:val="0"/>
-          <w:bCs/>
         </w:rPr>
         <w:t>השאלה "למה":</w:t>
       </w:r>
@@ -93,8 +132,8 @@
       <w:r>
         <w:rPr>
           <w:b/>
+          <w:bCs/>
           <w:i w:val="0"/>
-          <w:bCs/>
         </w:rPr>
         <w:t>חוויה משמעותית, הריאיון על התלמידה:</w:t>
       </w:r>
@@ -110,8 +149,8 @@
       <w:r>
         <w:rPr>
           <w:b/>
+          <w:bCs/>
           <w:i w:val="0"/>
-          <w:bCs/>
         </w:rPr>
         <w:t>שינוי עמדה, נתונים במקום כעס:</w:t>
       </w:r>
@@ -127,8 +166,8 @@
       <w:r>
         <w:rPr>
           <w:b/>
+          <w:bCs/>
           <w:i w:val="0"/>
-          <w:bCs/>
         </w:rPr>
         <w:t>מה נדרש ממני כדי להיות אשת מקצוע:</w:t>
       </w:r>
@@ -144,8 +183,8 @@
       <w:r>
         <w:rPr>
           <w:b/>
+          <w:bCs/>
           <w:i w:val="0"/>
-          <w:bCs/>
         </w:rPr>
         <w:t>תובנה על התחום:</w:t>
       </w:r>
@@ -211,9 +250,9 @@
       <w:pgSz w:w="11906" w:h="16838"/>
       <w:pgMar w:top="1417" w:right="1417" w:bottom="1417" w:left="1417" w:header="720" w:footer="720" w:gutter="0"/>
       <w:cols w:space="720"/>
-      <w:docGrid w:linePitch="360"/>
       <w:titlePg/>
       <w:bidi/>
+      <w:docGrid w:linePitch="360"/>
     </w:sectPr>
   </w:body>
 </w:document>
@@ -599,9 +638,9 @@
     <w:qFormat/>
     <w:rsid w:val="00FC693F"/>
     <w:pPr>
+      <w:bidi/>
       <w:spacing w:line="360" w:lineRule="auto" w:after="120"/>
       <w:jc w:val="both"/>
-      <w:bidi/>
     </w:pPr>
     <w:rPr>
       <w:rFonts w:ascii="David" w:hAnsi="David" w:cs="David" w:eastAsia="David"/>
@@ -609,6 +648,7 @@
       <w:sz w:val="24"/>
       <w:szCs w:val="24"/>
       <w:rtl/>
+      <w:lang w:val="he-IL" w:bidi="he-IL" w:eastAsia="he-IL"/>
     </w:rPr>
   </w:style>
   <w:style w:type="paragraph" w:styleId="Header">
@@ -666,10 +706,10 @@
     <w:pPr>
       <w:keepNext/>
       <w:keepLines/>
+      <w:bidi/>
       <w:spacing w:before="240" w:after="120" w:line="360" w:lineRule="auto"/>
       <w:jc w:val="right"/>
       <w:outlineLvl w:val="0"/>
-      <w:bidi/>
     </w:pPr>
     <w:rPr>
       <w:rFonts w:asciiTheme="majorHAnsi" w:eastAsiaTheme="majorEastAsia" w:hAnsiTheme="majorHAnsi" w:cstheme="majorBidi" w:ascii="David" w:hAnsi="David" w:cs="David" w:eastAsia="David"/>
@@ -679,9 +719,8 @@
       <w:color w:val="000000"/>
       <w:sz w:val="28"/>
       <w:szCs w:val="28"/>
-      <w:szCs w:val="28"/>
-      <w:bCs/>
       <w:rtl/>
+      <w:lang w:val="he-IL" w:bidi="he-IL" w:eastAsia="he-IL"/>
     </w:rPr>
   </w:style>
   <w:style w:type="paragraph" w:styleId="Heading2">
@@ -696,10 +735,10 @@
     <w:pPr>
       <w:keepNext/>
       <w:keepLines/>
+      <w:bidi/>
       <w:spacing w:before="160" w:after="120" w:line="360" w:lineRule="auto"/>
       <w:jc w:val="right"/>
       <w:outlineLvl w:val="1"/>
-      <w:bidi/>
     </w:pPr>
     <w:rPr>
       <w:rFonts w:asciiTheme="majorHAnsi" w:eastAsiaTheme="majorEastAsia" w:hAnsiTheme="majorHAnsi" w:cstheme="majorBidi" w:ascii="David" w:hAnsi="David" w:cs="David" w:eastAsia="David"/>
@@ -708,10 +747,9 @@
       <w:i w:val="0"/>
       <w:color w:val="000000"/>
       <w:sz w:val="24"/>
-      <w:szCs w:val="26"/>
       <w:szCs w:val="24"/>
-      <w:bCs/>
       <w:rtl/>
+      <w:lang w:val="he-IL" w:bidi="he-IL" w:eastAsia="he-IL"/>
     </w:rPr>
   </w:style>
   <w:style w:type="paragraph" w:styleId="Heading3">
@@ -726,10 +764,10 @@
     <w:pPr>
       <w:keepNext/>
       <w:keepLines/>
+      <w:bidi/>
       <w:spacing w:before="160" w:after="120" w:line="360" w:lineRule="auto"/>
       <w:jc w:val="right"/>
       <w:outlineLvl w:val="2"/>
-      <w:bidi/>
     </w:pPr>
     <w:rPr>
       <w:rFonts w:asciiTheme="majorHAnsi" w:eastAsiaTheme="majorEastAsia" w:hAnsiTheme="majorHAnsi" w:cstheme="majorBidi" w:ascii="David" w:hAnsi="David" w:cs="David" w:eastAsia="David"/>
@@ -739,8 +777,8 @@
       <w:color w:val="000000"/>
       <w:sz w:val="24"/>
       <w:szCs w:val="24"/>
-      <w:bCs/>
       <w:rtl/>
+      <w:lang w:val="he-IL" w:bidi="he-IL" w:eastAsia="he-IL"/>
     </w:rPr>
   </w:style>
   <w:style w:type="paragraph" w:styleId="Heading4">
@@ -1156,8 +1194,8 @@
       <w:numPr>
         <w:numId w:val="1"/>
       </w:numPr>
+      <w:bidi/>
       <w:contextualSpacing/>
-      <w:bidi/>
     </w:pPr>
   </w:style>
   <w:style w:type="paragraph" w:styleId="ListBullet2">

</xml_diff>

<commit_message>
Disable proofing on every run so Word shows no red underlines
Co-Authored-By: Claude Opus 5.5 <noreply@anthropic.com>
Claude-Session: https://claude.ai/code/session_013eZbSDorZB8dhyvM8NFPNW
</commit_message>
<xml_diff>
--- a/negotiation-final-project/למידה_אישית_כותבת_1.docx
+++ b/negotiation-final-project/למידה_אישית_כותבת_1.docx
@@ -7,6 +7,9 @@
         <w:jc w:val="center"/>
       </w:pPr>
       <w:r>
+        <w:rPr>
+          <w:noProof/>
+        </w:rPr>
         <w:drawing>
           <wp:inline xmlns:a="http://schemas.openxmlformats.org/drawingml/2006/main" xmlns:pic="http://schemas.openxmlformats.org/drawingml/2006/picture">
             <wp:extent cx="1620000" cy="1620000"/>
@@ -50,6 +53,7 @@
           <w:b/>
           <w:bCs/>
           <w:i w:val="0"/>
+          <w:noProof/>
           <w:sz w:val="32"/>
           <w:szCs w:val="32"/>
         </w:rPr>
@@ -64,6 +68,7 @@
         <w:rPr>
           <w:b w:val="0"/>
           <w:i w:val="0"/>
+          <w:noProof/>
           <w:sz w:val="24"/>
           <w:szCs w:val="24"/>
         </w:rPr>
@@ -78,6 +83,7 @@
         <w:rPr>
           <w:b w:val="0"/>
           <w:i w:val="0"/>
+          <w:noProof/>
           <w:sz w:val="24"/>
           <w:szCs w:val="24"/>
           <w:highlight w:val="yellow"/>
@@ -90,6 +96,7 @@
         <w:rPr>
           <w:b w:val="0"/>
           <w:i w:val="0"/>
+          <w:noProof/>
         </w:rPr>
         <w:t>נכנסתי לקורס עם הנחה שמשא ומתן הוא בעיקר עניין של כוח ושל עקשנות: מי שמחזיקה מעמד יותר זמן משיגה יותר. הקורס והעבודה ערערו את ההנחה הזאת, ובפרק זה אציג את ההיבטים המרכזיים של מה שלמדתי.</w:t>
       </w:r>
@@ -100,6 +107,7 @@
           <w:b/>
           <w:bCs/>
           <w:i w:val="0"/>
+          <w:noProof/>
         </w:rPr>
         <w:t>מסגנון אחד לכמה סגנונות:</w:t>
       </w:r>
@@ -107,6 +115,7 @@
         <w:rPr>
           <w:b w:val="0"/>
           <w:i w:val="0"/>
+          <w:noProof/>
         </w:rPr>
         <w:t xml:space="preserve"> בשאלון TKI שמילאתי בתחילת הקורס קיבלתי את הציון הגבוה ביותר בסגנון הפשרני, ובמקום השני בסגנון התחרותי. בהתחלה ראיתי בזה תיאור של מי שאני. אחרי הראיונות הבנתי שזה תיאור של הרגל. שלושת המנהלים שראיינו עוברים בין סגנונות לפי הצד שמולם: קשוחים מול ספק, פורמליים מול הרשות, רכים וסבלניים מול הורים. הבנתי שהשאלה אינה איזה סגנון יש לי, אלא האם אני בוחרת אותו לפי המצב או נגררת אליו מתוך הרגל. מודל העניין הכפול, שלמדנו בקורס, נתן לזה שפה: הבחירה בסגנון תלויה במשקל שאני נותנת לתוצאה שלי ולתוצאה של הצד השני (Rahim, 1983, כפי שמצוטט אצל הוכמן, 2026). גם הממצא שהוצג בשיעור, שיש פער בין הסגנון שאנשים מצהירים עליו לבין מה שהם עושים בפועל (Miller, 2014, כפי שמצוטט אצל הוכמן, 2026), תיאר אותי בדיוק: אני רואה את עצמי כפשרנית, אבל בלחץ אני הופכת לתחרותית.</w:t>
       </w:r>
@@ -117,6 +126,7 @@
           <w:b/>
           <w:bCs/>
           <w:i w:val="0"/>
+          <w:noProof/>
         </w:rPr>
         <w:t>השאלה "למה":</w:t>
       </w:r>
@@ -124,6 +134,7 @@
         <w:rPr>
           <w:b w:val="0"/>
           <w:i w:val="0"/>
+          <w:noProof/>
         </w:rPr>
         <w:t xml:space="preserve"> המיומנות שהכי חסרה לי, ושהקורס חשף, היא לעצור ולשאול למה הצד השני רוצה את מה שהוא רוצה. בשיעור למדנו שעמדה היא "מה אני רוצה" ואינטרס הוא "למה אני רוצה את מה שאני רוצה", ושמאחורי עמדות מנוגדות מסתתרים לעיתים קרובות אינטרסים משותפים (הוכמן, 2026). בוויכוחים שלי בעבודה ובבית אני נוטה לענות לעמדה ולא לאינטרס. כך, למשל, כשהתבקשתי בעבודה לקחת על עצמי משמרות נוספות בתקופה עמוסה, עניתי מיד "לא" והתעקשתי על כך. רק אחר כך הבנתי שמה שהמנהלת שלי צריכה היה כיסוי ליומיים ספציפיים, ושיכולנו להגיע להסדר שמתאים לשתינו, אילו שאלתי למה היא מבקשת. בכל ששת המקרים בעבודה, נקודת המפנה הייתה בדיוק הרגע הזה, והוא הגיע לרוב בשיחה לא פורמלית: פגישה אישית עם גזבר, ערב עם מורות אחרי אזעקה, קפה בבית של משפחה.</w:t>
       </w:r>
@@ -134,6 +145,7 @@
           <w:b/>
           <w:bCs/>
           <w:i w:val="0"/>
+          <w:noProof/>
         </w:rPr>
         <w:t>חוויה משמעותית, הריאיון על התלמידה:</w:t>
       </w:r>
@@ -141,6 +153,7 @@
         <w:rPr>
           <w:b w:val="0"/>
           <w:i w:val="0"/>
+          <w:noProof/>
         </w:rPr>
         <w:t xml:space="preserve"> הרגע שהכי נשאר איתי מהעבודה הוא הסיפור של ח'אלד על התלמידה שאביה רצה להוציא אותה מבית הספר. זה היה משא ומתן בלי כסף, בלי חוזה וכמעט בלי כוח, ובכל זאת הוא הסתיים בתעודת בגרות. הבנתי ממנו שכשאין לי BATNA טובה, הכלי החזק ביותר הוא לתת לצד השני דרך לצאת בכבוד. זה בדיוק מה שפישר, יורי ופאטון (2013) מתכוונים אליו כשהם כותבים שהאינטרסים החזקים ביותר הם צרכים אנושיים בסיסיים כמו הכרה וכבוד, ושצריך להפריד בין האנשים לבין הבעיה. הבנתי גם שיש לזה מחיר: ח'אלד עצמו לא שלם עם חלק מהוויתורים. לא ידעתי לפני הקורס שאפשר להצליח במשא ומתן ועדיין להרגיש אי־נוחות עם התוצאה, ושגם זה חלק מהעבודה.</w:t>
       </w:r>
@@ -151,6 +164,7 @@
           <w:b/>
           <w:bCs/>
           <w:i w:val="0"/>
+          <w:noProof/>
         </w:rPr>
         <w:t>שינוי עמדה, נתונים במקום כעס:</w:t>
       </w:r>
@@ -158,6 +172,7 @@
         <w:rPr>
           <w:b w:val="0"/>
           <w:i w:val="0"/>
+          <w:noProof/>
         </w:rPr>
         <w:t xml:space="preserve"> לפני הקורס חשבתי שמי שמרגישה צודקת צריכה להראות את זה. המנהלים שראיינו אמרו שוב ושוב שהכעס שלהם היה מוצדק ולא היה שימושי, ושטבלה אחת של ימים ללא הסעה או מיפוי של תלמידים עשו יותר מכל הטענות. זה שינה את הדרך שבה אני מתכוננת: לפני שיחה חשובה אני שואלת את עצמי איזה קריטריון אובייקטיבי אני יכולה להביא, ומה החלופה שלי אם לא נגיע להסכמה (פישר ואחרים, 2013). מודל שבעת הרכיבים שלמדנו, אינטרסים, חלופות, קריטריונים, אופציות, יחסים, תקשורת ומחויבות (הוכמן, 2026), הפך אצלי לרשימת הכנה של ממש.</w:t>
       </w:r>
@@ -168,6 +183,7 @@
           <w:b/>
           <w:bCs/>
           <w:i w:val="0"/>
+          <w:noProof/>
         </w:rPr>
         <w:t>מה נדרש ממני כדי להיות אשת מקצוע:</w:t>
       </w:r>
@@ -175,6 +191,7 @@
         <w:rPr>
           <w:b w:val="0"/>
           <w:i w:val="0"/>
+          <w:noProof/>
         </w:rPr>
         <w:t xml:space="preserve"> אני יוצאת מהקורס עם שלוש משימות אישיות. הראשונה, להשקיע בשלב ההכנה, שהוא לפי גלין השלב הראשון והמכריע במשא ומתן (גלין, 1996, כפי שמצוטט אצל הוכמן, 2026): להגיע עם BATNA כתובה וקו אדום ברור. השנייה, לשאול בהתחלה מי מוסמך לאשר את ההסכם ומי יכול לפוצץ אותו. כשסמיר סיפר שהגזבר פתח מחדש הסכמה שכבר סגר, זיהיתי את טקטיקת "המדרג הניהולי" שלמדנו בשיעור (הוכמן, 2026), ואני רוצה לדעת לזהות אותה בזמן אמת ולא רק בדיעבד. השלישית, והקשה ביותר עבורי, לדחות את התגובה הרגשית לפגישה הראשונה ולהתחיל בשאלה ולא בדרישה.</w:t>
       </w:r>
@@ -185,6 +202,7 @@
           <w:b/>
           <w:bCs/>
           <w:i w:val="0"/>
+          <w:noProof/>
         </w:rPr>
         <w:t>תובנה על התחום:</w:t>
       </w:r>
@@ -192,6 +210,7 @@
         <w:rPr>
           <w:b w:val="0"/>
           <w:i w:val="0"/>
+          <w:noProof/>
         </w:rPr>
         <w:t xml:space="preserve"> הופתעתי לגלות כמה מהמשא ומתן בארגונים מתנהל לא סביב שולחן אלא במסדרונות, בטלפון ובבתים. התיאוריות שלמדנו מתארות היטב את מה שקורה, אבל הראיונות הראו שמה שמכריע הוא לרוב היחסים והאמון, והם נבנים לפני המשא ומתן ולא במהלכו.</w:t>
       </w:r>
@@ -201,6 +220,9 @@
         <w:pStyle w:val="Heading2"/>
       </w:pPr>
       <w:r>
+        <w:rPr>
+          <w:noProof/>
+        </w:rPr>
         <w:t>מקורות</w:t>
       </w:r>
     </w:p>
@@ -213,6 +235,7 @@
         <w:rPr>
           <w:b w:val="0"/>
           <w:i w:val="0"/>
+          <w:noProof/>
         </w:rPr>
         <w:t>הוכמן, ר' (2026). מבוא למו"מ; ניהול מו"מ [מצגות הרצאה]. ניהול משא ומתן, הקריה האקדמית אונו.</w:t>
       </w:r>
@@ -226,6 +249,7 @@
         <w:rPr>
           <w:b w:val="0"/>
           <w:i w:val="0"/>
+          <w:noProof/>
         </w:rPr>
         <w:t xml:space="preserve">פישר, ר', יורי, ו', ופאטון, ב' (2013). </w:t>
       </w:r>
@@ -234,6 +258,7 @@
           <w:b w:val="0"/>
           <w:i/>
           <w:iCs/>
+          <w:noProof/>
         </w:rPr>
         <w:t>כן! לשאת ולתת ולהגיע לסיכום חיובי בעסקים, בעבודה ובחיי היום יום</w:t>
       </w:r>
@@ -241,6 +266,7 @@
         <w:rPr>
           <w:b w:val="0"/>
           <w:i w:val="0"/>
+          <w:noProof/>
         </w:rPr>
         <w:t>. מטר.</w:t>
       </w:r>
@@ -483,6 +509,7 @@
     <w:rPrDefault>
       <w:rPr>
         <w:rFonts w:asciiTheme="minorHAnsi" w:eastAsiaTheme="minorEastAsia" w:hAnsiTheme="minorHAnsi" w:cstheme="minorBidi"/>
+        <w:noProof/>
         <w:sz w:val="22"/>
         <w:szCs w:val="22"/>
         <w:lang w:val="en-US" w:eastAsia="en-US" w:bidi="ar-SA"/>
@@ -645,6 +672,7 @@
     <w:rPr>
       <w:rFonts w:ascii="David" w:hAnsi="David" w:cs="David" w:eastAsia="David"/>
       <w:b w:val="0"/>
+      <w:noProof/>
       <w:sz w:val="24"/>
       <w:szCs w:val="24"/>
       <w:rtl/>
@@ -665,6 +693,9 @@
       </w:tabs>
       <w:spacing w:after="0" w:line="240" w:lineRule="auto"/>
     </w:pPr>
+    <w:rPr>
+      <w:noProof/>
+    </w:rPr>
   </w:style>
   <w:style w:type="character" w:customStyle="1" w:styleId="HeaderChar">
     <w:name w:val="Header Char"/>
@@ -672,6 +703,9 @@
     <w:link w:val="Header"/>
     <w:uiPriority w:val="99"/>
     <w:rsid w:val="00E618BF"/>
+    <w:rPr>
+      <w:noProof/>
+    </w:rPr>
   </w:style>
   <w:style w:type="paragraph" w:styleId="Footer">
     <w:name w:val="footer"/>
@@ -687,6 +721,9 @@
       </w:tabs>
       <w:spacing w:after="0" w:line="240" w:lineRule="auto"/>
     </w:pPr>
+    <w:rPr>
+      <w:noProof/>
+    </w:rPr>
   </w:style>
   <w:style w:type="character" w:customStyle="1" w:styleId="FooterChar">
     <w:name w:val="Footer Char"/>
@@ -694,6 +731,9 @@
     <w:link w:val="Footer"/>
     <w:uiPriority w:val="99"/>
     <w:rsid w:val="00E618BF"/>
+    <w:rPr>
+      <w:noProof/>
+    </w:rPr>
   </w:style>
   <w:style w:type="paragraph" w:styleId="Heading1">
     <w:name w:val="heading 1"/>
@@ -716,6 +756,7 @@
       <w:b/>
       <w:bCs/>
       <w:i w:val="0"/>
+      <w:noProof/>
       <w:color w:val="000000"/>
       <w:sz w:val="28"/>
       <w:szCs w:val="28"/>
@@ -745,6 +786,7 @@
       <w:b/>
       <w:bCs/>
       <w:i w:val="0"/>
+      <w:noProof/>
       <w:color w:val="000000"/>
       <w:sz w:val="24"/>
       <w:szCs w:val="24"/>
@@ -774,6 +816,7 @@
       <w:b/>
       <w:bCs/>
       <w:i w:val="0"/>
+      <w:noProof/>
       <w:color w:val="000000"/>
       <w:sz w:val="24"/>
       <w:szCs w:val="24"/>
@@ -803,6 +846,7 @@
       <w:bCs/>
       <w:i/>
       <w:iCs/>
+      <w:noProof/>
       <w:color w:val="4F81BD" w:themeColor="accent1"/>
     </w:rPr>
   </w:style>
@@ -824,6 +868,7 @@
     </w:pPr>
     <w:rPr>
       <w:rFonts w:asciiTheme="majorHAnsi" w:eastAsiaTheme="majorEastAsia" w:hAnsiTheme="majorHAnsi" w:cstheme="majorBidi"/>
+      <w:noProof/>
       <w:color w:val="243F60" w:themeColor="accent1" w:themeShade="7F"/>
     </w:rPr>
   </w:style>
@@ -847,6 +892,7 @@
       <w:rFonts w:asciiTheme="majorHAnsi" w:eastAsiaTheme="majorEastAsia" w:hAnsiTheme="majorHAnsi" w:cstheme="majorBidi"/>
       <w:i/>
       <w:iCs/>
+      <w:noProof/>
       <w:color w:val="243F60" w:themeColor="accent1" w:themeShade="7F"/>
     </w:rPr>
   </w:style>
@@ -870,6 +916,7 @@
       <w:rFonts w:asciiTheme="majorHAnsi" w:eastAsiaTheme="majorEastAsia" w:hAnsiTheme="majorHAnsi" w:cstheme="majorBidi"/>
       <w:i/>
       <w:iCs/>
+      <w:noProof/>
       <w:color w:val="404040" w:themeColor="text1" w:themeTint="BF"/>
     </w:rPr>
   </w:style>
@@ -891,6 +938,7 @@
     </w:pPr>
     <w:rPr>
       <w:rFonts w:asciiTheme="majorHAnsi" w:eastAsiaTheme="majorEastAsia" w:hAnsiTheme="majorHAnsi" w:cstheme="majorBidi"/>
+      <w:noProof/>
       <w:color w:val="4F81BD" w:themeColor="accent1"/>
       <w:sz w:val="20"/>
       <w:szCs w:val="20"/>
@@ -916,6 +964,7 @@
       <w:rFonts w:asciiTheme="majorHAnsi" w:eastAsiaTheme="majorEastAsia" w:hAnsiTheme="majorHAnsi" w:cstheme="majorBidi"/>
       <w:i/>
       <w:iCs/>
+      <w:noProof/>
       <w:color w:val="404040" w:themeColor="text1" w:themeTint="BF"/>
       <w:sz w:val="20"/>
       <w:szCs w:val="20"/>
@@ -926,6 +975,9 @@
     <w:uiPriority w:val="1"/>
     <w:semiHidden/>
     <w:unhideWhenUsed/>
+    <w:rPr>
+      <w:noProof/>
+    </w:rPr>
   </w:style>
   <w:style w:type="table" w:default="1" w:styleId="TableNormal">
     <w:name w:val="Normal Table"/>
@@ -941,12 +993,18 @@
         <w:right w:w="108" w:type="dxa"/>
       </w:tblCellMar>
     </w:tblPr>
+    <w:rPr>
+      <w:noProof/>
+    </w:rPr>
   </w:style>
   <w:style w:type="numbering" w:default="1" w:styleId="NoList">
     <w:name w:val="No List"/>
     <w:uiPriority w:val="99"/>
     <w:semiHidden/>
     <w:unhideWhenUsed/>
+    <w:rPr>
+      <w:noProof/>
+    </w:rPr>
   </w:style>
   <w:style w:type="paragraph" w:styleId="NoSpacing">
     <w:name w:val="No Spacing"/>
@@ -956,6 +1014,9 @@
     <w:pPr>
       <w:spacing w:after="0" w:line="240" w:lineRule="auto"/>
     </w:pPr>
+    <w:rPr>
+      <w:noProof/>
+    </w:rPr>
   </w:style>
   <w:style w:type="character" w:customStyle="1" w:styleId="Heading1Char">
     <w:name w:val="Heading 1 Char"/>
@@ -967,6 +1028,7 @@
       <w:rFonts w:asciiTheme="majorHAnsi" w:eastAsiaTheme="majorEastAsia" w:hAnsiTheme="majorHAnsi" w:cstheme="majorBidi"/>
       <w:b/>
       <w:bCs/>
+      <w:noProof/>
       <w:color w:val="365F91" w:themeColor="accent1" w:themeShade="BF"/>
       <w:sz w:val="28"/>
       <w:szCs w:val="28"/>
@@ -982,6 +1044,7 @@
       <w:rFonts w:asciiTheme="majorHAnsi" w:eastAsiaTheme="majorEastAsia" w:hAnsiTheme="majorHAnsi" w:cstheme="majorBidi"/>
       <w:b/>
       <w:bCs/>
+      <w:noProof/>
       <w:color w:val="4F81BD" w:themeColor="accent1"/>
       <w:sz w:val="26"/>
       <w:szCs w:val="26"/>
@@ -997,6 +1060,7 @@
       <w:rFonts w:asciiTheme="majorHAnsi" w:eastAsiaTheme="majorEastAsia" w:hAnsiTheme="majorHAnsi" w:cstheme="majorBidi"/>
       <w:b/>
       <w:bCs/>
+      <w:noProof/>
       <w:color w:val="4F81BD" w:themeColor="accent1"/>
     </w:rPr>
   </w:style>
@@ -1017,6 +1081,7 @@
     </w:pPr>
     <w:rPr>
       <w:rFonts w:asciiTheme="majorHAnsi" w:eastAsiaTheme="majorEastAsia" w:hAnsiTheme="majorHAnsi" w:cstheme="majorBidi"/>
+      <w:noProof/>
       <w:color w:val="17365D" w:themeColor="text2" w:themeShade="BF"/>
       <w:spacing w:val="5"/>
       <w:kern w:val="28"/>
@@ -1032,6 +1097,7 @@
     <w:rsid w:val="00FC693F"/>
     <w:rPr>
       <w:rFonts w:asciiTheme="majorHAnsi" w:eastAsiaTheme="majorEastAsia" w:hAnsiTheme="majorHAnsi" w:cstheme="majorBidi"/>
+      <w:noProof/>
       <w:color w:val="17365D" w:themeColor="text2" w:themeShade="BF"/>
       <w:spacing w:val="5"/>
       <w:kern w:val="28"/>
@@ -1056,6 +1122,7 @@
       <w:rFonts w:asciiTheme="majorHAnsi" w:eastAsiaTheme="majorEastAsia" w:hAnsiTheme="majorHAnsi" w:cstheme="majorBidi"/>
       <w:i/>
       <w:iCs/>
+      <w:noProof/>
       <w:color w:val="4F81BD" w:themeColor="accent1"/>
       <w:spacing w:val="15"/>
       <w:sz w:val="24"/>
@@ -1072,6 +1139,7 @@
       <w:rFonts w:asciiTheme="majorHAnsi" w:eastAsiaTheme="majorEastAsia" w:hAnsiTheme="majorHAnsi" w:cstheme="majorBidi"/>
       <w:i/>
       <w:iCs/>
+      <w:noProof/>
       <w:color w:val="4F81BD" w:themeColor="accent1"/>
       <w:spacing w:val="15"/>
       <w:sz w:val="24"/>
@@ -1088,6 +1156,9 @@
       <w:ind w:left="720"/>
       <w:contextualSpacing/>
     </w:pPr>
+    <w:rPr>
+      <w:noProof/>
+    </w:rPr>
   </w:style>
   <w:style w:type="paragraph" w:styleId="BodyText">
     <w:name w:val="Body Text"/>
@@ -1099,6 +1170,9 @@
     <w:pPr>
       <w:spacing w:after="120"/>
     </w:pPr>
+    <w:rPr>
+      <w:noProof/>
+    </w:rPr>
   </w:style>
   <w:style w:type="character" w:customStyle="1" w:styleId="BodyTextChar">
     <w:name w:val="Body Text Char"/>
@@ -1106,6 +1180,9 @@
     <w:link w:val="BodyText"/>
     <w:uiPriority w:val="99"/>
     <w:rsid w:val="00AA1D8D"/>
+    <w:rPr>
+      <w:noProof/>
+    </w:rPr>
   </w:style>
   <w:style w:type="paragraph" w:styleId="BodyText2">
     <w:name w:val="Body Text 2"/>
@@ -1117,6 +1194,9 @@
     <w:pPr>
       <w:spacing w:after="120" w:line="480" w:lineRule="auto"/>
     </w:pPr>
+    <w:rPr>
+      <w:noProof/>
+    </w:rPr>
   </w:style>
   <w:style w:type="character" w:customStyle="1" w:styleId="BodyText2Char">
     <w:name w:val="Body Text 2 Char"/>
@@ -1124,6 +1204,9 @@
     <w:link w:val="BodyText2"/>
     <w:uiPriority w:val="99"/>
     <w:rsid w:val="00AA1D8D"/>
+    <w:rPr>
+      <w:noProof/>
+    </w:rPr>
   </w:style>
   <w:style w:type="paragraph" w:styleId="BodyText3">
     <w:name w:val="Body Text 3"/>
@@ -1136,6 +1219,7 @@
       <w:spacing w:after="120"/>
     </w:pPr>
     <w:rPr>
+      <w:noProof/>
       <w:sz w:val="16"/>
       <w:szCs w:val="16"/>
     </w:rPr>
@@ -1147,6 +1231,7 @@
     <w:uiPriority w:val="99"/>
     <w:rsid w:val="00AA1D8D"/>
     <w:rPr>
+      <w:noProof/>
       <w:sz w:val="16"/>
       <w:szCs w:val="16"/>
     </w:rPr>
@@ -1161,6 +1246,9 @@
       <w:ind w:left="360" w:hanging="360"/>
       <w:contextualSpacing/>
     </w:pPr>
+    <w:rPr>
+      <w:noProof/>
+    </w:rPr>
   </w:style>
   <w:style w:type="paragraph" w:styleId="List2">
     <w:name w:val="List 2"/>
@@ -1172,6 +1260,9 @@
       <w:ind w:left="720" w:hanging="360"/>
       <w:contextualSpacing/>
     </w:pPr>
+    <w:rPr>
+      <w:noProof/>
+    </w:rPr>
   </w:style>
   <w:style w:type="paragraph" w:styleId="List3">
     <w:name w:val="List 3"/>
@@ -1183,6 +1274,9 @@
       <w:ind w:left="1080" w:hanging="360"/>
       <w:contextualSpacing/>
     </w:pPr>
+    <w:rPr>
+      <w:noProof/>
+    </w:rPr>
   </w:style>
   <w:style w:type="paragraph" w:styleId="ListBullet">
     <w:name w:val="List Bullet"/>
@@ -1197,6 +1291,9 @@
       <w:bidi/>
       <w:contextualSpacing/>
     </w:pPr>
+    <w:rPr>
+      <w:noProof/>
+    </w:rPr>
   </w:style>
   <w:style w:type="paragraph" w:styleId="ListBullet2">
     <w:name w:val="List Bullet 2"/>
@@ -1210,6 +1307,9 @@
       </w:numPr>
       <w:contextualSpacing/>
     </w:pPr>
+    <w:rPr>
+      <w:noProof/>
+    </w:rPr>
   </w:style>
   <w:style w:type="paragraph" w:styleId="ListBullet3">
     <w:name w:val="List Bullet 3"/>
@@ -1223,6 +1323,9 @@
       </w:numPr>
       <w:contextualSpacing/>
     </w:pPr>
+    <w:rPr>
+      <w:noProof/>
+    </w:rPr>
   </w:style>
   <w:style w:type="paragraph" w:styleId="ListNumber">
     <w:name w:val="List Number"/>
@@ -1236,6 +1339,9 @@
       </w:numPr>
       <w:contextualSpacing/>
     </w:pPr>
+    <w:rPr>
+      <w:noProof/>
+    </w:rPr>
   </w:style>
   <w:style w:type="paragraph" w:styleId="ListNumber2">
     <w:name w:val="List Number 2"/>
@@ -1249,6 +1355,9 @@
       </w:numPr>
       <w:contextualSpacing/>
     </w:pPr>
+    <w:rPr>
+      <w:noProof/>
+    </w:rPr>
   </w:style>
   <w:style w:type="paragraph" w:styleId="ListNumber3">
     <w:name w:val="List Number 3"/>
@@ -1262,6 +1371,9 @@
       </w:numPr>
       <w:contextualSpacing/>
     </w:pPr>
+    <w:rPr>
+      <w:noProof/>
+    </w:rPr>
   </w:style>
   <w:style w:type="paragraph" w:styleId="ListContinue">
     <w:name w:val="List Continue"/>
@@ -1274,6 +1386,9 @@
       <w:ind w:left="360"/>
       <w:contextualSpacing/>
     </w:pPr>
+    <w:rPr>
+      <w:noProof/>
+    </w:rPr>
   </w:style>
   <w:style w:type="paragraph" w:styleId="ListContinue2">
     <w:name w:val="List Continue 2"/>
@@ -1286,6 +1401,9 @@
       <w:ind w:left="720"/>
       <w:contextualSpacing/>
     </w:pPr>
+    <w:rPr>
+      <w:noProof/>
+    </w:rPr>
   </w:style>
   <w:style w:type="paragraph" w:styleId="ListContinue3">
     <w:name w:val="List Continue 3"/>
@@ -1298,6 +1416,9 @@
       <w:ind w:left="1080"/>
       <w:contextualSpacing/>
     </w:pPr>
+    <w:rPr>
+      <w:noProof/>
+    </w:rPr>
   </w:style>
   <w:style w:type="paragraph" w:styleId="MacroText">
     <w:name w:val="macro"/>
@@ -1318,6 +1439,7 @@
     </w:pPr>
     <w:rPr>
       <w:rFonts w:ascii="Courier" w:hAnsi="Courier"/>
+      <w:noProof/>
       <w:sz w:val="20"/>
       <w:szCs w:val="20"/>
     </w:rPr>
@@ -1330,6 +1452,7 @@
     <w:rsid w:val="0029639D"/>
     <w:rPr>
       <w:rFonts w:ascii="Courier" w:hAnsi="Courier"/>
+      <w:noProof/>
       <w:sz w:val="20"/>
       <w:szCs w:val="20"/>
     </w:rPr>
@@ -1345,6 +1468,7 @@
     <w:rPr>
       <w:i/>
       <w:iCs/>
+      <w:noProof/>
       <w:color w:val="000000" w:themeColor="text1"/>
     </w:rPr>
   </w:style>
@@ -1357,6 +1481,7 @@
     <w:rPr>
       <w:i/>
       <w:iCs/>
+      <w:noProof/>
       <w:color w:val="000000" w:themeColor="text1"/>
     </w:rPr>
   </w:style>
@@ -1373,6 +1498,7 @@
       <w:bCs/>
       <w:i/>
       <w:iCs/>
+      <w:noProof/>
       <w:color w:val="4F81BD" w:themeColor="accent1"/>
     </w:rPr>
   </w:style>
@@ -1385,6 +1511,7 @@
     <w:rsid w:val="00FC693F"/>
     <w:rPr>
       <w:rFonts w:asciiTheme="majorHAnsi" w:eastAsiaTheme="majorEastAsia" w:hAnsiTheme="majorHAnsi" w:cstheme="majorBidi"/>
+      <w:noProof/>
       <w:color w:val="243F60" w:themeColor="accent1" w:themeShade="7F"/>
     </w:rPr>
   </w:style>
@@ -1399,6 +1526,7 @@
       <w:rFonts w:asciiTheme="majorHAnsi" w:eastAsiaTheme="majorEastAsia" w:hAnsiTheme="majorHAnsi" w:cstheme="majorBidi"/>
       <w:i/>
       <w:iCs/>
+      <w:noProof/>
       <w:color w:val="243F60" w:themeColor="accent1" w:themeShade="7F"/>
     </w:rPr>
   </w:style>
@@ -1413,6 +1541,7 @@
       <w:rFonts w:asciiTheme="majorHAnsi" w:eastAsiaTheme="majorEastAsia" w:hAnsiTheme="majorHAnsi" w:cstheme="majorBidi"/>
       <w:i/>
       <w:iCs/>
+      <w:noProof/>
       <w:color w:val="404040" w:themeColor="text1" w:themeTint="BF"/>
     </w:rPr>
   </w:style>
@@ -1425,6 +1554,7 @@
     <w:rsid w:val="00FC693F"/>
     <w:rPr>
       <w:rFonts w:asciiTheme="majorHAnsi" w:eastAsiaTheme="majorEastAsia" w:hAnsiTheme="majorHAnsi" w:cstheme="majorBidi"/>
+      <w:noProof/>
       <w:color w:val="4F81BD" w:themeColor="accent1"/>
       <w:sz w:val="20"/>
       <w:szCs w:val="20"/>
@@ -1441,6 +1571,7 @@
       <w:rFonts w:asciiTheme="majorHAnsi" w:eastAsiaTheme="majorEastAsia" w:hAnsiTheme="majorHAnsi" w:cstheme="majorBidi"/>
       <w:i/>
       <w:iCs/>
+      <w:noProof/>
       <w:color w:val="404040" w:themeColor="text1" w:themeTint="BF"/>
       <w:sz w:val="20"/>
       <w:szCs w:val="20"/>
@@ -1461,6 +1592,7 @@
     <w:rPr>
       <w:b/>
       <w:bCs/>
+      <w:noProof/>
       <w:color w:val="4F81BD" w:themeColor="accent1"/>
       <w:sz w:val="18"/>
       <w:szCs w:val="18"/>
@@ -1475,6 +1607,7 @@
     <w:rPr>
       <w:b/>
       <w:bCs/>
+      <w:noProof/>
     </w:rPr>
   </w:style>
   <w:style w:type="character" w:styleId="Emphasis">
@@ -1486,6 +1619,7 @@
     <w:rPr>
       <w:i/>
       <w:iCs/>
+      <w:noProof/>
     </w:rPr>
   </w:style>
   <w:style w:type="paragraph" w:styleId="IntenseQuote">
@@ -1508,6 +1642,7 @@
       <w:bCs/>
       <w:i/>
       <w:iCs/>
+      <w:noProof/>
       <w:color w:val="4F81BD" w:themeColor="accent1"/>
     </w:rPr>
   </w:style>
@@ -1522,6 +1657,7 @@
       <w:bCs/>
       <w:i/>
       <w:iCs/>
+      <w:noProof/>
       <w:color w:val="4F81BD" w:themeColor="accent1"/>
     </w:rPr>
   </w:style>
@@ -1534,6 +1670,7 @@
     <w:rPr>
       <w:i/>
       <w:iCs/>
+      <w:noProof/>
       <w:color w:val="808080" w:themeColor="text1" w:themeTint="7F"/>
     </w:rPr>
   </w:style>
@@ -1548,6 +1685,7 @@
       <w:bCs/>
       <w:i/>
       <w:iCs/>
+      <w:noProof/>
       <w:color w:val="4F81BD" w:themeColor="accent1"/>
     </w:rPr>
   </w:style>
@@ -1559,6 +1697,7 @@
     <w:rsid w:val="00FC693F"/>
     <w:rPr>
       <w:smallCaps/>
+      <w:noProof/>
       <w:color w:val="C0504D" w:themeColor="accent2"/>
       <w:u w:val="single"/>
     </w:rPr>
@@ -1573,6 +1712,7 @@
       <w:b/>
       <w:bCs/>
       <w:smallCaps/>
+      <w:noProof/>
       <w:color w:val="C0504D" w:themeColor="accent2"/>
       <w:spacing w:val="5"/>
       <w:u w:val="single"/>
@@ -1588,6 +1728,7 @@
       <w:b/>
       <w:bCs/>
       <w:smallCaps/>
+      <w:noProof/>
       <w:spacing w:val="5"/>
     </w:rPr>
   </w:style>
@@ -1603,6 +1744,9 @@
     <w:pPr>
       <w:outlineLvl w:val="9"/>
     </w:pPr>
+    <w:rPr>
+      <w:noProof/>
+    </w:rPr>
   </w:style>
   <w:style w:type="table" w:styleId="TableGrid">
     <w:name w:val="Table Grid"/>
@@ -1629,6 +1773,9 @@
         <w:right w:w="108" w:type="dxa"/>
       </w:tblCellMar>
     </w:tblPr>
+    <w:rPr>
+      <w:noProof/>
+    </w:rPr>
   </w:style>
   <w:style w:type="table" w:styleId="LightShading">
     <w:name w:val="Light Shading"/>
@@ -1639,6 +1786,7 @@
       <w:spacing w:after="0" w:line="240" w:lineRule="auto"/>
     </w:pPr>
     <w:rPr>
+      <w:noProof/>
       <w:color w:val="000000" w:themeColor="text1" w:themeShade="BF"/>
     </w:rPr>
     <w:tblPr>
@@ -1663,6 +1811,7 @@
       <w:rPr>
         <w:b/>
         <w:bCs/>
+        <w:noProof/>
       </w:rPr>
       <w:tblPr/>
       <w:tcPr>
@@ -1683,6 +1832,7 @@
       <w:rPr>
         <w:b/>
         <w:bCs/>
+        <w:noProof/>
       </w:rPr>
       <w:tblPr/>
       <w:tcPr>
@@ -1700,12 +1850,14 @@
       <w:rPr>
         <w:b/>
         <w:bCs/>
+        <w:noProof/>
       </w:rPr>
     </w:tblStylePr>
     <w:tblStylePr w:type="lastCol">
       <w:rPr>
         <w:b/>
         <w:bCs/>
+        <w:noProof/>
       </w:rPr>
     </w:tblStylePr>
     <w:tblStylePr w:type="band1Vert">
@@ -1742,6 +1894,7 @@
       <w:spacing w:after="0" w:line="240" w:lineRule="auto"/>
     </w:pPr>
     <w:rPr>
+      <w:noProof/>
       <w:color w:val="365F91" w:themeColor="accent1" w:themeShade="BF"/>
     </w:rPr>
     <w:tblPr>
@@ -1766,6 +1919,7 @@
       <w:rPr>
         <w:b/>
         <w:bCs/>
+        <w:noProof/>
       </w:rPr>
       <w:tblPr/>
       <w:tcPr>
@@ -1786,6 +1940,7 @@
       <w:rPr>
         <w:b/>
         <w:bCs/>
+        <w:noProof/>
       </w:rPr>
       <w:tblPr/>
       <w:tcPr>
@@ -1803,12 +1958,14 @@
       <w:rPr>
         <w:b/>
         <w:bCs/>
+        <w:noProof/>
       </w:rPr>
     </w:tblStylePr>
     <w:tblStylePr w:type="lastCol">
       <w:rPr>
         <w:b/>
         <w:bCs/>
+        <w:noProof/>
       </w:rPr>
     </w:tblStylePr>
     <w:tblStylePr w:type="band1Vert">
@@ -1845,6 +2002,7 @@
       <w:spacing w:after="0" w:line="240" w:lineRule="auto"/>
     </w:pPr>
     <w:rPr>
+      <w:noProof/>
       <w:color w:val="943634" w:themeColor="accent2" w:themeShade="BF"/>
     </w:rPr>
     <w:tblPr>
@@ -1869,6 +2027,7 @@
       <w:rPr>
         <w:b/>
         <w:bCs/>
+        <w:noProof/>
       </w:rPr>
       <w:tblPr/>
       <w:tcPr>
@@ -1889,6 +2048,7 @@
       <w:rPr>
         <w:b/>
         <w:bCs/>
+        <w:noProof/>
       </w:rPr>
       <w:tblPr/>
       <w:tcPr>
@@ -1906,12 +2066,14 @@
       <w:rPr>
         <w:b/>
         <w:bCs/>
+        <w:noProof/>
       </w:rPr>
     </w:tblStylePr>
     <w:tblStylePr w:type="lastCol">
       <w:rPr>
         <w:b/>
         <w:bCs/>
+        <w:noProof/>
       </w:rPr>
     </w:tblStylePr>
     <w:tblStylePr w:type="band1Vert">
@@ -1948,6 +2110,7 @@
       <w:spacing w:after="0" w:line="240" w:lineRule="auto"/>
     </w:pPr>
     <w:rPr>
+      <w:noProof/>
       <w:color w:val="76923C" w:themeColor="accent3" w:themeShade="BF"/>
     </w:rPr>
     <w:tblPr>
@@ -1972,6 +2135,7 @@
       <w:rPr>
         <w:b/>
         <w:bCs/>
+        <w:noProof/>
       </w:rPr>
       <w:tblPr/>
       <w:tcPr>
@@ -1992,6 +2156,7 @@
       <w:rPr>
         <w:b/>
         <w:bCs/>
+        <w:noProof/>
       </w:rPr>
       <w:tblPr/>
       <w:tcPr>
@@ -2009,12 +2174,14 @@
       <w:rPr>
         <w:b/>
         <w:bCs/>
+        <w:noProof/>
       </w:rPr>
     </w:tblStylePr>
     <w:tblStylePr w:type="lastCol">
       <w:rPr>
         <w:b/>
         <w:bCs/>
+        <w:noProof/>
       </w:rPr>
     </w:tblStylePr>
     <w:tblStylePr w:type="band1Vert">
@@ -2051,6 +2218,7 @@
       <w:spacing w:after="0" w:line="240" w:lineRule="auto"/>
     </w:pPr>
     <w:rPr>
+      <w:noProof/>
       <w:color w:val="5F497A" w:themeColor="accent4" w:themeShade="BF"/>
     </w:rPr>
     <w:tblPr>
@@ -2075,6 +2243,7 @@
       <w:rPr>
         <w:b/>
         <w:bCs/>
+        <w:noProof/>
       </w:rPr>
       <w:tblPr/>
       <w:tcPr>
@@ -2095,6 +2264,7 @@
       <w:rPr>
         <w:b/>
         <w:bCs/>
+        <w:noProof/>
       </w:rPr>
       <w:tblPr/>
       <w:tcPr>
@@ -2112,12 +2282,14 @@
       <w:rPr>
         <w:b/>
         <w:bCs/>
+        <w:noProof/>
       </w:rPr>
     </w:tblStylePr>
     <w:tblStylePr w:type="lastCol">
       <w:rPr>
         <w:b/>
         <w:bCs/>
+        <w:noProof/>
       </w:rPr>
     </w:tblStylePr>
     <w:tblStylePr w:type="band1Vert">
@@ -2154,6 +2326,7 @@
       <w:spacing w:after="0" w:line="240" w:lineRule="auto"/>
     </w:pPr>
     <w:rPr>
+      <w:noProof/>
       <w:color w:val="31849B" w:themeColor="accent5" w:themeShade="BF"/>
     </w:rPr>
     <w:tblPr>
@@ -2178,6 +2351,7 @@
       <w:rPr>
         <w:b/>
         <w:bCs/>
+        <w:noProof/>
       </w:rPr>
       <w:tblPr/>
       <w:tcPr>
@@ -2198,6 +2372,7 @@
       <w:rPr>
         <w:b/>
         <w:bCs/>
+        <w:noProof/>
       </w:rPr>
       <w:tblPr/>
       <w:tcPr>
@@ -2215,12 +2390,14 @@
       <w:rPr>
         <w:b/>
         <w:bCs/>
+        <w:noProof/>
       </w:rPr>
     </w:tblStylePr>
     <w:tblStylePr w:type="lastCol">
       <w:rPr>
         <w:b/>
         <w:bCs/>
+        <w:noProof/>
       </w:rPr>
     </w:tblStylePr>
     <w:tblStylePr w:type="band1Vert">
@@ -2257,6 +2434,7 @@
       <w:spacing w:after="0" w:line="240" w:lineRule="auto"/>
     </w:pPr>
     <w:rPr>
+      <w:noProof/>
       <w:color w:val="E36C0A" w:themeColor="accent6" w:themeShade="BF"/>
     </w:rPr>
     <w:tblPr>
@@ -2281,6 +2459,7 @@
       <w:rPr>
         <w:b/>
         <w:bCs/>
+        <w:noProof/>
       </w:rPr>
       <w:tblPr/>
       <w:tcPr>
@@ -2301,6 +2480,7 @@
       <w:rPr>
         <w:b/>
         <w:bCs/>
+        <w:noProof/>
       </w:rPr>
       <w:tblPr/>
       <w:tcPr>
@@ -2318,12 +2498,14 @@
       <w:rPr>
         <w:b/>
         <w:bCs/>
+        <w:noProof/>
       </w:rPr>
     </w:tblStylePr>
     <w:tblStylePr w:type="lastCol">
       <w:rPr>
         <w:b/>
         <w:bCs/>
+        <w:noProof/>
       </w:rPr>
     </w:tblStylePr>
     <w:tblStylePr w:type="band1Vert">
@@ -2383,6 +2565,7 @@
       <w:rPr>
         <w:b/>
         <w:bCs/>
+        <w:noProof/>
         <w:color w:val="FFFFFF" w:themeColor="background1"/>
       </w:rPr>
       <w:tblPr/>
@@ -2397,6 +2580,7 @@
       <w:rPr>
         <w:b/>
         <w:bCs/>
+        <w:noProof/>
       </w:rPr>
       <w:tblPr/>
       <w:tcPr>
@@ -2412,12 +2596,14 @@
       <w:rPr>
         <w:b/>
         <w:bCs/>
+        <w:noProof/>
       </w:rPr>
     </w:tblStylePr>
     <w:tblStylePr w:type="lastCol">
       <w:rPr>
         <w:b/>
         <w:bCs/>
+        <w:noProof/>
       </w:rPr>
     </w:tblStylePr>
     <w:tblStylePr w:type="band1Vert">
@@ -2442,6 +2628,9 @@
         </w:tcBorders>
       </w:tcPr>
     </w:tblStylePr>
+    <w:rPr>
+      <w:noProof/>
+    </w:rPr>
   </w:style>
   <w:style w:type="table" w:styleId="LightList-Accent1">
     <w:name w:val="Light List Accent 1"/>
@@ -2475,6 +2664,7 @@
       <w:rPr>
         <w:b/>
         <w:bCs/>
+        <w:noProof/>
         <w:color w:val="FFFFFF" w:themeColor="background1"/>
       </w:rPr>
       <w:tblPr/>
@@ -2489,6 +2679,7 @@
       <w:rPr>
         <w:b/>
         <w:bCs/>
+        <w:noProof/>
       </w:rPr>
       <w:tblPr/>
       <w:tcPr>
@@ -2504,12 +2695,14 @@
       <w:rPr>
         <w:b/>
         <w:bCs/>
+        <w:noProof/>
       </w:rPr>
     </w:tblStylePr>
     <w:tblStylePr w:type="lastCol">
       <w:rPr>
         <w:b/>
         <w:bCs/>
+        <w:noProof/>
       </w:rPr>
     </w:tblStylePr>
     <w:tblStylePr w:type="band1Vert">
@@ -2534,6 +2727,9 @@
         </w:tcBorders>
       </w:tcPr>
     </w:tblStylePr>
+    <w:rPr>
+      <w:noProof/>
+    </w:rPr>
   </w:style>
   <w:style w:type="table" w:styleId="LightList-Accent2">
     <w:name w:val="Light List Accent 2"/>
@@ -2567,6 +2763,7 @@
       <w:rPr>
         <w:b/>
         <w:bCs/>
+        <w:noProof/>
         <w:color w:val="FFFFFF" w:themeColor="background1"/>
       </w:rPr>
       <w:tblPr/>
@@ -2581,6 +2778,7 @@
       <w:rPr>
         <w:b/>
         <w:bCs/>
+        <w:noProof/>
       </w:rPr>
       <w:tblPr/>
       <w:tcPr>
@@ -2596,12 +2794,14 @@
       <w:rPr>
         <w:b/>
         <w:bCs/>
+        <w:noProof/>
       </w:rPr>
     </w:tblStylePr>
     <w:tblStylePr w:type="lastCol">
       <w:rPr>
         <w:b/>
         <w:bCs/>
+        <w:noProof/>
       </w:rPr>
     </w:tblStylePr>
     <w:tblStylePr w:type="band1Vert">
@@ -2626,6 +2826,9 @@
         </w:tcBorders>
       </w:tcPr>
     </w:tblStylePr>
+    <w:rPr>
+      <w:noProof/>
+    </w:rPr>
   </w:style>
   <w:style w:type="table" w:styleId="LightList-Accent3">
     <w:name w:val="Light List Accent 3"/>
@@ -2659,6 +2862,7 @@
       <w:rPr>
         <w:b/>
         <w:bCs/>
+        <w:noProof/>
         <w:color w:val="FFFFFF" w:themeColor="background1"/>
       </w:rPr>
       <w:tblPr/>
@@ -2673,6 +2877,7 @@
       <w:rPr>
         <w:b/>
         <w:bCs/>
+        <w:noProof/>
       </w:rPr>
       <w:tblPr/>
       <w:tcPr>
@@ -2688,12 +2893,14 @@
       <w:rPr>
         <w:b/>
         <w:bCs/>
+        <w:noProof/>
       </w:rPr>
     </w:tblStylePr>
     <w:tblStylePr w:type="lastCol">
       <w:rPr>
         <w:b/>
         <w:bCs/>
+        <w:noProof/>
       </w:rPr>
     </w:tblStylePr>
     <w:tblStylePr w:type="band1Vert">
@@ -2718,6 +2925,9 @@
         </w:tcBorders>
       </w:tcPr>
     </w:tblStylePr>
+    <w:rPr>
+      <w:noProof/>
+    </w:rPr>
   </w:style>
   <w:style w:type="table" w:styleId="LightList-Accent4">
     <w:name w:val="Light List Accent 4"/>
@@ -2751,6 +2961,7 @@
       <w:rPr>
         <w:b/>
         <w:bCs/>
+        <w:noProof/>
         <w:color w:val="FFFFFF" w:themeColor="background1"/>
       </w:rPr>
       <w:tblPr/>
@@ -2765,6 +2976,7 @@
       <w:rPr>
         <w:b/>
         <w:bCs/>
+        <w:noProof/>
       </w:rPr>
       <w:tblPr/>
       <w:tcPr>
@@ -2780,12 +2992,14 @@
       <w:rPr>
         <w:b/>
         <w:bCs/>
+        <w:noProof/>
       </w:rPr>
     </w:tblStylePr>
     <w:tblStylePr w:type="lastCol">
       <w:rPr>
         <w:b/>
         <w:bCs/>
+        <w:noProof/>
       </w:rPr>
     </w:tblStylePr>
     <w:tblStylePr w:type="band1Vert">
@@ -2810,6 +3024,9 @@
         </w:tcBorders>
       </w:tcPr>
     </w:tblStylePr>
+    <w:rPr>
+      <w:noProof/>
+    </w:rPr>
   </w:style>
   <w:style w:type="table" w:styleId="LightList-Accent5">
     <w:name w:val="Light List Accent 5"/>
@@ -2843,6 +3060,7 @@
       <w:rPr>
         <w:b/>
         <w:bCs/>
+        <w:noProof/>
         <w:color w:val="FFFFFF" w:themeColor="background1"/>
       </w:rPr>
       <w:tblPr/>
@@ -2857,6 +3075,7 @@
       <w:rPr>
         <w:b/>
         <w:bCs/>
+        <w:noProof/>
       </w:rPr>
       <w:tblPr/>
       <w:tcPr>
@@ -2872,12 +3091,14 @@
       <w:rPr>
         <w:b/>
         <w:bCs/>
+        <w:noProof/>
       </w:rPr>
     </w:tblStylePr>
     <w:tblStylePr w:type="lastCol">
       <w:rPr>
         <w:b/>
         <w:bCs/>
+        <w:noProof/>
       </w:rPr>
     </w:tblStylePr>
     <w:tblStylePr w:type="band1Vert">
@@ -2902,6 +3123,9 @@
         </w:tcBorders>
       </w:tcPr>
     </w:tblStylePr>
+    <w:rPr>
+      <w:noProof/>
+    </w:rPr>
   </w:style>
   <w:style w:type="table" w:styleId="LightList-Accent6">
     <w:name w:val="Light List Accent 6"/>
@@ -2935,6 +3159,7 @@
       <w:rPr>
         <w:b/>
         <w:bCs/>
+        <w:noProof/>
         <w:color w:val="FFFFFF" w:themeColor="background1"/>
       </w:rPr>
       <w:tblPr/>
@@ -2949,6 +3174,7 @@
       <w:rPr>
         <w:b/>
         <w:bCs/>
+        <w:noProof/>
       </w:rPr>
       <w:tblPr/>
       <w:tcPr>
@@ -2964,12 +3190,14 @@
       <w:rPr>
         <w:b/>
         <w:bCs/>
+        <w:noProof/>
       </w:rPr>
     </w:tblStylePr>
     <w:tblStylePr w:type="lastCol">
       <w:rPr>
         <w:b/>
         <w:bCs/>
+        <w:noProof/>
       </w:rPr>
     </w:tblStylePr>
     <w:tblStylePr w:type="band1Vert">
@@ -2994,6 +3222,9 @@
         </w:tcBorders>
       </w:tcPr>
     </w:tblStylePr>
+    <w:rPr>
+      <w:noProof/>
+    </w:rPr>
   </w:style>
   <w:style w:type="table" w:styleId="LightGrid">
     <w:name w:val="Light Grid"/>
@@ -3030,6 +3261,7 @@
         <w:rFonts w:asciiTheme="majorHAnsi" w:eastAsiaTheme="majorEastAsia" w:hAnsiTheme="majorHAnsi" w:cstheme="majorBidi"/>
         <w:b/>
         <w:bCs/>
+        <w:noProof/>
       </w:rPr>
       <w:tblPr/>
       <w:tcPr>
@@ -3051,6 +3283,7 @@
         <w:rFonts w:asciiTheme="majorHAnsi" w:eastAsiaTheme="majorEastAsia" w:hAnsiTheme="majorHAnsi" w:cstheme="majorBidi"/>
         <w:b/>
         <w:bCs/>
+        <w:noProof/>
       </w:rPr>
       <w:tblPr/>
       <w:tcPr>
@@ -3069,6 +3302,7 @@
         <w:rFonts w:asciiTheme="majorHAnsi" w:eastAsiaTheme="majorEastAsia" w:hAnsiTheme="majorHAnsi" w:cstheme="majorBidi"/>
         <w:b/>
         <w:bCs/>
+        <w:noProof/>
       </w:rPr>
     </w:tblStylePr>
     <w:tblStylePr w:type="lastCol">
@@ -3076,6 +3310,7 @@
         <w:rFonts w:asciiTheme="majorHAnsi" w:eastAsiaTheme="majorEastAsia" w:hAnsiTheme="majorHAnsi" w:cstheme="majorBidi"/>
         <w:b/>
         <w:bCs/>
+        <w:noProof/>
       </w:rPr>
       <w:tblPr/>
       <w:tcPr>
@@ -3124,6 +3359,9 @@
         </w:tcBorders>
       </w:tcPr>
     </w:tblStylePr>
+    <w:rPr>
+      <w:noProof/>
+    </w:rPr>
   </w:style>
   <w:style w:type="table" w:styleId="LightGrid-Accent1">
     <w:name w:val="Light Grid Accent 1"/>
@@ -3160,6 +3398,7 @@
         <w:rFonts w:asciiTheme="majorHAnsi" w:eastAsiaTheme="majorEastAsia" w:hAnsiTheme="majorHAnsi" w:cstheme="majorBidi"/>
         <w:b/>
         <w:bCs/>
+        <w:noProof/>
       </w:rPr>
       <w:tblPr/>
       <w:tcPr>
@@ -3181,6 +3420,7 @@
         <w:rFonts w:asciiTheme="majorHAnsi" w:eastAsiaTheme="majorEastAsia" w:hAnsiTheme="majorHAnsi" w:cstheme="majorBidi"/>
         <w:b/>
         <w:bCs/>
+        <w:noProof/>
       </w:rPr>
       <w:tblPr/>
       <w:tcPr>
@@ -3199,6 +3439,7 @@
         <w:rFonts w:asciiTheme="majorHAnsi" w:eastAsiaTheme="majorEastAsia" w:hAnsiTheme="majorHAnsi" w:cstheme="majorBidi"/>
         <w:b/>
         <w:bCs/>
+        <w:noProof/>
       </w:rPr>
     </w:tblStylePr>
     <w:tblStylePr w:type="lastCol">
@@ -3206,6 +3447,7 @@
         <w:rFonts w:asciiTheme="majorHAnsi" w:eastAsiaTheme="majorEastAsia" w:hAnsiTheme="majorHAnsi" w:cstheme="majorBidi"/>
         <w:b/>
         <w:bCs/>
+        <w:noProof/>
       </w:rPr>
       <w:tblPr/>
       <w:tcPr>
@@ -3254,6 +3496,9 @@
         </w:tcBorders>
       </w:tcPr>
     </w:tblStylePr>
+    <w:rPr>
+      <w:noProof/>
+    </w:rPr>
   </w:style>
   <w:style w:type="table" w:styleId="LightGrid-Accent2">
     <w:name w:val="Light Grid Accent 2"/>
@@ -3290,6 +3535,7 @@
         <w:rFonts w:asciiTheme="majorHAnsi" w:eastAsiaTheme="majorEastAsia" w:hAnsiTheme="majorHAnsi" w:cstheme="majorBidi"/>
         <w:b/>
         <w:bCs/>
+        <w:noProof/>
       </w:rPr>
       <w:tblPr/>
       <w:tcPr>
@@ -3311,6 +3557,7 @@
         <w:rFonts w:asciiTheme="majorHAnsi" w:eastAsiaTheme="majorEastAsia" w:hAnsiTheme="majorHAnsi" w:cstheme="majorBidi"/>
         <w:b/>
         <w:bCs/>
+        <w:noProof/>
       </w:rPr>
       <w:tblPr/>
       <w:tcPr>
@@ -3329,6 +3576,7 @@
         <w:rFonts w:asciiTheme="majorHAnsi" w:eastAsiaTheme="majorEastAsia" w:hAnsiTheme="majorHAnsi" w:cstheme="majorBidi"/>
         <w:b/>
         <w:bCs/>
+        <w:noProof/>
       </w:rPr>
     </w:tblStylePr>
     <w:tblStylePr w:type="lastCol">
@@ -3336,6 +3584,7 @@
         <w:rFonts w:asciiTheme="majorHAnsi" w:eastAsiaTheme="majorEastAsia" w:hAnsiTheme="majorHAnsi" w:cstheme="majorBidi"/>
         <w:b/>
         <w:bCs/>
+        <w:noProof/>
       </w:rPr>
       <w:tblPr/>
       <w:tcPr>
@@ -3384,6 +3633,9 @@
         </w:tcBorders>
       </w:tcPr>
     </w:tblStylePr>
+    <w:rPr>
+      <w:noProof/>
+    </w:rPr>
   </w:style>
   <w:style w:type="table" w:styleId="LightGrid-Accent3">
     <w:name w:val="Light Grid Accent 3"/>
@@ -3420,6 +3672,7 @@
         <w:rFonts w:asciiTheme="majorHAnsi" w:eastAsiaTheme="majorEastAsia" w:hAnsiTheme="majorHAnsi" w:cstheme="majorBidi"/>
         <w:b/>
         <w:bCs/>
+        <w:noProof/>
       </w:rPr>
       <w:tblPr/>
       <w:tcPr>
@@ -3441,6 +3694,7 @@
         <w:rFonts w:asciiTheme="majorHAnsi" w:eastAsiaTheme="majorEastAsia" w:hAnsiTheme="majorHAnsi" w:cstheme="majorBidi"/>
         <w:b/>
         <w:bCs/>
+        <w:noProof/>
       </w:rPr>
       <w:tblPr/>
       <w:tcPr>
@@ -3459,6 +3713,7 @@
         <w:rFonts w:asciiTheme="majorHAnsi" w:eastAsiaTheme="majorEastAsia" w:hAnsiTheme="majorHAnsi" w:cstheme="majorBidi"/>
         <w:b/>
         <w:bCs/>
+        <w:noProof/>
       </w:rPr>
     </w:tblStylePr>
     <w:tblStylePr w:type="lastCol">
@@ -3466,6 +3721,7 @@
         <w:rFonts w:asciiTheme="majorHAnsi" w:eastAsiaTheme="majorEastAsia" w:hAnsiTheme="majorHAnsi" w:cstheme="majorBidi"/>
         <w:b/>
         <w:bCs/>
+        <w:noProof/>
       </w:rPr>
       <w:tblPr/>
       <w:tcPr>
@@ -3514,6 +3770,9 @@
         </w:tcBorders>
       </w:tcPr>
     </w:tblStylePr>
+    <w:rPr>
+      <w:noProof/>
+    </w:rPr>
   </w:style>
   <w:style w:type="table" w:styleId="LightGrid-Accent4">
     <w:name w:val="Light Grid Accent 4"/>
@@ -3550,6 +3809,7 @@
         <w:rFonts w:asciiTheme="majorHAnsi" w:eastAsiaTheme="majorEastAsia" w:hAnsiTheme="majorHAnsi" w:cstheme="majorBidi"/>
         <w:b/>
         <w:bCs/>
+        <w:noProof/>
       </w:rPr>
       <w:tblPr/>
       <w:tcPr>
@@ -3571,6 +3831,7 @@
         <w:rFonts w:asciiTheme="majorHAnsi" w:eastAsiaTheme="majorEastAsia" w:hAnsiTheme="majorHAnsi" w:cstheme="majorBidi"/>
         <w:b/>
         <w:bCs/>
+        <w:noProof/>
       </w:rPr>
       <w:tblPr/>
       <w:tcPr>
@@ -3589,6 +3850,7 @@
         <w:rFonts w:asciiTheme="majorHAnsi" w:eastAsiaTheme="majorEastAsia" w:hAnsiTheme="majorHAnsi" w:cstheme="majorBidi"/>
         <w:b/>
         <w:bCs/>
+        <w:noProof/>
       </w:rPr>
     </w:tblStylePr>
     <w:tblStylePr w:type="lastCol">
@@ -3596,6 +3858,7 @@
         <w:rFonts w:asciiTheme="majorHAnsi" w:eastAsiaTheme="majorEastAsia" w:hAnsiTheme="majorHAnsi" w:cstheme="majorBidi"/>
         <w:b/>
         <w:bCs/>
+        <w:noProof/>
       </w:rPr>
       <w:tblPr/>
       <w:tcPr>
@@ -3644,6 +3907,9 @@
         </w:tcBorders>
       </w:tcPr>
     </w:tblStylePr>
+    <w:rPr>
+      <w:noProof/>
+    </w:rPr>
   </w:style>
   <w:style w:type="table" w:styleId="LightGrid-Accent5">
     <w:name w:val="Light Grid Accent 5"/>
@@ -3680,6 +3946,7 @@
         <w:rFonts w:asciiTheme="majorHAnsi" w:eastAsiaTheme="majorEastAsia" w:hAnsiTheme="majorHAnsi" w:cstheme="majorBidi"/>
         <w:b/>
         <w:bCs/>
+        <w:noProof/>
       </w:rPr>
       <w:tblPr/>
       <w:tcPr>
@@ -3701,6 +3968,7 @@
         <w:rFonts w:asciiTheme="majorHAnsi" w:eastAsiaTheme="majorEastAsia" w:hAnsiTheme="majorHAnsi" w:cstheme="majorBidi"/>
         <w:b/>
         <w:bCs/>
+        <w:noProof/>
       </w:rPr>
       <w:tblPr/>
       <w:tcPr>
@@ -3719,6 +3987,7 @@
         <w:rFonts w:asciiTheme="majorHAnsi" w:eastAsiaTheme="majorEastAsia" w:hAnsiTheme="majorHAnsi" w:cstheme="majorBidi"/>
         <w:b/>
         <w:bCs/>
+        <w:noProof/>
       </w:rPr>
     </w:tblStylePr>
     <w:tblStylePr w:type="lastCol">
@@ -3726,6 +3995,7 @@
         <w:rFonts w:asciiTheme="majorHAnsi" w:eastAsiaTheme="majorEastAsia" w:hAnsiTheme="majorHAnsi" w:cstheme="majorBidi"/>
         <w:b/>
         <w:bCs/>
+        <w:noProof/>
       </w:rPr>
       <w:tblPr/>
       <w:tcPr>
@@ -3774,6 +4044,9 @@
         </w:tcBorders>
       </w:tcPr>
     </w:tblStylePr>
+    <w:rPr>
+      <w:noProof/>
+    </w:rPr>
   </w:style>
   <w:style w:type="table" w:styleId="LightGrid-Accent6">
     <w:name w:val="Light Grid Accent 6"/>
@@ -3810,6 +4083,7 @@
         <w:rFonts w:asciiTheme="majorHAnsi" w:eastAsiaTheme="majorEastAsia" w:hAnsiTheme="majorHAnsi" w:cstheme="majorBidi"/>
         <w:b/>
         <w:bCs/>
+        <w:noProof/>
       </w:rPr>
       <w:tblPr/>
       <w:tcPr>
@@ -3831,6 +4105,7 @@
         <w:rFonts w:asciiTheme="majorHAnsi" w:eastAsiaTheme="majorEastAsia" w:hAnsiTheme="majorHAnsi" w:cstheme="majorBidi"/>
         <w:b/>
         <w:bCs/>
+        <w:noProof/>
       </w:rPr>
       <w:tblPr/>
       <w:tcPr>
@@ -3849,6 +4124,7 @@
         <w:rFonts w:asciiTheme="majorHAnsi" w:eastAsiaTheme="majorEastAsia" w:hAnsiTheme="majorHAnsi" w:cstheme="majorBidi"/>
         <w:b/>
         <w:bCs/>
+        <w:noProof/>
       </w:rPr>
     </w:tblStylePr>
     <w:tblStylePr w:type="lastCol">
@@ -3856,6 +4132,7 @@
         <w:rFonts w:asciiTheme="majorHAnsi" w:eastAsiaTheme="majorEastAsia" w:hAnsiTheme="majorHAnsi" w:cstheme="majorBidi"/>
         <w:b/>
         <w:bCs/>
+        <w:noProof/>
       </w:rPr>
       <w:tblPr/>
       <w:tcPr>
@@ -3904,6 +4181,9 @@
         </w:tcBorders>
       </w:tcPr>
     </w:tblStylePr>
+    <w:rPr>
+      <w:noProof/>
+    </w:rPr>
   </w:style>
   <w:style w:type="table" w:styleId="MediumShading1">
     <w:name w:val="Medium Shading 1"/>
@@ -3938,6 +4218,7 @@
       <w:rPr>
         <w:b/>
         <w:bCs/>
+        <w:noProof/>
         <w:color w:val="FFFFFF" w:themeColor="background1"/>
       </w:rPr>
       <w:tblPr/>
@@ -3960,6 +4241,7 @@
       <w:rPr>
         <w:b/>
         <w:bCs/>
+        <w:noProof/>
       </w:rPr>
       <w:tblPr/>
       <w:tcPr>
@@ -3977,12 +4259,14 @@
       <w:rPr>
         <w:b/>
         <w:bCs/>
+        <w:noProof/>
       </w:rPr>
     </w:tblStylePr>
     <w:tblStylePr w:type="lastCol">
       <w:rPr>
         <w:b/>
         <w:bCs/>
+        <w:noProof/>
       </w:rPr>
     </w:tblStylePr>
     <w:tblStylePr w:type="band1Vert">
@@ -4010,6 +4294,9 @@
         </w:tcBorders>
       </w:tcPr>
     </w:tblStylePr>
+    <w:rPr>
+      <w:noProof/>
+    </w:rPr>
   </w:style>
   <w:style w:type="table" w:styleId="MediumShading1-Accent1">
     <w:name w:val="Medium Shading 1 Accent 1"/>
@@ -4044,6 +4331,7 @@
       <w:rPr>
         <w:b/>
         <w:bCs/>
+        <w:noProof/>
         <w:color w:val="FFFFFF" w:themeColor="background1"/>
       </w:rPr>
       <w:tblPr/>
@@ -4066,6 +4354,7 @@
       <w:rPr>
         <w:b/>
         <w:bCs/>
+        <w:noProof/>
       </w:rPr>
       <w:tblPr/>
       <w:tcPr>
@@ -4083,12 +4372,14 @@
       <w:rPr>
         <w:b/>
         <w:bCs/>
+        <w:noProof/>
       </w:rPr>
     </w:tblStylePr>
     <w:tblStylePr w:type="lastCol">
       <w:rPr>
         <w:b/>
         <w:bCs/>
+        <w:noProof/>
       </w:rPr>
     </w:tblStylePr>
     <w:tblStylePr w:type="band1Vert">
@@ -4116,6 +4407,9 @@
         </w:tcBorders>
       </w:tcPr>
     </w:tblStylePr>
+    <w:rPr>
+      <w:noProof/>
+    </w:rPr>
   </w:style>
   <w:style w:type="table" w:styleId="MediumShading1-Accent2">
     <w:name w:val="Medium Shading 1 Accent 2"/>
@@ -4150,6 +4444,7 @@
       <w:rPr>
         <w:b/>
         <w:bCs/>
+        <w:noProof/>
         <w:color w:val="FFFFFF" w:themeColor="background1"/>
       </w:rPr>
       <w:tblPr/>
@@ -4172,6 +4467,7 @@
       <w:rPr>
         <w:b/>
         <w:bCs/>
+        <w:noProof/>
       </w:rPr>
       <w:tblPr/>
       <w:tcPr>
@@ -4189,12 +4485,14 @@
       <w:rPr>
         <w:b/>
         <w:bCs/>
+        <w:noProof/>
       </w:rPr>
     </w:tblStylePr>
     <w:tblStylePr w:type="lastCol">
       <w:rPr>
         <w:b/>
         <w:bCs/>
+        <w:noProof/>
       </w:rPr>
     </w:tblStylePr>
     <w:tblStylePr w:type="band1Vert">
@@ -4222,6 +4520,9 @@
         </w:tcBorders>
       </w:tcPr>
     </w:tblStylePr>
+    <w:rPr>
+      <w:noProof/>
+    </w:rPr>
   </w:style>
   <w:style w:type="table" w:styleId="MediumShading1-Accent3">
     <w:name w:val="Medium Shading 1 Accent 3"/>
@@ -4256,6 +4557,7 @@
       <w:rPr>
         <w:b/>
         <w:bCs/>
+        <w:noProof/>
         <w:color w:val="FFFFFF" w:themeColor="background1"/>
       </w:rPr>
       <w:tblPr/>
@@ -4278,6 +4580,7 @@
       <w:rPr>
         <w:b/>
         <w:bCs/>
+        <w:noProof/>
       </w:rPr>
       <w:tblPr/>
       <w:tcPr>
@@ -4295,12 +4598,14 @@
       <w:rPr>
         <w:b/>
         <w:bCs/>
+        <w:noProof/>
       </w:rPr>
     </w:tblStylePr>
     <w:tblStylePr w:type="lastCol">
       <w:rPr>
         <w:b/>
         <w:bCs/>
+        <w:noProof/>
       </w:rPr>
     </w:tblStylePr>
     <w:tblStylePr w:type="band1Vert">
@@ -4328,6 +4633,9 @@
         </w:tcBorders>
       </w:tcPr>
     </w:tblStylePr>
+    <w:rPr>
+      <w:noProof/>
+    </w:rPr>
   </w:style>
   <w:style w:type="table" w:styleId="MediumShading1-Accent4">
     <w:name w:val="Medium Shading 1 Accent 4"/>
@@ -4362,6 +4670,7 @@
       <w:rPr>
         <w:b/>
         <w:bCs/>
+        <w:noProof/>
         <w:color w:val="FFFFFF" w:themeColor="background1"/>
       </w:rPr>
       <w:tblPr/>
@@ -4384,6 +4693,7 @@
       <w:rPr>
         <w:b/>
         <w:bCs/>
+        <w:noProof/>
       </w:rPr>
       <w:tblPr/>
       <w:tcPr>
@@ -4401,12 +4711,14 @@
       <w:rPr>
         <w:b/>
         <w:bCs/>
+        <w:noProof/>
       </w:rPr>
     </w:tblStylePr>
     <w:tblStylePr w:type="lastCol">
       <w:rPr>
         <w:b/>
         <w:bCs/>
+        <w:noProof/>
       </w:rPr>
     </w:tblStylePr>
     <w:tblStylePr w:type="band1Vert">
@@ -4434,6 +4746,9 @@
         </w:tcBorders>
       </w:tcPr>
     </w:tblStylePr>
+    <w:rPr>
+      <w:noProof/>
+    </w:rPr>
   </w:style>
   <w:style w:type="table" w:styleId="MediumShading1-Accent5">
     <w:name w:val="Medium Shading 1 Accent 5"/>
@@ -4468,6 +4783,7 @@
       <w:rPr>
         <w:b/>
         <w:bCs/>
+        <w:noProof/>
         <w:color w:val="FFFFFF" w:themeColor="background1"/>
       </w:rPr>
       <w:tblPr/>
@@ -4490,6 +4806,7 @@
       <w:rPr>
         <w:b/>
         <w:bCs/>
+        <w:noProof/>
       </w:rPr>
       <w:tblPr/>
       <w:tcPr>
@@ -4507,12 +4824,14 @@
       <w:rPr>
         <w:b/>
         <w:bCs/>
+        <w:noProof/>
       </w:rPr>
     </w:tblStylePr>
     <w:tblStylePr w:type="lastCol">
       <w:rPr>
         <w:b/>
         <w:bCs/>
+        <w:noProof/>
       </w:rPr>
     </w:tblStylePr>
     <w:tblStylePr w:type="band1Vert">
@@ -4540,6 +4859,9 @@
         </w:tcBorders>
       </w:tcPr>
     </w:tblStylePr>
+    <w:rPr>
+      <w:noProof/>
+    </w:rPr>
   </w:style>
   <w:style w:type="table" w:styleId="MediumShading1-Accent6">
     <w:name w:val="Medium Shading 1 Accent 6"/>
@@ -4574,6 +4896,7 @@
       <w:rPr>
         <w:b/>
         <w:bCs/>
+        <w:noProof/>
         <w:color w:val="FFFFFF" w:themeColor="background1"/>
       </w:rPr>
       <w:tblPr/>
@@ -4596,6 +4919,7 @@
       <w:rPr>
         <w:b/>
         <w:bCs/>
+        <w:noProof/>
       </w:rPr>
       <w:tblPr/>
       <w:tcPr>
@@ -4613,12 +4937,14 @@
       <w:rPr>
         <w:b/>
         <w:bCs/>
+        <w:noProof/>
       </w:rPr>
     </w:tblStylePr>
     <w:tblStylePr w:type="lastCol">
       <w:rPr>
         <w:b/>
         <w:bCs/>
+        <w:noProof/>
       </w:rPr>
     </w:tblStylePr>
     <w:tblStylePr w:type="band1Vert">
@@ -4646,6 +4972,9 @@
         </w:tcBorders>
       </w:tcPr>
     </w:tblStylePr>
+    <w:rPr>
+      <w:noProof/>
+    </w:rPr>
   </w:style>
   <w:style w:type="table" w:styleId="MediumShading2">
     <w:name w:val="Medium Shading 2"/>
@@ -4677,6 +5006,7 @@
       <w:rPr>
         <w:b/>
         <w:bCs/>
+        <w:noProof/>
         <w:color w:val="FFFFFF" w:themeColor="background1"/>
       </w:rPr>
       <w:tblPr/>
@@ -4697,6 +5027,7 @@
         <w:spacing w:before="0" w:after="0" w:line="240" w:lineRule="auto"/>
       </w:pPr>
       <w:rPr>
+        <w:noProof/>
         <w:color w:val="auto"/>
       </w:rPr>
       <w:tblPr/>
@@ -4716,6 +5047,7 @@
       <w:rPr>
         <w:b/>
         <w:bCs/>
+        <w:noProof/>
         <w:color w:val="FFFFFF" w:themeColor="background1"/>
       </w:rPr>
       <w:tblPr/>
@@ -4735,6 +5067,7 @@
       <w:rPr>
         <w:b/>
         <w:bCs/>
+        <w:noProof/>
         <w:color w:val="FFFFFF" w:themeColor="background1"/>
       </w:rPr>
       <w:tblPr/>
@@ -4781,6 +5114,7 @@
     </w:tblStylePr>
     <w:tblStylePr w:type="nwCell">
       <w:rPr>
+        <w:noProof/>
         <w:color w:val="FFFFFF" w:themeColor="background1"/>
       </w:rPr>
       <w:tblPr/>
@@ -4795,6 +5129,9 @@
         </w:tcBorders>
       </w:tcPr>
     </w:tblStylePr>
+    <w:rPr>
+      <w:noProof/>
+    </w:rPr>
   </w:style>
   <w:style w:type="table" w:styleId="MediumShading2-Accent1">
     <w:name w:val="Medium Shading 2 Accent 1"/>
@@ -4826,6 +5163,7 @@
       <w:rPr>
         <w:b/>
         <w:bCs/>
+        <w:noProof/>
         <w:color w:val="FFFFFF" w:themeColor="background1"/>
       </w:rPr>
       <w:tblPr/>
@@ -4846,6 +5184,7 @@
         <w:spacing w:before="0" w:after="0" w:line="240" w:lineRule="auto"/>
       </w:pPr>
       <w:rPr>
+        <w:noProof/>
         <w:color w:val="auto"/>
       </w:rPr>
       <w:tblPr/>
@@ -4865,6 +5204,7 @@
       <w:rPr>
         <w:b/>
         <w:bCs/>
+        <w:noProof/>
         <w:color w:val="FFFFFF" w:themeColor="background1"/>
       </w:rPr>
       <w:tblPr/>
@@ -4884,6 +5224,7 @@
       <w:rPr>
         <w:b/>
         <w:bCs/>
+        <w:noProof/>
         <w:color w:val="FFFFFF" w:themeColor="background1"/>
       </w:rPr>
       <w:tblPr/>
@@ -4930,6 +5271,7 @@
     </w:tblStylePr>
     <w:tblStylePr w:type="nwCell">
       <w:rPr>
+        <w:noProof/>
         <w:color w:val="FFFFFF" w:themeColor="background1"/>
       </w:rPr>
       <w:tblPr/>
@@ -4944,6 +5286,9 @@
         </w:tcBorders>
       </w:tcPr>
     </w:tblStylePr>
+    <w:rPr>
+      <w:noProof/>
+    </w:rPr>
   </w:style>
   <w:style w:type="table" w:styleId="MediumShading2-Accent2">
     <w:name w:val="Medium Shading 2 Accent 2"/>
@@ -4975,6 +5320,7 @@
       <w:rPr>
         <w:b/>
         <w:bCs/>
+        <w:noProof/>
         <w:color w:val="FFFFFF" w:themeColor="background1"/>
       </w:rPr>
       <w:tblPr/>
@@ -4995,6 +5341,7 @@
         <w:spacing w:before="0" w:after="0" w:line="240" w:lineRule="auto"/>
       </w:pPr>
       <w:rPr>
+        <w:noProof/>
         <w:color w:val="auto"/>
       </w:rPr>
       <w:tblPr/>
@@ -5014,6 +5361,7 @@
       <w:rPr>
         <w:b/>
         <w:bCs/>
+        <w:noProof/>
         <w:color w:val="FFFFFF" w:themeColor="background1"/>
       </w:rPr>
       <w:tblPr/>
@@ -5033,6 +5381,7 @@
       <w:rPr>
         <w:b/>
         <w:bCs/>
+        <w:noProof/>
         <w:color w:val="FFFFFF" w:themeColor="background1"/>
       </w:rPr>
       <w:tblPr/>
@@ -5079,6 +5428,7 @@
     </w:tblStylePr>
     <w:tblStylePr w:type="nwCell">
       <w:rPr>
+        <w:noProof/>
         <w:color w:val="FFFFFF" w:themeColor="background1"/>
       </w:rPr>
       <w:tblPr/>
@@ -5093,6 +5443,9 @@
         </w:tcBorders>
       </w:tcPr>
     </w:tblStylePr>
+    <w:rPr>
+      <w:noProof/>
+    </w:rPr>
   </w:style>
   <w:style w:type="table" w:styleId="MediumShading2-Accent3">
     <w:name w:val="Medium Shading 2 Accent 3"/>
@@ -5124,6 +5477,7 @@
       <w:rPr>
         <w:b/>
         <w:bCs/>
+        <w:noProof/>
         <w:color w:val="FFFFFF" w:themeColor="background1"/>
       </w:rPr>
       <w:tblPr/>
@@ -5144,6 +5498,7 @@
         <w:spacing w:before="0" w:after="0" w:line="240" w:lineRule="auto"/>
       </w:pPr>
       <w:rPr>
+        <w:noProof/>
         <w:color w:val="auto"/>
       </w:rPr>
       <w:tblPr/>
@@ -5163,6 +5518,7 @@
       <w:rPr>
         <w:b/>
         <w:bCs/>
+        <w:noProof/>
         <w:color w:val="FFFFFF" w:themeColor="background1"/>
       </w:rPr>
       <w:tblPr/>
@@ -5182,6 +5538,7 @@
       <w:rPr>
         <w:b/>
         <w:bCs/>
+        <w:noProof/>
         <w:color w:val="FFFFFF" w:themeColor="background1"/>
       </w:rPr>
       <w:tblPr/>
@@ -5228,6 +5585,7 @@
     </w:tblStylePr>
     <w:tblStylePr w:type="nwCell">
       <w:rPr>
+        <w:noProof/>
         <w:color w:val="FFFFFF" w:themeColor="background1"/>
       </w:rPr>
       <w:tblPr/>
@@ -5242,6 +5600,9 @@
         </w:tcBorders>
       </w:tcPr>
     </w:tblStylePr>
+    <w:rPr>
+      <w:noProof/>
+    </w:rPr>
   </w:style>
   <w:style w:type="table" w:styleId="MediumShading2-Accent4">
     <w:name w:val="Medium Shading 2 Accent 4"/>
@@ -5273,6 +5634,7 @@
       <w:rPr>
         <w:b/>
         <w:bCs/>
+        <w:noProof/>
         <w:color w:val="FFFFFF" w:themeColor="background1"/>
       </w:rPr>
       <w:tblPr/>
@@ -5293,6 +5655,7 @@
         <w:spacing w:before="0" w:after="0" w:line="240" w:lineRule="auto"/>
       </w:pPr>
       <w:rPr>
+        <w:noProof/>
         <w:color w:val="auto"/>
       </w:rPr>
       <w:tblPr/>
@@ -5312,6 +5675,7 @@
       <w:rPr>
         <w:b/>
         <w:bCs/>
+        <w:noProof/>
         <w:color w:val="FFFFFF" w:themeColor="background1"/>
       </w:rPr>
       <w:tblPr/>
@@ -5331,6 +5695,7 @@
       <w:rPr>
         <w:b/>
         <w:bCs/>
+        <w:noProof/>
         <w:color w:val="FFFFFF" w:themeColor="background1"/>
       </w:rPr>
       <w:tblPr/>
@@ -5377,6 +5742,7 @@
     </w:tblStylePr>
     <w:tblStylePr w:type="nwCell">
       <w:rPr>
+        <w:noProof/>
         <w:color w:val="FFFFFF" w:themeColor="background1"/>
       </w:rPr>
       <w:tblPr/>
@@ -5391,6 +5757,9 @@
         </w:tcBorders>
       </w:tcPr>
     </w:tblStylePr>
+    <w:rPr>
+      <w:noProof/>
+    </w:rPr>
   </w:style>
   <w:style w:type="table" w:styleId="MediumShading2-Accent5">
     <w:name w:val="Medium Shading 2 Accent 5"/>
@@ -5422,6 +5791,7 @@
       <w:rPr>
         <w:b/>
         <w:bCs/>
+        <w:noProof/>
         <w:color w:val="FFFFFF" w:themeColor="background1"/>
       </w:rPr>
       <w:tblPr/>
@@ -5442,6 +5812,7 @@
         <w:spacing w:before="0" w:after="0" w:line="240" w:lineRule="auto"/>
       </w:pPr>
       <w:rPr>
+        <w:noProof/>
         <w:color w:val="auto"/>
       </w:rPr>
       <w:tblPr/>
@@ -5461,6 +5832,7 @@
       <w:rPr>
         <w:b/>
         <w:bCs/>
+        <w:noProof/>
         <w:color w:val="FFFFFF" w:themeColor="background1"/>
       </w:rPr>
       <w:tblPr/>
@@ -5480,6 +5852,7 @@
       <w:rPr>
         <w:b/>
         <w:bCs/>
+        <w:noProof/>
         <w:color w:val="FFFFFF" w:themeColor="background1"/>
       </w:rPr>
       <w:tblPr/>
@@ -5526,6 +5899,7 @@
     </w:tblStylePr>
     <w:tblStylePr w:type="nwCell">
       <w:rPr>
+        <w:noProof/>
         <w:color w:val="FFFFFF" w:themeColor="background1"/>
       </w:rPr>
       <w:tblPr/>
@@ -5540,6 +5914,9 @@
         </w:tcBorders>
       </w:tcPr>
     </w:tblStylePr>
+    <w:rPr>
+      <w:noProof/>
+    </w:rPr>
   </w:style>
   <w:style w:type="table" w:styleId="MediumShading2-Accent6">
     <w:name w:val="Medium Shading 2 Accent 6"/>
@@ -5571,6 +5948,7 @@
       <w:rPr>
         <w:b/>
         <w:bCs/>
+        <w:noProof/>
         <w:color w:val="FFFFFF" w:themeColor="background1"/>
       </w:rPr>
       <w:tblPr/>
@@ -5591,6 +5969,7 @@
         <w:spacing w:before="0" w:after="0" w:line="240" w:lineRule="auto"/>
       </w:pPr>
       <w:rPr>
+        <w:noProof/>
         <w:color w:val="auto"/>
       </w:rPr>
       <w:tblPr/>
@@ -5610,6 +5989,7 @@
       <w:rPr>
         <w:b/>
         <w:bCs/>
+        <w:noProof/>
         <w:color w:val="FFFFFF" w:themeColor="background1"/>
       </w:rPr>
       <w:tblPr/>
@@ -5629,6 +6009,7 @@
       <w:rPr>
         <w:b/>
         <w:bCs/>
+        <w:noProof/>
         <w:color w:val="FFFFFF" w:themeColor="background1"/>
       </w:rPr>
       <w:tblPr/>
@@ -5675,6 +6056,7 @@
     </w:tblStylePr>
     <w:tblStylePr w:type="nwCell">
       <w:rPr>
+        <w:noProof/>
         <w:color w:val="FFFFFF" w:themeColor="background1"/>
       </w:rPr>
       <w:tblPr/>
@@ -5689,6 +6071,9 @@
         </w:tcBorders>
       </w:tcPr>
     </w:tblStylePr>
+    <w:rPr>
+      <w:noProof/>
+    </w:rPr>
   </w:style>
   <w:style w:type="table" w:styleId="MediumList1">
     <w:name w:val="Medium List 1"/>
@@ -5699,6 +6084,7 @@
       <w:spacing w:after="0" w:line="240" w:lineRule="auto"/>
     </w:pPr>
     <w:rPr>
+      <w:noProof/>
       <w:color w:val="000000" w:themeColor="text1"/>
     </w:rPr>
     <w:tblPr>
@@ -5719,6 +6105,7 @@
     <w:tblStylePr w:type="firstRow">
       <w:rPr>
         <w:rFonts w:asciiTheme="majorHAnsi" w:eastAsiaTheme="majorEastAsia" w:hAnsiTheme="majorHAnsi" w:cstheme="majorBidi"/>
+        <w:noProof/>
       </w:rPr>
       <w:tblPr/>
       <w:tcPr>
@@ -5732,6 +6119,7 @@
       <w:rPr>
         <w:b/>
         <w:bCs/>
+        <w:noProof/>
         <w:color w:val="1F497D" w:themeColor="text2"/>
       </w:rPr>
       <w:tblPr/>
@@ -5746,12 +6134,14 @@
       <w:rPr>
         <w:b/>
         <w:bCs/>
+        <w:noProof/>
       </w:rPr>
     </w:tblStylePr>
     <w:tblStylePr w:type="lastCol">
       <w:rPr>
         <w:b/>
         <w:bCs/>
+        <w:noProof/>
       </w:rPr>
       <w:tblPr/>
       <w:tcPr>
@@ -5783,6 +6173,7 @@
       <w:spacing w:after="0" w:line="240" w:lineRule="auto"/>
     </w:pPr>
     <w:rPr>
+      <w:noProof/>
       <w:color w:val="000000" w:themeColor="text1"/>
     </w:rPr>
     <w:tblPr>
@@ -5803,6 +6194,7 @@
     <w:tblStylePr w:type="firstRow">
       <w:rPr>
         <w:rFonts w:asciiTheme="majorHAnsi" w:eastAsiaTheme="majorEastAsia" w:hAnsiTheme="majorHAnsi" w:cstheme="majorBidi"/>
+        <w:noProof/>
       </w:rPr>
       <w:tblPr/>
       <w:tcPr>
@@ -5816,6 +6208,7 @@
       <w:rPr>
         <w:b/>
         <w:bCs/>
+        <w:noProof/>
         <w:color w:val="1F497D" w:themeColor="text2"/>
       </w:rPr>
       <w:tblPr/>
@@ -5830,12 +6223,14 @@
       <w:rPr>
         <w:b/>
         <w:bCs/>
+        <w:noProof/>
       </w:rPr>
     </w:tblStylePr>
     <w:tblStylePr w:type="lastCol">
       <w:rPr>
         <w:b/>
         <w:bCs/>
+        <w:noProof/>
       </w:rPr>
       <w:tblPr/>
       <w:tcPr>
@@ -5867,6 +6262,7 @@
       <w:spacing w:after="0" w:line="240" w:lineRule="auto"/>
     </w:pPr>
     <w:rPr>
+      <w:noProof/>
       <w:color w:val="000000" w:themeColor="text1"/>
     </w:rPr>
     <w:tblPr>
@@ -5887,6 +6283,7 @@
     <w:tblStylePr w:type="firstRow">
       <w:rPr>
         <w:rFonts w:asciiTheme="majorHAnsi" w:eastAsiaTheme="majorEastAsia" w:hAnsiTheme="majorHAnsi" w:cstheme="majorBidi"/>
+        <w:noProof/>
       </w:rPr>
       <w:tblPr/>
       <w:tcPr>
@@ -5900,6 +6297,7 @@
       <w:rPr>
         <w:b/>
         <w:bCs/>
+        <w:noProof/>
         <w:color w:val="1F497D" w:themeColor="text2"/>
       </w:rPr>
       <w:tblPr/>
@@ -5914,12 +6312,14 @@
       <w:rPr>
         <w:b/>
         <w:bCs/>
+        <w:noProof/>
       </w:rPr>
     </w:tblStylePr>
     <w:tblStylePr w:type="lastCol">
       <w:rPr>
         <w:b/>
         <w:bCs/>
+        <w:noProof/>
       </w:rPr>
       <w:tblPr/>
       <w:tcPr>
@@ -5951,6 +6351,7 @@
       <w:spacing w:after="0" w:line="240" w:lineRule="auto"/>
     </w:pPr>
     <w:rPr>
+      <w:noProof/>
       <w:color w:val="000000" w:themeColor="text1"/>
     </w:rPr>
     <w:tblPr>
@@ -5971,6 +6372,7 @@
     <w:tblStylePr w:type="firstRow">
       <w:rPr>
         <w:rFonts w:asciiTheme="majorHAnsi" w:eastAsiaTheme="majorEastAsia" w:hAnsiTheme="majorHAnsi" w:cstheme="majorBidi"/>
+        <w:noProof/>
       </w:rPr>
       <w:tblPr/>
       <w:tcPr>
@@ -5984,6 +6386,7 @@
       <w:rPr>
         <w:b/>
         <w:bCs/>
+        <w:noProof/>
         <w:color w:val="1F497D" w:themeColor="text2"/>
       </w:rPr>
       <w:tblPr/>
@@ -5998,12 +6401,14 @@
       <w:rPr>
         <w:b/>
         <w:bCs/>
+        <w:noProof/>
       </w:rPr>
     </w:tblStylePr>
     <w:tblStylePr w:type="lastCol">
       <w:rPr>
         <w:b/>
         <w:bCs/>
+        <w:noProof/>
       </w:rPr>
       <w:tblPr/>
       <w:tcPr>
@@ -6035,6 +6440,7 @@
       <w:spacing w:after="0" w:line="240" w:lineRule="auto"/>
     </w:pPr>
     <w:rPr>
+      <w:noProof/>
       <w:color w:val="000000" w:themeColor="text1"/>
     </w:rPr>
     <w:tblPr>
@@ -6055,6 +6461,7 @@
     <w:tblStylePr w:type="firstRow">
       <w:rPr>
         <w:rFonts w:asciiTheme="majorHAnsi" w:eastAsiaTheme="majorEastAsia" w:hAnsiTheme="majorHAnsi" w:cstheme="majorBidi"/>
+        <w:noProof/>
       </w:rPr>
       <w:tblPr/>
       <w:tcPr>
@@ -6068,6 +6475,7 @@
       <w:rPr>
         <w:b/>
         <w:bCs/>
+        <w:noProof/>
         <w:color w:val="1F497D" w:themeColor="text2"/>
       </w:rPr>
       <w:tblPr/>
@@ -6082,12 +6490,14 @@
       <w:rPr>
         <w:b/>
         <w:bCs/>
+        <w:noProof/>
       </w:rPr>
     </w:tblStylePr>
     <w:tblStylePr w:type="lastCol">
       <w:rPr>
         <w:b/>
         <w:bCs/>
+        <w:noProof/>
       </w:rPr>
       <w:tblPr/>
       <w:tcPr>
@@ -6119,6 +6529,7 @@
       <w:spacing w:after="0" w:line="240" w:lineRule="auto"/>
     </w:pPr>
     <w:rPr>
+      <w:noProof/>
       <w:color w:val="000000" w:themeColor="text1"/>
     </w:rPr>
     <w:tblPr>
@@ -6139,6 +6550,7 @@
     <w:tblStylePr w:type="firstRow">
       <w:rPr>
         <w:rFonts w:asciiTheme="majorHAnsi" w:eastAsiaTheme="majorEastAsia" w:hAnsiTheme="majorHAnsi" w:cstheme="majorBidi"/>
+        <w:noProof/>
       </w:rPr>
       <w:tblPr/>
       <w:tcPr>
@@ -6152,6 +6564,7 @@
       <w:rPr>
         <w:b/>
         <w:bCs/>
+        <w:noProof/>
         <w:color w:val="1F497D" w:themeColor="text2"/>
       </w:rPr>
       <w:tblPr/>
@@ -6166,12 +6579,14 @@
       <w:rPr>
         <w:b/>
         <w:bCs/>
+        <w:noProof/>
       </w:rPr>
     </w:tblStylePr>
     <w:tblStylePr w:type="lastCol">
       <w:rPr>
         <w:b/>
         <w:bCs/>
+        <w:noProof/>
       </w:rPr>
       <w:tblPr/>
       <w:tcPr>
@@ -6203,6 +6618,7 @@
       <w:spacing w:after="0" w:line="240" w:lineRule="auto"/>
     </w:pPr>
     <w:rPr>
+      <w:noProof/>
       <w:color w:val="000000" w:themeColor="text1"/>
     </w:rPr>
     <w:tblPr>
@@ -6223,6 +6639,7 @@
     <w:tblStylePr w:type="firstRow">
       <w:rPr>
         <w:rFonts w:asciiTheme="majorHAnsi" w:eastAsiaTheme="majorEastAsia" w:hAnsiTheme="majorHAnsi" w:cstheme="majorBidi"/>
+        <w:noProof/>
       </w:rPr>
       <w:tblPr/>
       <w:tcPr>
@@ -6236,6 +6653,7 @@
       <w:rPr>
         <w:b/>
         <w:bCs/>
+        <w:noProof/>
         <w:color w:val="1F497D" w:themeColor="text2"/>
       </w:rPr>
       <w:tblPr/>
@@ -6250,12 +6668,14 @@
       <w:rPr>
         <w:b/>
         <w:bCs/>
+        <w:noProof/>
       </w:rPr>
     </w:tblStylePr>
     <w:tblStylePr w:type="lastCol">
       <w:rPr>
         <w:b/>
         <w:bCs/>
+        <w:noProof/>
       </w:rPr>
       <w:tblPr/>
       <w:tcPr>
@@ -6288,6 +6708,7 @@
     </w:pPr>
     <w:rPr>
       <w:rFonts w:asciiTheme="majorHAnsi" w:eastAsiaTheme="majorEastAsia" w:hAnsiTheme="majorHAnsi" w:cstheme="majorBidi"/>
+      <w:noProof/>
       <w:color w:val="000000" w:themeColor="text1"/>
     </w:rPr>
     <w:tblPr>
@@ -6309,6 +6730,7 @@
     </w:tblPr>
     <w:tblStylePr w:type="firstRow">
       <w:rPr>
+        <w:noProof/>
         <w:sz w:val="24"/>
         <w:szCs w:val="24"/>
       </w:rPr>
@@ -6416,6 +6838,7 @@
     </w:pPr>
     <w:rPr>
       <w:rFonts w:asciiTheme="majorHAnsi" w:eastAsiaTheme="majorEastAsia" w:hAnsiTheme="majorHAnsi" w:cstheme="majorBidi"/>
+      <w:noProof/>
       <w:color w:val="000000" w:themeColor="text1"/>
     </w:rPr>
     <w:tblPr>
@@ -6437,6 +6860,7 @@
     </w:tblPr>
     <w:tblStylePr w:type="firstRow">
       <w:rPr>
+        <w:noProof/>
         <w:sz w:val="24"/>
         <w:szCs w:val="24"/>
       </w:rPr>
@@ -6544,6 +6968,7 @@
     </w:pPr>
     <w:rPr>
       <w:rFonts w:asciiTheme="majorHAnsi" w:eastAsiaTheme="majorEastAsia" w:hAnsiTheme="majorHAnsi" w:cstheme="majorBidi"/>
+      <w:noProof/>
       <w:color w:val="000000" w:themeColor="text1"/>
     </w:rPr>
     <w:tblPr>
@@ -6565,6 +6990,7 @@
     </w:tblPr>
     <w:tblStylePr w:type="firstRow">
       <w:rPr>
+        <w:noProof/>
         <w:sz w:val="24"/>
         <w:szCs w:val="24"/>
       </w:rPr>
@@ -6672,6 +7098,7 @@
     </w:pPr>
     <w:rPr>
       <w:rFonts w:asciiTheme="majorHAnsi" w:eastAsiaTheme="majorEastAsia" w:hAnsiTheme="majorHAnsi" w:cstheme="majorBidi"/>
+      <w:noProof/>
       <w:color w:val="000000" w:themeColor="text1"/>
     </w:rPr>
     <w:tblPr>
@@ -6693,6 +7120,7 @@
     </w:tblPr>
     <w:tblStylePr w:type="firstRow">
       <w:rPr>
+        <w:noProof/>
         <w:sz w:val="24"/>
         <w:szCs w:val="24"/>
       </w:rPr>
@@ -6800,6 +7228,7 @@
     </w:pPr>
     <w:rPr>
       <w:rFonts w:asciiTheme="majorHAnsi" w:eastAsiaTheme="majorEastAsia" w:hAnsiTheme="majorHAnsi" w:cstheme="majorBidi"/>
+      <w:noProof/>
       <w:color w:val="000000" w:themeColor="text1"/>
     </w:rPr>
     <w:tblPr>
@@ -6821,6 +7250,7 @@
     </w:tblPr>
     <w:tblStylePr w:type="firstRow">
       <w:rPr>
+        <w:noProof/>
         <w:sz w:val="24"/>
         <w:szCs w:val="24"/>
       </w:rPr>
@@ -6928,6 +7358,7 @@
     </w:pPr>
     <w:rPr>
       <w:rFonts w:asciiTheme="majorHAnsi" w:eastAsiaTheme="majorEastAsia" w:hAnsiTheme="majorHAnsi" w:cstheme="majorBidi"/>
+      <w:noProof/>
       <w:color w:val="000000" w:themeColor="text1"/>
     </w:rPr>
     <w:tblPr>
@@ -6949,6 +7380,7 @@
     </w:tblPr>
     <w:tblStylePr w:type="firstRow">
       <w:rPr>
+        <w:noProof/>
         <w:sz w:val="24"/>
         <w:szCs w:val="24"/>
       </w:rPr>
@@ -7056,6 +7488,7 @@
     </w:pPr>
     <w:rPr>
       <w:rFonts w:asciiTheme="majorHAnsi" w:eastAsiaTheme="majorEastAsia" w:hAnsiTheme="majorHAnsi" w:cstheme="majorBidi"/>
+      <w:noProof/>
       <w:color w:val="000000" w:themeColor="text1"/>
     </w:rPr>
     <w:tblPr>
@@ -7077,6 +7510,7 @@
     </w:tblPr>
     <w:tblStylePr w:type="firstRow">
       <w:rPr>
+        <w:noProof/>
         <w:sz w:val="24"/>
         <w:szCs w:val="24"/>
       </w:rPr>
@@ -7208,12 +7642,14 @@
       <w:rPr>
         <w:b/>
         <w:bCs/>
+        <w:noProof/>
       </w:rPr>
     </w:tblStylePr>
     <w:tblStylePr w:type="lastRow">
       <w:rPr>
         <w:b/>
         <w:bCs/>
+        <w:noProof/>
       </w:rPr>
       <w:tblPr/>
       <w:tcPr>
@@ -7226,12 +7662,14 @@
       <w:rPr>
         <w:b/>
         <w:bCs/>
+        <w:noProof/>
       </w:rPr>
     </w:tblStylePr>
     <w:tblStylePr w:type="lastCol">
       <w:rPr>
         <w:b/>
         <w:bCs/>
+        <w:noProof/>
       </w:rPr>
     </w:tblStylePr>
     <w:tblStylePr w:type="band1Vert">
@@ -7246,6 +7684,9 @@
         <w:shd w:val="clear" w:color="auto" w:fill="808080" w:themeFill="text1" w:themeFillTint="7F"/>
       </w:tcPr>
     </w:tblStylePr>
+    <w:rPr>
+      <w:noProof/>
+    </w:rPr>
   </w:style>
   <w:style w:type="table" w:styleId="MediumGrid1-Accent1">
     <w:name w:val="Medium Grid 1 Accent 1"/>
@@ -7281,12 +7722,14 @@
       <w:rPr>
         <w:b/>
         <w:bCs/>
+        <w:noProof/>
       </w:rPr>
     </w:tblStylePr>
     <w:tblStylePr w:type="lastRow">
       <w:rPr>
         <w:b/>
         <w:bCs/>
+        <w:noProof/>
       </w:rPr>
       <w:tblPr/>
       <w:tcPr>
@@ -7299,12 +7742,14 @@
       <w:rPr>
         <w:b/>
         <w:bCs/>
+        <w:noProof/>
       </w:rPr>
     </w:tblStylePr>
     <w:tblStylePr w:type="lastCol">
       <w:rPr>
         <w:b/>
         <w:bCs/>
+        <w:noProof/>
       </w:rPr>
     </w:tblStylePr>
     <w:tblStylePr w:type="band1Vert">
@@ -7319,6 +7764,9 @@
         <w:shd w:val="clear" w:color="auto" w:fill="A7BFDE" w:themeFill="accent1" w:themeFillTint="7F"/>
       </w:tcPr>
     </w:tblStylePr>
+    <w:rPr>
+      <w:noProof/>
+    </w:rPr>
   </w:style>
   <w:style w:type="table" w:styleId="MediumGrid1-Accent2">
     <w:name w:val="Medium Grid 1 Accent 2"/>
@@ -7354,12 +7802,14 @@
       <w:rPr>
         <w:b/>
         <w:bCs/>
+        <w:noProof/>
       </w:rPr>
     </w:tblStylePr>
     <w:tblStylePr w:type="lastRow">
       <w:rPr>
         <w:b/>
         <w:bCs/>
+        <w:noProof/>
       </w:rPr>
       <w:tblPr/>
       <w:tcPr>
@@ -7372,12 +7822,14 @@
       <w:rPr>
         <w:b/>
         <w:bCs/>
+        <w:noProof/>
       </w:rPr>
     </w:tblStylePr>
     <w:tblStylePr w:type="lastCol">
       <w:rPr>
         <w:b/>
         <w:bCs/>
+        <w:noProof/>
       </w:rPr>
     </w:tblStylePr>
     <w:tblStylePr w:type="band1Vert">
@@ -7392,6 +7844,9 @@
         <w:shd w:val="clear" w:color="auto" w:fill="DFA7A6" w:themeFill="accent2" w:themeFillTint="7F"/>
       </w:tcPr>
     </w:tblStylePr>
+    <w:rPr>
+      <w:noProof/>
+    </w:rPr>
   </w:style>
   <w:style w:type="table" w:styleId="MediumGrid1-Accent3">
     <w:name w:val="Medium Grid 1 Accent 3"/>
@@ -7427,12 +7882,14 @@
       <w:rPr>
         <w:b/>
         <w:bCs/>
+        <w:noProof/>
       </w:rPr>
     </w:tblStylePr>
     <w:tblStylePr w:type="lastRow">
       <w:rPr>
         <w:b/>
         <w:bCs/>
+        <w:noProof/>
       </w:rPr>
       <w:tblPr/>
       <w:tcPr>
@@ -7445,12 +7902,14 @@
       <w:rPr>
         <w:b/>
         <w:bCs/>
+        <w:noProof/>
       </w:rPr>
     </w:tblStylePr>
     <w:tblStylePr w:type="lastCol">
       <w:rPr>
         <w:b/>
         <w:bCs/>
+        <w:noProof/>
       </w:rPr>
     </w:tblStylePr>
     <w:tblStylePr w:type="band1Vert">
@@ -7465,6 +7924,9 @@
         <w:shd w:val="clear" w:color="auto" w:fill="CDDDAC" w:themeFill="accent3" w:themeFillTint="7F"/>
       </w:tcPr>
     </w:tblStylePr>
+    <w:rPr>
+      <w:noProof/>
+    </w:rPr>
   </w:style>
   <w:style w:type="table" w:styleId="MediumGrid1-Accent4">
     <w:name w:val="Medium Grid 1 Accent 4"/>
@@ -7500,12 +7962,14 @@
       <w:rPr>
         <w:b/>
         <w:bCs/>
+        <w:noProof/>
       </w:rPr>
     </w:tblStylePr>
     <w:tblStylePr w:type="lastRow">
       <w:rPr>
         <w:b/>
         <w:bCs/>
+        <w:noProof/>
       </w:rPr>
       <w:tblPr/>
       <w:tcPr>
@@ -7518,12 +7982,14 @@
       <w:rPr>
         <w:b/>
         <w:bCs/>
+        <w:noProof/>
       </w:rPr>
     </w:tblStylePr>
     <w:tblStylePr w:type="lastCol">
       <w:rPr>
         <w:b/>
         <w:bCs/>
+        <w:noProof/>
       </w:rPr>
     </w:tblStylePr>
     <w:tblStylePr w:type="band1Vert">
@@ -7538,6 +8004,9 @@
         <w:shd w:val="clear" w:color="auto" w:fill="BFB1D0" w:themeFill="accent4" w:themeFillTint="7F"/>
       </w:tcPr>
     </w:tblStylePr>
+    <w:rPr>
+      <w:noProof/>
+    </w:rPr>
   </w:style>
   <w:style w:type="table" w:styleId="MediumGrid1-Accent5">
     <w:name w:val="Medium Grid 1 Accent 5"/>
@@ -7573,12 +8042,14 @@
       <w:rPr>
         <w:b/>
         <w:bCs/>
+        <w:noProof/>
       </w:rPr>
     </w:tblStylePr>
     <w:tblStylePr w:type="lastRow">
       <w:rPr>
         <w:b/>
         <w:bCs/>
+        <w:noProof/>
       </w:rPr>
       <w:tblPr/>
       <w:tcPr>
@@ -7591,12 +8062,14 @@
       <w:rPr>
         <w:b/>
         <w:bCs/>
+        <w:noProof/>
       </w:rPr>
     </w:tblStylePr>
     <w:tblStylePr w:type="lastCol">
       <w:rPr>
         <w:b/>
         <w:bCs/>
+        <w:noProof/>
       </w:rPr>
     </w:tblStylePr>
     <w:tblStylePr w:type="band1Vert">
@@ -7611,6 +8084,9 @@
         <w:shd w:val="clear" w:color="auto" w:fill="A5D5E2" w:themeFill="accent5" w:themeFillTint="7F"/>
       </w:tcPr>
     </w:tblStylePr>
+    <w:rPr>
+      <w:noProof/>
+    </w:rPr>
   </w:style>
   <w:style w:type="table" w:styleId="MediumGrid1-Accent6">
     <w:name w:val="Medium Grid 1 Accent 6"/>
@@ -7646,12 +8122,14 @@
       <w:rPr>
         <w:b/>
         <w:bCs/>
+        <w:noProof/>
       </w:rPr>
     </w:tblStylePr>
     <w:tblStylePr w:type="lastRow">
       <w:rPr>
         <w:b/>
         <w:bCs/>
+        <w:noProof/>
       </w:rPr>
       <w:tblPr/>
       <w:tcPr>
@@ -7664,12 +8142,14 @@
       <w:rPr>
         <w:b/>
         <w:bCs/>
+        <w:noProof/>
       </w:rPr>
     </w:tblStylePr>
     <w:tblStylePr w:type="lastCol">
       <w:rPr>
         <w:b/>
         <w:bCs/>
+        <w:noProof/>
       </w:rPr>
     </w:tblStylePr>
     <w:tblStylePr w:type="band1Vert">
@@ -7684,6 +8164,9 @@
         <w:shd w:val="clear" w:color="auto" w:fill="FBCAA2" w:themeFill="accent6" w:themeFillTint="7F"/>
       </w:tcPr>
     </w:tblStylePr>
+    <w:rPr>
+      <w:noProof/>
+    </w:rPr>
   </w:style>
   <w:style w:type="table" w:styleId="MediumGrid2">
     <w:name w:val="Medium Grid 2"/>
@@ -7695,6 +8178,7 @@
     </w:pPr>
     <w:rPr>
       <w:rFonts w:asciiTheme="majorHAnsi" w:eastAsiaTheme="majorEastAsia" w:hAnsiTheme="majorHAnsi" w:cstheme="majorBidi"/>
+      <w:noProof/>
       <w:color w:val="000000" w:themeColor="text1"/>
     </w:rPr>
     <w:tblPr>
@@ -7723,6 +8207,7 @@
       <w:rPr>
         <w:b/>
         <w:bCs/>
+        <w:noProof/>
         <w:color w:val="000000" w:themeColor="text1"/>
       </w:rPr>
       <w:tblPr/>
@@ -7734,6 +8219,7 @@
       <w:rPr>
         <w:b/>
         <w:bCs/>
+        <w:noProof/>
         <w:color w:val="000000" w:themeColor="text1"/>
       </w:rPr>
       <w:tblPr/>
@@ -7753,6 +8239,7 @@
       <w:rPr>
         <w:b/>
         <w:bCs/>
+        <w:noProof/>
         <w:color w:val="000000" w:themeColor="text1"/>
       </w:rPr>
       <w:tblPr/>
@@ -7772,6 +8259,7 @@
       <w:rPr>
         <w:b w:val="0"/>
         <w:bCs w:val="0"/>
+        <w:noProof/>
         <w:color w:val="000000" w:themeColor="text1"/>
       </w:rPr>
       <w:tblPr/>
@@ -7820,6 +8308,7 @@
     </w:pPr>
     <w:rPr>
       <w:rFonts w:asciiTheme="majorHAnsi" w:eastAsiaTheme="majorEastAsia" w:hAnsiTheme="majorHAnsi" w:cstheme="majorBidi"/>
+      <w:noProof/>
       <w:color w:val="000000" w:themeColor="text1"/>
     </w:rPr>
     <w:tblPr>
@@ -7848,6 +8337,7 @@
       <w:rPr>
         <w:b/>
         <w:bCs/>
+        <w:noProof/>
         <w:color w:val="000000" w:themeColor="text1"/>
       </w:rPr>
       <w:tblPr/>
@@ -7859,6 +8349,7 @@
       <w:rPr>
         <w:b/>
         <w:bCs/>
+        <w:noProof/>
         <w:color w:val="000000" w:themeColor="text1"/>
       </w:rPr>
       <w:tblPr/>
@@ -7878,6 +8369,7 @@
       <w:rPr>
         <w:b/>
         <w:bCs/>
+        <w:noProof/>
         <w:color w:val="000000" w:themeColor="text1"/>
       </w:rPr>
       <w:tblPr/>
@@ -7897,6 +8389,7 @@
       <w:rPr>
         <w:b w:val="0"/>
         <w:bCs w:val="0"/>
+        <w:noProof/>
         <w:color w:val="000000" w:themeColor="text1"/>
       </w:rPr>
       <w:tblPr/>
@@ -7945,6 +8438,7 @@
     </w:pPr>
     <w:rPr>
       <w:rFonts w:asciiTheme="majorHAnsi" w:eastAsiaTheme="majorEastAsia" w:hAnsiTheme="majorHAnsi" w:cstheme="majorBidi"/>
+      <w:noProof/>
       <w:color w:val="000000" w:themeColor="text1"/>
     </w:rPr>
     <w:tblPr>
@@ -7973,6 +8467,7 @@
       <w:rPr>
         <w:b/>
         <w:bCs/>
+        <w:noProof/>
         <w:color w:val="000000" w:themeColor="text1"/>
       </w:rPr>
       <w:tblPr/>
@@ -7984,6 +8479,7 @@
       <w:rPr>
         <w:b/>
         <w:bCs/>
+        <w:noProof/>
         <w:color w:val="000000" w:themeColor="text1"/>
       </w:rPr>
       <w:tblPr/>
@@ -8003,6 +8499,7 @@
       <w:rPr>
         <w:b/>
         <w:bCs/>
+        <w:noProof/>
         <w:color w:val="000000" w:themeColor="text1"/>
       </w:rPr>
       <w:tblPr/>
@@ -8022,6 +8519,7 @@
       <w:rPr>
         <w:b w:val="0"/>
         <w:bCs w:val="0"/>
+        <w:noProof/>
         <w:color w:val="000000" w:themeColor="text1"/>
       </w:rPr>
       <w:tblPr/>
@@ -8070,6 +8568,7 @@
     </w:pPr>
     <w:rPr>
       <w:rFonts w:asciiTheme="majorHAnsi" w:eastAsiaTheme="majorEastAsia" w:hAnsiTheme="majorHAnsi" w:cstheme="majorBidi"/>
+      <w:noProof/>
       <w:color w:val="000000" w:themeColor="text1"/>
     </w:rPr>
     <w:tblPr>
@@ -8098,6 +8597,7 @@
       <w:rPr>
         <w:b/>
         <w:bCs/>
+        <w:noProof/>
         <w:color w:val="000000" w:themeColor="text1"/>
       </w:rPr>
       <w:tblPr/>
@@ -8109,6 +8609,7 @@
       <w:rPr>
         <w:b/>
         <w:bCs/>
+        <w:noProof/>
         <w:color w:val="000000" w:themeColor="text1"/>
       </w:rPr>
       <w:tblPr/>
@@ -8128,6 +8629,7 @@
       <w:rPr>
         <w:b/>
         <w:bCs/>
+        <w:noProof/>
         <w:color w:val="000000" w:themeColor="text1"/>
       </w:rPr>
       <w:tblPr/>
@@ -8147,6 +8649,7 @@
       <w:rPr>
         <w:b w:val="0"/>
         <w:bCs w:val="0"/>
+        <w:noProof/>
         <w:color w:val="000000" w:themeColor="text1"/>
       </w:rPr>
       <w:tblPr/>
@@ -8195,6 +8698,7 @@
     </w:pPr>
     <w:rPr>
       <w:rFonts w:asciiTheme="majorHAnsi" w:eastAsiaTheme="majorEastAsia" w:hAnsiTheme="majorHAnsi" w:cstheme="majorBidi"/>
+      <w:noProof/>
       <w:color w:val="000000" w:themeColor="text1"/>
     </w:rPr>
     <w:tblPr>
@@ -8223,6 +8727,7 @@
       <w:rPr>
         <w:b/>
         <w:bCs/>
+        <w:noProof/>
         <w:color w:val="000000" w:themeColor="text1"/>
       </w:rPr>
       <w:tblPr/>
@@ -8234,6 +8739,7 @@
       <w:rPr>
         <w:b/>
         <w:bCs/>
+        <w:noProof/>
         <w:color w:val="000000" w:themeColor="text1"/>
       </w:rPr>
       <w:tblPr/>
@@ -8253,6 +8759,7 @@
       <w:rPr>
         <w:b/>
         <w:bCs/>
+        <w:noProof/>
         <w:color w:val="000000" w:themeColor="text1"/>
       </w:rPr>
       <w:tblPr/>
@@ -8272,6 +8779,7 @@
       <w:rPr>
         <w:b w:val="0"/>
         <w:bCs w:val="0"/>
+        <w:noProof/>
         <w:color w:val="000000" w:themeColor="text1"/>
       </w:rPr>
       <w:tblPr/>
@@ -8320,6 +8828,7 @@
     </w:pPr>
     <w:rPr>
       <w:rFonts w:asciiTheme="majorHAnsi" w:eastAsiaTheme="majorEastAsia" w:hAnsiTheme="majorHAnsi" w:cstheme="majorBidi"/>
+      <w:noProof/>
       <w:color w:val="000000" w:themeColor="text1"/>
     </w:rPr>
     <w:tblPr>
@@ -8348,6 +8857,7 @@
       <w:rPr>
         <w:b/>
         <w:bCs/>
+        <w:noProof/>
         <w:color w:val="000000" w:themeColor="text1"/>
       </w:rPr>
       <w:tblPr/>
@@ -8359,6 +8869,7 @@
       <w:rPr>
         <w:b/>
         <w:bCs/>
+        <w:noProof/>
         <w:color w:val="000000" w:themeColor="text1"/>
       </w:rPr>
       <w:tblPr/>
@@ -8378,6 +8889,7 @@
       <w:rPr>
         <w:b/>
         <w:bCs/>
+        <w:noProof/>
         <w:color w:val="000000" w:themeColor="text1"/>
       </w:rPr>
       <w:tblPr/>
@@ -8397,6 +8909,7 @@
       <w:rPr>
         <w:b w:val="0"/>
         <w:bCs w:val="0"/>
+        <w:noProof/>
         <w:color w:val="000000" w:themeColor="text1"/>
       </w:rPr>
       <w:tblPr/>
@@ -8445,6 +8958,7 @@
     </w:pPr>
     <w:rPr>
       <w:rFonts w:asciiTheme="majorHAnsi" w:eastAsiaTheme="majorEastAsia" w:hAnsiTheme="majorHAnsi" w:cstheme="majorBidi"/>
+      <w:noProof/>
       <w:color w:val="000000" w:themeColor="text1"/>
     </w:rPr>
     <w:tblPr>
@@ -8473,6 +8987,7 @@
       <w:rPr>
         <w:b/>
         <w:bCs/>
+        <w:noProof/>
         <w:color w:val="000000" w:themeColor="text1"/>
       </w:rPr>
       <w:tblPr/>
@@ -8484,6 +8999,7 @@
       <w:rPr>
         <w:b/>
         <w:bCs/>
+        <w:noProof/>
         <w:color w:val="000000" w:themeColor="text1"/>
       </w:rPr>
       <w:tblPr/>
@@ -8503,6 +9019,7 @@
       <w:rPr>
         <w:b/>
         <w:bCs/>
+        <w:noProof/>
         <w:color w:val="000000" w:themeColor="text1"/>
       </w:rPr>
       <w:tblPr/>
@@ -8522,6 +9039,7 @@
       <w:rPr>
         <w:b w:val="0"/>
         <w:bCs w:val="0"/>
+        <w:noProof/>
         <w:color w:val="000000" w:themeColor="text1"/>
       </w:rPr>
       <w:tblPr/>
@@ -8596,6 +9114,7 @@
         <w:bCs/>
         <w:i w:val="0"/>
         <w:iCs w:val="0"/>
+        <w:noProof/>
         <w:color w:val="FFFFFF" w:themeColor="background1"/>
       </w:rPr>
       <w:tblPr/>
@@ -8617,6 +9136,7 @@
         <w:bCs/>
         <w:i w:val="0"/>
         <w:iCs w:val="0"/>
+        <w:noProof/>
         <w:color w:val="FFFFFF" w:themeColor="background1"/>
       </w:rPr>
       <w:tblPr/>
@@ -8638,6 +9158,7 @@
         <w:bCs/>
         <w:i w:val="0"/>
         <w:iCs w:val="0"/>
+        <w:noProof/>
         <w:color w:val="FFFFFF" w:themeColor="background1"/>
       </w:rPr>
       <w:tblPr/>
@@ -8657,6 +9178,7 @@
         <w:bCs/>
         <w:i w:val="0"/>
         <w:iCs w:val="0"/>
+        <w:noProof/>
         <w:color w:val="FFFFFF" w:themeColor="background1"/>
       </w:rPr>
       <w:tblPr/>
@@ -8700,6 +9222,9 @@
         <w:shd w:val="clear" w:color="auto" w:fill="808080" w:themeFill="text1" w:themeFillTint="7F"/>
       </w:tcPr>
     </w:tblStylePr>
+    <w:rPr>
+      <w:noProof/>
+    </w:rPr>
   </w:style>
   <w:style w:type="table" w:styleId="MediumGrid3-Accent1">
     <w:name w:val="Medium Grid 3 Accent 1"/>
@@ -8737,6 +9262,7 @@
         <w:bCs/>
         <w:i w:val="0"/>
         <w:iCs w:val="0"/>
+        <w:noProof/>
         <w:color w:val="FFFFFF" w:themeColor="background1"/>
       </w:rPr>
       <w:tblPr/>
@@ -8758,6 +9284,7 @@
         <w:bCs/>
         <w:i w:val="0"/>
         <w:iCs w:val="0"/>
+        <w:noProof/>
         <w:color w:val="FFFFFF" w:themeColor="background1"/>
       </w:rPr>
       <w:tblPr/>
@@ -8779,6 +9306,7 @@
         <w:bCs/>
         <w:i w:val="0"/>
         <w:iCs w:val="0"/>
+        <w:noProof/>
         <w:color w:val="FFFFFF" w:themeColor="background1"/>
       </w:rPr>
       <w:tblPr/>
@@ -8798,6 +9326,7 @@
         <w:bCs/>
         <w:i w:val="0"/>
         <w:iCs w:val="0"/>
+        <w:noProof/>
         <w:color w:val="FFFFFF" w:themeColor="background1"/>
       </w:rPr>
       <w:tblPr/>
@@ -8841,6 +9370,9 @@
         <w:shd w:val="clear" w:color="auto" w:fill="A7BFDE" w:themeFill="accent1" w:themeFillTint="7F"/>
       </w:tcPr>
     </w:tblStylePr>
+    <w:rPr>
+      <w:noProof/>
+    </w:rPr>
   </w:style>
   <w:style w:type="table" w:styleId="MediumGrid3-Accent2">
     <w:name w:val="Medium Grid 3 Accent 2"/>
@@ -8878,6 +9410,7 @@
         <w:bCs/>
         <w:i w:val="0"/>
         <w:iCs w:val="0"/>
+        <w:noProof/>
         <w:color w:val="FFFFFF" w:themeColor="background1"/>
       </w:rPr>
       <w:tblPr/>
@@ -8899,6 +9432,7 @@
         <w:bCs/>
         <w:i w:val="0"/>
         <w:iCs w:val="0"/>
+        <w:noProof/>
         <w:color w:val="FFFFFF" w:themeColor="background1"/>
       </w:rPr>
       <w:tblPr/>
@@ -8920,6 +9454,7 @@
         <w:bCs/>
         <w:i w:val="0"/>
         <w:iCs w:val="0"/>
+        <w:noProof/>
         <w:color w:val="FFFFFF" w:themeColor="background1"/>
       </w:rPr>
       <w:tblPr/>
@@ -8939,6 +9474,7 @@
         <w:bCs/>
         <w:i w:val="0"/>
         <w:iCs w:val="0"/>
+        <w:noProof/>
         <w:color w:val="FFFFFF" w:themeColor="background1"/>
       </w:rPr>
       <w:tblPr/>
@@ -8982,6 +9518,9 @@
         <w:shd w:val="clear" w:color="auto" w:fill="DFA7A6" w:themeFill="accent2" w:themeFillTint="7F"/>
       </w:tcPr>
     </w:tblStylePr>
+    <w:rPr>
+      <w:noProof/>
+    </w:rPr>
   </w:style>
   <w:style w:type="table" w:styleId="MediumGrid3-Accent3">
     <w:name w:val="Medium Grid 3 Accent 3"/>
@@ -9019,6 +9558,7 @@
         <w:bCs/>
         <w:i w:val="0"/>
         <w:iCs w:val="0"/>
+        <w:noProof/>
         <w:color w:val="FFFFFF" w:themeColor="background1"/>
       </w:rPr>
       <w:tblPr/>
@@ -9040,6 +9580,7 @@
         <w:bCs/>
         <w:i w:val="0"/>
         <w:iCs w:val="0"/>
+        <w:noProof/>
         <w:color w:val="FFFFFF" w:themeColor="background1"/>
       </w:rPr>
       <w:tblPr/>
@@ -9061,6 +9602,7 @@
         <w:bCs/>
         <w:i w:val="0"/>
         <w:iCs w:val="0"/>
+        <w:noProof/>
         <w:color w:val="FFFFFF" w:themeColor="background1"/>
       </w:rPr>
       <w:tblPr/>
@@ -9080,6 +9622,7 @@
         <w:bCs/>
         <w:i w:val="0"/>
         <w:iCs w:val="0"/>
+        <w:noProof/>
         <w:color w:val="FFFFFF" w:themeColor="background1"/>
       </w:rPr>
       <w:tblPr/>
@@ -9123,6 +9666,9 @@
         <w:shd w:val="clear" w:color="auto" w:fill="CDDDAC" w:themeFill="accent3" w:themeFillTint="7F"/>
       </w:tcPr>
     </w:tblStylePr>
+    <w:rPr>
+      <w:noProof/>
+    </w:rPr>
   </w:style>
   <w:style w:type="table" w:styleId="MediumGrid3-Accent4">
     <w:name w:val="Medium Grid 3 Accent 4"/>
@@ -9160,6 +9706,7 @@
         <w:bCs/>
         <w:i w:val="0"/>
         <w:iCs w:val="0"/>
+        <w:noProof/>
         <w:color w:val="FFFFFF" w:themeColor="background1"/>
       </w:rPr>
       <w:tblPr/>
@@ -9181,6 +9728,7 @@
         <w:bCs/>
         <w:i w:val="0"/>
         <w:iCs w:val="0"/>
+        <w:noProof/>
         <w:color w:val="FFFFFF" w:themeColor="background1"/>
       </w:rPr>
       <w:tblPr/>
@@ -9202,6 +9750,7 @@
         <w:bCs/>
         <w:i w:val="0"/>
         <w:iCs w:val="0"/>
+        <w:noProof/>
         <w:color w:val="FFFFFF" w:themeColor="background1"/>
       </w:rPr>
       <w:tblPr/>
@@ -9221,6 +9770,7 @@
         <w:bCs/>
         <w:i w:val="0"/>
         <w:iCs w:val="0"/>
+        <w:noProof/>
         <w:color w:val="FFFFFF" w:themeColor="background1"/>
       </w:rPr>
       <w:tblPr/>
@@ -9264,6 +9814,9 @@
         <w:shd w:val="clear" w:color="auto" w:fill="BFB1D0" w:themeFill="accent4" w:themeFillTint="7F"/>
       </w:tcPr>
     </w:tblStylePr>
+    <w:rPr>
+      <w:noProof/>
+    </w:rPr>
   </w:style>
   <w:style w:type="table" w:styleId="MediumGrid3-Accent5">
     <w:name w:val="Medium Grid 3 Accent 5"/>
@@ -9301,6 +9854,7 @@
         <w:bCs/>
         <w:i w:val="0"/>
         <w:iCs w:val="0"/>
+        <w:noProof/>
         <w:color w:val="FFFFFF" w:themeColor="background1"/>
       </w:rPr>
       <w:tblPr/>
@@ -9322,6 +9876,7 @@
         <w:bCs/>
         <w:i w:val="0"/>
         <w:iCs w:val="0"/>
+        <w:noProof/>
         <w:color w:val="FFFFFF" w:themeColor="background1"/>
       </w:rPr>
       <w:tblPr/>
@@ -9343,6 +9898,7 @@
         <w:bCs/>
         <w:i w:val="0"/>
         <w:iCs w:val="0"/>
+        <w:noProof/>
         <w:color w:val="FFFFFF" w:themeColor="background1"/>
       </w:rPr>
       <w:tblPr/>
@@ -9362,6 +9918,7 @@
         <w:bCs/>
         <w:i w:val="0"/>
         <w:iCs w:val="0"/>
+        <w:noProof/>
         <w:color w:val="FFFFFF" w:themeColor="background1"/>
       </w:rPr>
       <w:tblPr/>
@@ -9405,6 +9962,9 @@
         <w:shd w:val="clear" w:color="auto" w:fill="A5D5E2" w:themeFill="accent5" w:themeFillTint="7F"/>
       </w:tcPr>
     </w:tblStylePr>
+    <w:rPr>
+      <w:noProof/>
+    </w:rPr>
   </w:style>
   <w:style w:type="table" w:styleId="MediumGrid3-Accent6">
     <w:name w:val="Medium Grid 3 Accent 6"/>
@@ -9442,6 +10002,7 @@
         <w:bCs/>
         <w:i w:val="0"/>
         <w:iCs w:val="0"/>
+        <w:noProof/>
         <w:color w:val="FFFFFF" w:themeColor="background1"/>
       </w:rPr>
       <w:tblPr/>
@@ -9463,6 +10024,7 @@
         <w:bCs/>
         <w:i w:val="0"/>
         <w:iCs w:val="0"/>
+        <w:noProof/>
         <w:color w:val="FFFFFF" w:themeColor="background1"/>
       </w:rPr>
       <w:tblPr/>
@@ -9484,6 +10046,7 @@
         <w:bCs/>
         <w:i w:val="0"/>
         <w:iCs w:val="0"/>
+        <w:noProof/>
         <w:color w:val="FFFFFF" w:themeColor="background1"/>
       </w:rPr>
       <w:tblPr/>
@@ -9503,6 +10066,7 @@
         <w:bCs/>
         <w:i w:val="0"/>
         <w:iCs w:val="0"/>
+        <w:noProof/>
         <w:color w:val="FFFFFF" w:themeColor="background1"/>
       </w:rPr>
       <w:tblPr/>
@@ -9546,6 +10110,9 @@
         <w:shd w:val="clear" w:color="auto" w:fill="FBCAA2" w:themeFill="accent6" w:themeFillTint="7F"/>
       </w:tcPr>
     </w:tblStylePr>
+    <w:rPr>
+      <w:noProof/>
+    </w:rPr>
   </w:style>
   <w:style w:type="table" w:styleId="DarkList">
     <w:name w:val="Dark List"/>
@@ -9556,6 +10123,7 @@
       <w:spacing w:after="0" w:line="240" w:lineRule="auto"/>
     </w:pPr>
     <w:rPr>
+      <w:noProof/>
       <w:color w:val="FFFFFF" w:themeColor="background1"/>
     </w:rPr>
     <w:tblPr>
@@ -9576,6 +10144,7 @@
       <w:rPr>
         <w:b/>
         <w:bCs/>
+        <w:noProof/>
       </w:rPr>
       <w:tblPr/>
       <w:tcPr>
@@ -9670,6 +10239,7 @@
       <w:spacing w:after="0" w:line="240" w:lineRule="auto"/>
     </w:pPr>
     <w:rPr>
+      <w:noProof/>
       <w:color w:val="FFFFFF" w:themeColor="background1"/>
     </w:rPr>
     <w:tblPr>
@@ -9690,6 +10260,7 @@
       <w:rPr>
         <w:b/>
         <w:bCs/>
+        <w:noProof/>
       </w:rPr>
       <w:tblPr/>
       <w:tcPr>
@@ -9784,6 +10355,7 @@
       <w:spacing w:after="0" w:line="240" w:lineRule="auto"/>
     </w:pPr>
     <w:rPr>
+      <w:noProof/>
       <w:color w:val="FFFFFF" w:themeColor="background1"/>
     </w:rPr>
     <w:tblPr>
@@ -9804,6 +10376,7 @@
       <w:rPr>
         <w:b/>
         <w:bCs/>
+        <w:noProof/>
       </w:rPr>
       <w:tblPr/>
       <w:tcPr>
@@ -9898,6 +10471,7 @@
       <w:spacing w:after="0" w:line="240" w:lineRule="auto"/>
     </w:pPr>
     <w:rPr>
+      <w:noProof/>
       <w:color w:val="FFFFFF" w:themeColor="background1"/>
     </w:rPr>
     <w:tblPr>
@@ -9918,6 +10492,7 @@
       <w:rPr>
         <w:b/>
         <w:bCs/>
+        <w:noProof/>
       </w:rPr>
       <w:tblPr/>
       <w:tcPr>
@@ -10012,6 +10587,7 @@
       <w:spacing w:after="0" w:line="240" w:lineRule="auto"/>
     </w:pPr>
     <w:rPr>
+      <w:noProof/>
       <w:color w:val="FFFFFF" w:themeColor="background1"/>
     </w:rPr>
     <w:tblPr>
@@ -10032,6 +10608,7 @@
       <w:rPr>
         <w:b/>
         <w:bCs/>
+        <w:noProof/>
       </w:rPr>
       <w:tblPr/>
       <w:tcPr>
@@ -10126,6 +10703,7 @@
       <w:spacing w:after="0" w:line="240" w:lineRule="auto"/>
     </w:pPr>
     <w:rPr>
+      <w:noProof/>
       <w:color w:val="FFFFFF" w:themeColor="background1"/>
     </w:rPr>
     <w:tblPr>
@@ -10146,6 +10724,7 @@
       <w:rPr>
         <w:b/>
         <w:bCs/>
+        <w:noProof/>
       </w:rPr>
       <w:tblPr/>
       <w:tcPr>
@@ -10240,6 +10819,7 @@
       <w:spacing w:after="0" w:line="240" w:lineRule="auto"/>
     </w:pPr>
     <w:rPr>
+      <w:noProof/>
       <w:color w:val="FFFFFF" w:themeColor="background1"/>
     </w:rPr>
     <w:tblPr>
@@ -10260,6 +10840,7 @@
       <w:rPr>
         <w:b/>
         <w:bCs/>
+        <w:noProof/>
       </w:rPr>
       <w:tblPr/>
       <w:tcPr>
@@ -10354,6 +10935,7 @@
       <w:spacing w:after="0" w:line="240" w:lineRule="auto"/>
     </w:pPr>
     <w:rPr>
+      <w:noProof/>
       <w:color w:val="000000" w:themeColor="text1"/>
     </w:rPr>
     <w:tblPr>
@@ -10382,6 +10964,7 @@
       <w:rPr>
         <w:b/>
         <w:bCs/>
+        <w:noProof/>
       </w:rPr>
       <w:tblPr/>
       <w:tcPr>
@@ -10400,6 +10983,7 @@
       <w:rPr>
         <w:b/>
         <w:bCs/>
+        <w:noProof/>
         <w:color w:val="FFFFFF" w:themeColor="background1"/>
       </w:rPr>
       <w:tblPr/>
@@ -10412,6 +10996,7 @@
     </w:tblStylePr>
     <w:tblStylePr w:type="firstCol">
       <w:rPr>
+        <w:noProof/>
         <w:color w:val="FFFFFF" w:themeColor="background1"/>
       </w:rPr>
       <w:tblPr/>
@@ -10429,6 +11014,7 @@
     </w:tblStylePr>
     <w:tblStylePr w:type="lastCol">
       <w:rPr>
+        <w:noProof/>
         <w:color w:val="FFFFFF" w:themeColor="background1"/>
       </w:rPr>
       <w:tblPr/>
@@ -10458,11 +11044,13 @@
     </w:tblStylePr>
     <w:tblStylePr w:type="neCell">
       <w:rPr>
+        <w:noProof/>
         <w:color w:val="000000" w:themeColor="text1"/>
       </w:rPr>
     </w:tblStylePr>
     <w:tblStylePr w:type="nwCell">
       <w:rPr>
+        <w:noProof/>
         <w:color w:val="000000" w:themeColor="text1"/>
       </w:rPr>
     </w:tblStylePr>
@@ -10476,6 +11064,7 @@
       <w:spacing w:after="0" w:line="240" w:lineRule="auto"/>
     </w:pPr>
     <w:rPr>
+      <w:noProof/>
       <w:color w:val="000000" w:themeColor="text1"/>
     </w:rPr>
     <w:tblPr>
@@ -10504,6 +11093,7 @@
       <w:rPr>
         <w:b/>
         <w:bCs/>
+        <w:noProof/>
       </w:rPr>
       <w:tblPr/>
       <w:tcPr>
@@ -10522,6 +11112,7 @@
       <w:rPr>
         <w:b/>
         <w:bCs/>
+        <w:noProof/>
         <w:color w:val="FFFFFF" w:themeColor="background1"/>
       </w:rPr>
       <w:tblPr/>
@@ -10534,6 +11125,7 @@
     </w:tblStylePr>
     <w:tblStylePr w:type="firstCol">
       <w:rPr>
+        <w:noProof/>
         <w:color w:val="FFFFFF" w:themeColor="background1"/>
       </w:rPr>
       <w:tblPr/>
@@ -10551,6 +11143,7 @@
     </w:tblStylePr>
     <w:tblStylePr w:type="lastCol">
       <w:rPr>
+        <w:noProof/>
         <w:color w:val="FFFFFF" w:themeColor="background1"/>
       </w:rPr>
       <w:tblPr/>
@@ -10580,11 +11173,13 @@
     </w:tblStylePr>
     <w:tblStylePr w:type="neCell">
       <w:rPr>
+        <w:noProof/>
         <w:color w:val="000000" w:themeColor="text1"/>
       </w:rPr>
     </w:tblStylePr>
     <w:tblStylePr w:type="nwCell">
       <w:rPr>
+        <w:noProof/>
         <w:color w:val="000000" w:themeColor="text1"/>
       </w:rPr>
     </w:tblStylePr>
@@ -10598,6 +11193,7 @@
       <w:spacing w:after="0" w:line="240" w:lineRule="auto"/>
     </w:pPr>
     <w:rPr>
+      <w:noProof/>
       <w:color w:val="000000" w:themeColor="text1"/>
     </w:rPr>
     <w:tblPr>
@@ -10626,6 +11222,7 @@
       <w:rPr>
         <w:b/>
         <w:bCs/>
+        <w:noProof/>
       </w:rPr>
       <w:tblPr/>
       <w:tcPr>
@@ -10644,6 +11241,7 @@
       <w:rPr>
         <w:b/>
         <w:bCs/>
+        <w:noProof/>
         <w:color w:val="FFFFFF" w:themeColor="background1"/>
       </w:rPr>
       <w:tblPr/>
@@ -10656,6 +11254,7 @@
     </w:tblStylePr>
     <w:tblStylePr w:type="firstCol">
       <w:rPr>
+        <w:noProof/>
         <w:color w:val="FFFFFF" w:themeColor="background1"/>
       </w:rPr>
       <w:tblPr/>
@@ -10673,6 +11272,7 @@
     </w:tblStylePr>
     <w:tblStylePr w:type="lastCol">
       <w:rPr>
+        <w:noProof/>
         <w:color w:val="FFFFFF" w:themeColor="background1"/>
       </w:rPr>
       <w:tblPr/>
@@ -10702,11 +11302,13 @@
     </w:tblStylePr>
     <w:tblStylePr w:type="neCell">
       <w:rPr>
+        <w:noProof/>
         <w:color w:val="000000" w:themeColor="text1"/>
       </w:rPr>
     </w:tblStylePr>
     <w:tblStylePr w:type="nwCell">
       <w:rPr>
+        <w:noProof/>
         <w:color w:val="000000" w:themeColor="text1"/>
       </w:rPr>
     </w:tblStylePr>
@@ -10720,6 +11322,7 @@
       <w:spacing w:after="0" w:line="240" w:lineRule="auto"/>
     </w:pPr>
     <w:rPr>
+      <w:noProof/>
       <w:color w:val="000000" w:themeColor="text1"/>
     </w:rPr>
     <w:tblPr>
@@ -10748,6 +11351,7 @@
       <w:rPr>
         <w:b/>
         <w:bCs/>
+        <w:noProof/>
       </w:rPr>
       <w:tblPr/>
       <w:tcPr>
@@ -10766,6 +11370,7 @@
       <w:rPr>
         <w:b/>
         <w:bCs/>
+        <w:noProof/>
         <w:color w:val="FFFFFF" w:themeColor="background1"/>
       </w:rPr>
       <w:tblPr/>
@@ -10778,6 +11383,7 @@
     </w:tblStylePr>
     <w:tblStylePr w:type="firstCol">
       <w:rPr>
+        <w:noProof/>
         <w:color w:val="FFFFFF" w:themeColor="background1"/>
       </w:rPr>
       <w:tblPr/>
@@ -10795,6 +11401,7 @@
     </w:tblStylePr>
     <w:tblStylePr w:type="lastCol">
       <w:rPr>
+        <w:noProof/>
         <w:color w:val="FFFFFF" w:themeColor="background1"/>
       </w:rPr>
       <w:tblPr/>
@@ -10832,6 +11439,7 @@
       <w:spacing w:after="0" w:line="240" w:lineRule="auto"/>
     </w:pPr>
     <w:rPr>
+      <w:noProof/>
       <w:color w:val="000000" w:themeColor="text1"/>
     </w:rPr>
     <w:tblPr>
@@ -10860,6 +11468,7 @@
       <w:rPr>
         <w:b/>
         <w:bCs/>
+        <w:noProof/>
       </w:rPr>
       <w:tblPr/>
       <w:tcPr>
@@ -10878,6 +11487,7 @@
       <w:rPr>
         <w:b/>
         <w:bCs/>
+        <w:noProof/>
         <w:color w:val="FFFFFF" w:themeColor="background1"/>
       </w:rPr>
       <w:tblPr/>
@@ -10890,6 +11500,7 @@
     </w:tblStylePr>
     <w:tblStylePr w:type="firstCol">
       <w:rPr>
+        <w:noProof/>
         <w:color w:val="FFFFFF" w:themeColor="background1"/>
       </w:rPr>
       <w:tblPr/>
@@ -10907,6 +11518,7 @@
     </w:tblStylePr>
     <w:tblStylePr w:type="lastCol">
       <w:rPr>
+        <w:noProof/>
         <w:color w:val="FFFFFF" w:themeColor="background1"/>
       </w:rPr>
       <w:tblPr/>
@@ -10936,11 +11548,13 @@
     </w:tblStylePr>
     <w:tblStylePr w:type="neCell">
       <w:rPr>
+        <w:noProof/>
         <w:color w:val="000000" w:themeColor="text1"/>
       </w:rPr>
     </w:tblStylePr>
     <w:tblStylePr w:type="nwCell">
       <w:rPr>
+        <w:noProof/>
         <w:color w:val="000000" w:themeColor="text1"/>
       </w:rPr>
     </w:tblStylePr>
@@ -10954,6 +11568,7 @@
       <w:spacing w:after="0" w:line="240" w:lineRule="auto"/>
     </w:pPr>
     <w:rPr>
+      <w:noProof/>
       <w:color w:val="000000" w:themeColor="text1"/>
     </w:rPr>
     <w:tblPr>
@@ -10982,6 +11597,7 @@
       <w:rPr>
         <w:b/>
         <w:bCs/>
+        <w:noProof/>
       </w:rPr>
       <w:tblPr/>
       <w:tcPr>
@@ -11000,6 +11616,7 @@
       <w:rPr>
         <w:b/>
         <w:bCs/>
+        <w:noProof/>
         <w:color w:val="FFFFFF" w:themeColor="background1"/>
       </w:rPr>
       <w:tblPr/>
@@ -11012,6 +11629,7 @@
     </w:tblStylePr>
     <w:tblStylePr w:type="firstCol">
       <w:rPr>
+        <w:noProof/>
         <w:color w:val="FFFFFF" w:themeColor="background1"/>
       </w:rPr>
       <w:tblPr/>
@@ -11029,6 +11647,7 @@
     </w:tblStylePr>
     <w:tblStylePr w:type="lastCol">
       <w:rPr>
+        <w:noProof/>
         <w:color w:val="FFFFFF" w:themeColor="background1"/>
       </w:rPr>
       <w:tblPr/>
@@ -11058,11 +11677,13 @@
     </w:tblStylePr>
     <w:tblStylePr w:type="neCell">
       <w:rPr>
+        <w:noProof/>
         <w:color w:val="000000" w:themeColor="text1"/>
       </w:rPr>
     </w:tblStylePr>
     <w:tblStylePr w:type="nwCell">
       <w:rPr>
+        <w:noProof/>
         <w:color w:val="000000" w:themeColor="text1"/>
       </w:rPr>
     </w:tblStylePr>
@@ -11076,6 +11697,7 @@
       <w:spacing w:after="0" w:line="240" w:lineRule="auto"/>
     </w:pPr>
     <w:rPr>
+      <w:noProof/>
       <w:color w:val="000000" w:themeColor="text1"/>
     </w:rPr>
     <w:tblPr>
@@ -11104,6 +11726,7 @@
       <w:rPr>
         <w:b/>
         <w:bCs/>
+        <w:noProof/>
       </w:rPr>
       <w:tblPr/>
       <w:tcPr>
@@ -11122,6 +11745,7 @@
       <w:rPr>
         <w:b/>
         <w:bCs/>
+        <w:noProof/>
         <w:color w:val="FFFFFF" w:themeColor="background1"/>
       </w:rPr>
       <w:tblPr/>
@@ -11134,6 +11758,7 @@
     </w:tblStylePr>
     <w:tblStylePr w:type="firstCol">
       <w:rPr>
+        <w:noProof/>
         <w:color w:val="FFFFFF" w:themeColor="background1"/>
       </w:rPr>
       <w:tblPr/>
@@ -11151,6 +11776,7 @@
     </w:tblStylePr>
     <w:tblStylePr w:type="lastCol">
       <w:rPr>
+        <w:noProof/>
         <w:color w:val="FFFFFF" w:themeColor="background1"/>
       </w:rPr>
       <w:tblPr/>
@@ -11180,11 +11806,13 @@
     </w:tblStylePr>
     <w:tblStylePr w:type="neCell">
       <w:rPr>
+        <w:noProof/>
         <w:color w:val="000000" w:themeColor="text1"/>
       </w:rPr>
     </w:tblStylePr>
     <w:tblStylePr w:type="nwCell">
       <w:rPr>
+        <w:noProof/>
         <w:color w:val="000000" w:themeColor="text1"/>
       </w:rPr>
     </w:tblStylePr>
@@ -11198,6 +11826,7 @@
       <w:spacing w:after="0" w:line="240" w:lineRule="auto"/>
     </w:pPr>
     <w:rPr>
+      <w:noProof/>
       <w:color w:val="000000" w:themeColor="text1"/>
     </w:rPr>
     <w:tblPr>
@@ -11218,6 +11847,7 @@
       <w:rPr>
         <w:b/>
         <w:bCs/>
+        <w:noProof/>
         <w:color w:val="FFFFFF" w:themeColor="background1"/>
       </w:rPr>
       <w:tblPr/>
@@ -11232,6 +11862,7 @@
       <w:rPr>
         <w:b/>
         <w:bCs/>
+        <w:noProof/>
         <w:color w:val="9E3A38" w:themeColor="accent2" w:themeShade="CC"/>
       </w:rPr>
       <w:tblPr/>
@@ -11246,12 +11877,14 @@
       <w:rPr>
         <w:b/>
         <w:bCs/>
+        <w:noProof/>
       </w:rPr>
     </w:tblStylePr>
     <w:tblStylePr w:type="lastCol">
       <w:rPr>
         <w:b/>
         <w:bCs/>
+        <w:noProof/>
       </w:rPr>
     </w:tblStylePr>
     <w:tblStylePr w:type="band1Vert">
@@ -11284,6 +11917,7 @@
       <w:spacing w:after="0" w:line="240" w:lineRule="auto"/>
     </w:pPr>
     <w:rPr>
+      <w:noProof/>
       <w:color w:val="000000" w:themeColor="text1"/>
     </w:rPr>
     <w:tblPr>
@@ -11304,6 +11938,7 @@
       <w:rPr>
         <w:b/>
         <w:bCs/>
+        <w:noProof/>
         <w:color w:val="FFFFFF" w:themeColor="background1"/>
       </w:rPr>
       <w:tblPr/>
@@ -11318,6 +11953,7 @@
       <w:rPr>
         <w:b/>
         <w:bCs/>
+        <w:noProof/>
         <w:color w:val="9E3A38" w:themeColor="accent2" w:themeShade="CC"/>
       </w:rPr>
       <w:tblPr/>
@@ -11332,12 +11968,14 @@
       <w:rPr>
         <w:b/>
         <w:bCs/>
+        <w:noProof/>
       </w:rPr>
     </w:tblStylePr>
     <w:tblStylePr w:type="lastCol">
       <w:rPr>
         <w:b/>
         <w:bCs/>
+        <w:noProof/>
       </w:rPr>
     </w:tblStylePr>
     <w:tblStylePr w:type="band1Vert">
@@ -11370,6 +12008,7 @@
       <w:spacing w:after="0" w:line="240" w:lineRule="auto"/>
     </w:pPr>
     <w:rPr>
+      <w:noProof/>
       <w:color w:val="000000" w:themeColor="text1"/>
     </w:rPr>
     <w:tblPr>
@@ -11390,6 +12029,7 @@
       <w:rPr>
         <w:b/>
         <w:bCs/>
+        <w:noProof/>
         <w:color w:val="FFFFFF" w:themeColor="background1"/>
       </w:rPr>
       <w:tblPr/>
@@ -11404,6 +12044,7 @@
       <w:rPr>
         <w:b/>
         <w:bCs/>
+        <w:noProof/>
         <w:color w:val="9E3A38" w:themeColor="accent2" w:themeShade="CC"/>
       </w:rPr>
       <w:tblPr/>
@@ -11418,12 +12059,14 @@
       <w:rPr>
         <w:b/>
         <w:bCs/>
+        <w:noProof/>
       </w:rPr>
     </w:tblStylePr>
     <w:tblStylePr w:type="lastCol">
       <w:rPr>
         <w:b/>
         <w:bCs/>
+        <w:noProof/>
       </w:rPr>
     </w:tblStylePr>
     <w:tblStylePr w:type="band1Vert">
@@ -11456,6 +12099,7 @@
       <w:spacing w:after="0" w:line="240" w:lineRule="auto"/>
     </w:pPr>
     <w:rPr>
+      <w:noProof/>
       <w:color w:val="000000" w:themeColor="text1"/>
     </w:rPr>
     <w:tblPr>
@@ -11476,6 +12120,7 @@
       <w:rPr>
         <w:b/>
         <w:bCs/>
+        <w:noProof/>
         <w:color w:val="FFFFFF" w:themeColor="background1"/>
       </w:rPr>
       <w:tblPr/>
@@ -11490,6 +12135,7 @@
       <w:rPr>
         <w:b/>
         <w:bCs/>
+        <w:noProof/>
         <w:color w:val="664E82" w:themeColor="accent4" w:themeShade="CC"/>
       </w:rPr>
       <w:tblPr/>
@@ -11504,12 +12150,14 @@
       <w:rPr>
         <w:b/>
         <w:bCs/>
+        <w:noProof/>
       </w:rPr>
     </w:tblStylePr>
     <w:tblStylePr w:type="lastCol">
       <w:rPr>
         <w:b/>
         <w:bCs/>
+        <w:noProof/>
       </w:rPr>
     </w:tblStylePr>
     <w:tblStylePr w:type="band1Vert">
@@ -11542,6 +12190,7 @@
       <w:spacing w:after="0" w:line="240" w:lineRule="auto"/>
     </w:pPr>
     <w:rPr>
+      <w:noProof/>
       <w:color w:val="000000" w:themeColor="text1"/>
     </w:rPr>
     <w:tblPr>
@@ -11562,6 +12211,7 @@
       <w:rPr>
         <w:b/>
         <w:bCs/>
+        <w:noProof/>
         <w:color w:val="FFFFFF" w:themeColor="background1"/>
       </w:rPr>
       <w:tblPr/>
@@ -11576,6 +12226,7 @@
       <w:rPr>
         <w:b/>
         <w:bCs/>
+        <w:noProof/>
         <w:color w:val="7E9C40" w:themeColor="accent3" w:themeShade="CC"/>
       </w:rPr>
       <w:tblPr/>
@@ -11590,12 +12241,14 @@
       <w:rPr>
         <w:b/>
         <w:bCs/>
+        <w:noProof/>
       </w:rPr>
     </w:tblStylePr>
     <w:tblStylePr w:type="lastCol">
       <w:rPr>
         <w:b/>
         <w:bCs/>
+        <w:noProof/>
       </w:rPr>
     </w:tblStylePr>
     <w:tblStylePr w:type="band1Vert">
@@ -11628,6 +12281,7 @@
       <w:spacing w:after="0" w:line="240" w:lineRule="auto"/>
     </w:pPr>
     <w:rPr>
+      <w:noProof/>
       <w:color w:val="000000" w:themeColor="text1"/>
     </w:rPr>
     <w:tblPr>
@@ -11648,6 +12302,7 @@
       <w:rPr>
         <w:b/>
         <w:bCs/>
+        <w:noProof/>
         <w:color w:val="FFFFFF" w:themeColor="background1"/>
       </w:rPr>
       <w:tblPr/>
@@ -11662,6 +12317,7 @@
       <w:rPr>
         <w:b/>
         <w:bCs/>
+        <w:noProof/>
         <w:color w:val="F2730A" w:themeColor="accent6" w:themeShade="CC"/>
       </w:rPr>
       <w:tblPr/>
@@ -11676,12 +12332,14 @@
       <w:rPr>
         <w:b/>
         <w:bCs/>
+        <w:noProof/>
       </w:rPr>
     </w:tblStylePr>
     <w:tblStylePr w:type="lastCol">
       <w:rPr>
         <w:b/>
         <w:bCs/>
+        <w:noProof/>
       </w:rPr>
     </w:tblStylePr>
     <w:tblStylePr w:type="band1Vert">
@@ -11714,6 +12372,7 @@
       <w:spacing w:after="0" w:line="240" w:lineRule="auto"/>
     </w:pPr>
     <w:rPr>
+      <w:noProof/>
       <w:color w:val="000000" w:themeColor="text1"/>
     </w:rPr>
     <w:tblPr>
@@ -11734,6 +12393,7 @@
       <w:rPr>
         <w:b/>
         <w:bCs/>
+        <w:noProof/>
         <w:color w:val="FFFFFF" w:themeColor="background1"/>
       </w:rPr>
       <w:tblPr/>
@@ -11748,6 +12408,7 @@
       <w:rPr>
         <w:b/>
         <w:bCs/>
+        <w:noProof/>
         <w:color w:val="348DA5" w:themeColor="accent5" w:themeShade="CC"/>
       </w:rPr>
       <w:tblPr/>
@@ -11762,12 +12423,14 @@
       <w:rPr>
         <w:b/>
         <w:bCs/>
+        <w:noProof/>
       </w:rPr>
     </w:tblStylePr>
     <w:tblStylePr w:type="lastCol">
       <w:rPr>
         <w:b/>
         <w:bCs/>
+        <w:noProof/>
       </w:rPr>
     </w:tblStylePr>
     <w:tblStylePr w:type="band1Vert">
@@ -11800,6 +12463,7 @@
       <w:spacing w:after="0" w:line="240" w:lineRule="auto"/>
     </w:pPr>
     <w:rPr>
+      <w:noProof/>
       <w:color w:val="000000" w:themeColor="text1"/>
     </w:rPr>
     <w:tblPr>
@@ -11823,6 +12487,7 @@
       <w:rPr>
         <w:b/>
         <w:bCs/>
+        <w:noProof/>
       </w:rPr>
       <w:tblPr/>
       <w:tcPr>
@@ -11833,6 +12498,7 @@
       <w:rPr>
         <w:b/>
         <w:bCs/>
+        <w:noProof/>
         <w:color w:val="000000" w:themeColor="text1"/>
       </w:rPr>
       <w:tblPr/>
@@ -11842,6 +12508,7 @@
     </w:tblStylePr>
     <w:tblStylePr w:type="firstCol">
       <w:rPr>
+        <w:noProof/>
         <w:color w:val="FFFFFF" w:themeColor="background1"/>
       </w:rPr>
       <w:tblPr/>
@@ -11851,6 +12518,7 @@
     </w:tblStylePr>
     <w:tblStylePr w:type="lastCol">
       <w:rPr>
+        <w:noProof/>
         <w:color w:val="FFFFFF" w:themeColor="background1"/>
       </w:rPr>
       <w:tblPr/>
@@ -11880,6 +12548,7 @@
       <w:spacing w:after="0" w:line="240" w:lineRule="auto"/>
     </w:pPr>
     <w:rPr>
+      <w:noProof/>
       <w:color w:val="000000" w:themeColor="text1"/>
     </w:rPr>
     <w:tblPr>
@@ -11903,6 +12572,7 @@
       <w:rPr>
         <w:b/>
         <w:bCs/>
+        <w:noProof/>
       </w:rPr>
       <w:tblPr/>
       <w:tcPr>
@@ -11913,6 +12583,7 @@
       <w:rPr>
         <w:b/>
         <w:bCs/>
+        <w:noProof/>
         <w:color w:val="000000" w:themeColor="text1"/>
       </w:rPr>
       <w:tblPr/>
@@ -11922,6 +12593,7 @@
     </w:tblStylePr>
     <w:tblStylePr w:type="firstCol">
       <w:rPr>
+        <w:noProof/>
         <w:color w:val="FFFFFF" w:themeColor="background1"/>
       </w:rPr>
       <w:tblPr/>
@@ -11931,6 +12603,7 @@
     </w:tblStylePr>
     <w:tblStylePr w:type="lastCol">
       <w:rPr>
+        <w:noProof/>
         <w:color w:val="FFFFFF" w:themeColor="background1"/>
       </w:rPr>
       <w:tblPr/>
@@ -11960,6 +12633,7 @@
       <w:spacing w:after="0" w:line="240" w:lineRule="auto"/>
     </w:pPr>
     <w:rPr>
+      <w:noProof/>
       <w:color w:val="000000" w:themeColor="text1"/>
     </w:rPr>
     <w:tblPr>
@@ -11983,6 +12657,7 @@
       <w:rPr>
         <w:b/>
         <w:bCs/>
+        <w:noProof/>
       </w:rPr>
       <w:tblPr/>
       <w:tcPr>
@@ -11993,6 +12668,7 @@
       <w:rPr>
         <w:b/>
         <w:bCs/>
+        <w:noProof/>
         <w:color w:val="000000" w:themeColor="text1"/>
       </w:rPr>
       <w:tblPr/>
@@ -12002,6 +12678,7 @@
     </w:tblStylePr>
     <w:tblStylePr w:type="firstCol">
       <w:rPr>
+        <w:noProof/>
         <w:color w:val="FFFFFF" w:themeColor="background1"/>
       </w:rPr>
       <w:tblPr/>
@@ -12011,6 +12688,7 @@
     </w:tblStylePr>
     <w:tblStylePr w:type="lastCol">
       <w:rPr>
+        <w:noProof/>
         <w:color w:val="FFFFFF" w:themeColor="background1"/>
       </w:rPr>
       <w:tblPr/>
@@ -12040,6 +12718,7 @@
       <w:spacing w:after="0" w:line="240" w:lineRule="auto"/>
     </w:pPr>
     <w:rPr>
+      <w:noProof/>
       <w:color w:val="000000" w:themeColor="text1"/>
     </w:rPr>
     <w:tblPr>
@@ -12063,6 +12742,7 @@
       <w:rPr>
         <w:b/>
         <w:bCs/>
+        <w:noProof/>
       </w:rPr>
       <w:tblPr/>
       <w:tcPr>
@@ -12073,6 +12753,7 @@
       <w:rPr>
         <w:b/>
         <w:bCs/>
+        <w:noProof/>
         <w:color w:val="000000" w:themeColor="text1"/>
       </w:rPr>
       <w:tblPr/>
@@ -12082,6 +12763,7 @@
     </w:tblStylePr>
     <w:tblStylePr w:type="firstCol">
       <w:rPr>
+        <w:noProof/>
         <w:color w:val="FFFFFF" w:themeColor="background1"/>
       </w:rPr>
       <w:tblPr/>
@@ -12091,6 +12773,7 @@
     </w:tblStylePr>
     <w:tblStylePr w:type="lastCol">
       <w:rPr>
+        <w:noProof/>
         <w:color w:val="FFFFFF" w:themeColor="background1"/>
       </w:rPr>
       <w:tblPr/>
@@ -12120,6 +12803,7 @@
       <w:spacing w:after="0" w:line="240" w:lineRule="auto"/>
     </w:pPr>
     <w:rPr>
+      <w:noProof/>
       <w:color w:val="000000" w:themeColor="text1"/>
     </w:rPr>
     <w:tblPr>
@@ -12143,6 +12827,7 @@
       <w:rPr>
         <w:b/>
         <w:bCs/>
+        <w:noProof/>
       </w:rPr>
       <w:tblPr/>
       <w:tcPr>
@@ -12153,6 +12838,7 @@
       <w:rPr>
         <w:b/>
         <w:bCs/>
+        <w:noProof/>
         <w:color w:val="000000" w:themeColor="text1"/>
       </w:rPr>
       <w:tblPr/>
@@ -12162,6 +12848,7 @@
     </w:tblStylePr>
     <w:tblStylePr w:type="firstCol">
       <w:rPr>
+        <w:noProof/>
         <w:color w:val="FFFFFF" w:themeColor="background1"/>
       </w:rPr>
       <w:tblPr/>
@@ -12171,6 +12858,7 @@
     </w:tblStylePr>
     <w:tblStylePr w:type="lastCol">
       <w:rPr>
+        <w:noProof/>
         <w:color w:val="FFFFFF" w:themeColor="background1"/>
       </w:rPr>
       <w:tblPr/>
@@ -12200,6 +12888,7 @@
       <w:spacing w:after="0" w:line="240" w:lineRule="auto"/>
     </w:pPr>
     <w:rPr>
+      <w:noProof/>
       <w:color w:val="000000" w:themeColor="text1"/>
     </w:rPr>
     <w:tblPr>
@@ -12223,6 +12912,7 @@
       <w:rPr>
         <w:b/>
         <w:bCs/>
+        <w:noProof/>
       </w:rPr>
       <w:tblPr/>
       <w:tcPr>
@@ -12233,6 +12923,7 @@
       <w:rPr>
         <w:b/>
         <w:bCs/>
+        <w:noProof/>
         <w:color w:val="000000" w:themeColor="text1"/>
       </w:rPr>
       <w:tblPr/>
@@ -12242,6 +12933,7 @@
     </w:tblStylePr>
     <w:tblStylePr w:type="firstCol">
       <w:rPr>
+        <w:noProof/>
         <w:color w:val="FFFFFF" w:themeColor="background1"/>
       </w:rPr>
       <w:tblPr/>
@@ -12251,6 +12943,7 @@
     </w:tblStylePr>
     <w:tblStylePr w:type="lastCol">
       <w:rPr>
+        <w:noProof/>
         <w:color w:val="FFFFFF" w:themeColor="background1"/>
       </w:rPr>
       <w:tblPr/>
@@ -12280,6 +12973,7 @@
       <w:spacing w:after="0" w:line="240" w:lineRule="auto"/>
     </w:pPr>
     <w:rPr>
+      <w:noProof/>
       <w:color w:val="000000" w:themeColor="text1"/>
     </w:rPr>
     <w:tblPr>
@@ -12303,6 +12997,7 @@
       <w:rPr>
         <w:b/>
         <w:bCs/>
+        <w:noProof/>
       </w:rPr>
       <w:tblPr/>
       <w:tcPr>
@@ -12313,6 +13008,7 @@
       <w:rPr>
         <w:b/>
         <w:bCs/>
+        <w:noProof/>
         <w:color w:val="000000" w:themeColor="text1"/>
       </w:rPr>
       <w:tblPr/>
@@ -12322,6 +13018,7 @@
     </w:tblStylePr>
     <w:tblStylePr w:type="firstCol">
       <w:rPr>
+        <w:noProof/>
         <w:color w:val="FFFFFF" w:themeColor="background1"/>
       </w:rPr>
       <w:tblPr/>
@@ -12331,6 +13028,7 @@
     </w:tblStylePr>
     <w:tblStylePr w:type="lastCol">
       <w:rPr>
+        <w:noProof/>
         <w:color w:val="FFFFFF" w:themeColor="background1"/>
       </w:rPr>
       <w:tblPr/>

</xml_diff>

<commit_message>
Fix style rPr placement so files pass schema validation
Co-Authored-By: Claude Opus 5.5 <noreply@anthropic.com>
Claude-Session: https://claude.ai/code/session_013eZbSDorZB8dhyvM8NFPNW
</commit_message>
<xml_diff>
--- a/negotiation-final-project/למידה_אישית_כותבת_1.docx
+++ b/negotiation-final-project/למידה_אישית_כותבת_1.docx
@@ -993,18 +993,12 @@
         <w:right w:w="108" w:type="dxa"/>
       </w:tblCellMar>
     </w:tblPr>
-    <w:rPr>
-      <w:noProof/>
-    </w:rPr>
   </w:style>
   <w:style w:type="numbering" w:default="1" w:styleId="NoList">
     <w:name w:val="No List"/>
     <w:uiPriority w:val="99"/>
     <w:semiHidden/>
     <w:unhideWhenUsed/>
-    <w:rPr>
-      <w:noProof/>
-    </w:rPr>
   </w:style>
   <w:style w:type="paragraph" w:styleId="NoSpacing">
     <w:name w:val="No Spacing"/>
@@ -1773,9 +1767,6 @@
         <w:right w:w="108" w:type="dxa"/>
       </w:tblCellMar>
     </w:tblPr>
-    <w:rPr>
-      <w:noProof/>
-    </w:rPr>
   </w:style>
   <w:style w:type="table" w:styleId="LightShading">
     <w:name w:val="Light Shading"/>
@@ -2628,9 +2619,6 @@
         </w:tcBorders>
       </w:tcPr>
     </w:tblStylePr>
-    <w:rPr>
-      <w:noProof/>
-    </w:rPr>
   </w:style>
   <w:style w:type="table" w:styleId="LightList-Accent1">
     <w:name w:val="Light List Accent 1"/>
@@ -2727,9 +2715,6 @@
         </w:tcBorders>
       </w:tcPr>
     </w:tblStylePr>
-    <w:rPr>
-      <w:noProof/>
-    </w:rPr>
   </w:style>
   <w:style w:type="table" w:styleId="LightList-Accent2">
     <w:name w:val="Light List Accent 2"/>
@@ -2826,9 +2811,6 @@
         </w:tcBorders>
       </w:tcPr>
     </w:tblStylePr>
-    <w:rPr>
-      <w:noProof/>
-    </w:rPr>
   </w:style>
   <w:style w:type="table" w:styleId="LightList-Accent3">
     <w:name w:val="Light List Accent 3"/>
@@ -2925,9 +2907,6 @@
         </w:tcBorders>
       </w:tcPr>
     </w:tblStylePr>
-    <w:rPr>
-      <w:noProof/>
-    </w:rPr>
   </w:style>
   <w:style w:type="table" w:styleId="LightList-Accent4">
     <w:name w:val="Light List Accent 4"/>
@@ -3024,9 +3003,6 @@
         </w:tcBorders>
       </w:tcPr>
     </w:tblStylePr>
-    <w:rPr>
-      <w:noProof/>
-    </w:rPr>
   </w:style>
   <w:style w:type="table" w:styleId="LightList-Accent5">
     <w:name w:val="Light List Accent 5"/>
@@ -3123,9 +3099,6 @@
         </w:tcBorders>
       </w:tcPr>
     </w:tblStylePr>
-    <w:rPr>
-      <w:noProof/>
-    </w:rPr>
   </w:style>
   <w:style w:type="table" w:styleId="LightList-Accent6">
     <w:name w:val="Light List Accent 6"/>
@@ -3222,9 +3195,6 @@
         </w:tcBorders>
       </w:tcPr>
     </w:tblStylePr>
-    <w:rPr>
-      <w:noProof/>
-    </w:rPr>
   </w:style>
   <w:style w:type="table" w:styleId="LightGrid">
     <w:name w:val="Light Grid"/>
@@ -3359,9 +3329,6 @@
         </w:tcBorders>
       </w:tcPr>
     </w:tblStylePr>
-    <w:rPr>
-      <w:noProof/>
-    </w:rPr>
   </w:style>
   <w:style w:type="table" w:styleId="LightGrid-Accent1">
     <w:name w:val="Light Grid Accent 1"/>
@@ -3496,9 +3463,6 @@
         </w:tcBorders>
       </w:tcPr>
     </w:tblStylePr>
-    <w:rPr>
-      <w:noProof/>
-    </w:rPr>
   </w:style>
   <w:style w:type="table" w:styleId="LightGrid-Accent2">
     <w:name w:val="Light Grid Accent 2"/>
@@ -3633,9 +3597,6 @@
         </w:tcBorders>
       </w:tcPr>
     </w:tblStylePr>
-    <w:rPr>
-      <w:noProof/>
-    </w:rPr>
   </w:style>
   <w:style w:type="table" w:styleId="LightGrid-Accent3">
     <w:name w:val="Light Grid Accent 3"/>
@@ -3770,9 +3731,6 @@
         </w:tcBorders>
       </w:tcPr>
     </w:tblStylePr>
-    <w:rPr>
-      <w:noProof/>
-    </w:rPr>
   </w:style>
   <w:style w:type="table" w:styleId="LightGrid-Accent4">
     <w:name w:val="Light Grid Accent 4"/>
@@ -3907,9 +3865,6 @@
         </w:tcBorders>
       </w:tcPr>
     </w:tblStylePr>
-    <w:rPr>
-      <w:noProof/>
-    </w:rPr>
   </w:style>
   <w:style w:type="table" w:styleId="LightGrid-Accent5">
     <w:name w:val="Light Grid Accent 5"/>
@@ -4044,9 +3999,6 @@
         </w:tcBorders>
       </w:tcPr>
     </w:tblStylePr>
-    <w:rPr>
-      <w:noProof/>
-    </w:rPr>
   </w:style>
   <w:style w:type="table" w:styleId="LightGrid-Accent6">
     <w:name w:val="Light Grid Accent 6"/>
@@ -4181,9 +4133,6 @@
         </w:tcBorders>
       </w:tcPr>
     </w:tblStylePr>
-    <w:rPr>
-      <w:noProof/>
-    </w:rPr>
   </w:style>
   <w:style w:type="table" w:styleId="MediumShading1">
     <w:name w:val="Medium Shading 1"/>
@@ -4294,9 +4243,6 @@
         </w:tcBorders>
       </w:tcPr>
     </w:tblStylePr>
-    <w:rPr>
-      <w:noProof/>
-    </w:rPr>
   </w:style>
   <w:style w:type="table" w:styleId="MediumShading1-Accent1">
     <w:name w:val="Medium Shading 1 Accent 1"/>
@@ -4407,9 +4353,6 @@
         </w:tcBorders>
       </w:tcPr>
     </w:tblStylePr>
-    <w:rPr>
-      <w:noProof/>
-    </w:rPr>
   </w:style>
   <w:style w:type="table" w:styleId="MediumShading1-Accent2">
     <w:name w:val="Medium Shading 1 Accent 2"/>
@@ -4520,9 +4463,6 @@
         </w:tcBorders>
       </w:tcPr>
     </w:tblStylePr>
-    <w:rPr>
-      <w:noProof/>
-    </w:rPr>
   </w:style>
   <w:style w:type="table" w:styleId="MediumShading1-Accent3">
     <w:name w:val="Medium Shading 1 Accent 3"/>
@@ -4633,9 +4573,6 @@
         </w:tcBorders>
       </w:tcPr>
     </w:tblStylePr>
-    <w:rPr>
-      <w:noProof/>
-    </w:rPr>
   </w:style>
   <w:style w:type="table" w:styleId="MediumShading1-Accent4">
     <w:name w:val="Medium Shading 1 Accent 4"/>
@@ -4746,9 +4683,6 @@
         </w:tcBorders>
       </w:tcPr>
     </w:tblStylePr>
-    <w:rPr>
-      <w:noProof/>
-    </w:rPr>
   </w:style>
   <w:style w:type="table" w:styleId="MediumShading1-Accent5">
     <w:name w:val="Medium Shading 1 Accent 5"/>
@@ -4859,9 +4793,6 @@
         </w:tcBorders>
       </w:tcPr>
     </w:tblStylePr>
-    <w:rPr>
-      <w:noProof/>
-    </w:rPr>
   </w:style>
   <w:style w:type="table" w:styleId="MediumShading1-Accent6">
     <w:name w:val="Medium Shading 1 Accent 6"/>
@@ -4972,9 +4903,6 @@
         </w:tcBorders>
       </w:tcPr>
     </w:tblStylePr>
-    <w:rPr>
-      <w:noProof/>
-    </w:rPr>
   </w:style>
   <w:style w:type="table" w:styleId="MediumShading2">
     <w:name w:val="Medium Shading 2"/>
@@ -5129,9 +5057,6 @@
         </w:tcBorders>
       </w:tcPr>
     </w:tblStylePr>
-    <w:rPr>
-      <w:noProof/>
-    </w:rPr>
   </w:style>
   <w:style w:type="table" w:styleId="MediumShading2-Accent1">
     <w:name w:val="Medium Shading 2 Accent 1"/>
@@ -5286,9 +5211,6 @@
         </w:tcBorders>
       </w:tcPr>
     </w:tblStylePr>
-    <w:rPr>
-      <w:noProof/>
-    </w:rPr>
   </w:style>
   <w:style w:type="table" w:styleId="MediumShading2-Accent2">
     <w:name w:val="Medium Shading 2 Accent 2"/>
@@ -5443,9 +5365,6 @@
         </w:tcBorders>
       </w:tcPr>
     </w:tblStylePr>
-    <w:rPr>
-      <w:noProof/>
-    </w:rPr>
   </w:style>
   <w:style w:type="table" w:styleId="MediumShading2-Accent3">
     <w:name w:val="Medium Shading 2 Accent 3"/>
@@ -5600,9 +5519,6 @@
         </w:tcBorders>
       </w:tcPr>
     </w:tblStylePr>
-    <w:rPr>
-      <w:noProof/>
-    </w:rPr>
   </w:style>
   <w:style w:type="table" w:styleId="MediumShading2-Accent4">
     <w:name w:val="Medium Shading 2 Accent 4"/>
@@ -5757,9 +5673,6 @@
         </w:tcBorders>
       </w:tcPr>
     </w:tblStylePr>
-    <w:rPr>
-      <w:noProof/>
-    </w:rPr>
   </w:style>
   <w:style w:type="table" w:styleId="MediumShading2-Accent5">
     <w:name w:val="Medium Shading 2 Accent 5"/>
@@ -5914,9 +5827,6 @@
         </w:tcBorders>
       </w:tcPr>
     </w:tblStylePr>
-    <w:rPr>
-      <w:noProof/>
-    </w:rPr>
   </w:style>
   <w:style w:type="table" w:styleId="MediumShading2-Accent6">
     <w:name w:val="Medium Shading 2 Accent 6"/>
@@ -6071,9 +5981,6 @@
         </w:tcBorders>
       </w:tcPr>
     </w:tblStylePr>
-    <w:rPr>
-      <w:noProof/>
-    </w:rPr>
   </w:style>
   <w:style w:type="table" w:styleId="MediumList1">
     <w:name w:val="Medium List 1"/>
@@ -7684,9 +7591,6 @@
         <w:shd w:val="clear" w:color="auto" w:fill="808080" w:themeFill="text1" w:themeFillTint="7F"/>
       </w:tcPr>
     </w:tblStylePr>
-    <w:rPr>
-      <w:noProof/>
-    </w:rPr>
   </w:style>
   <w:style w:type="table" w:styleId="MediumGrid1-Accent1">
     <w:name w:val="Medium Grid 1 Accent 1"/>
@@ -7764,9 +7668,6 @@
         <w:shd w:val="clear" w:color="auto" w:fill="A7BFDE" w:themeFill="accent1" w:themeFillTint="7F"/>
       </w:tcPr>
     </w:tblStylePr>
-    <w:rPr>
-      <w:noProof/>
-    </w:rPr>
   </w:style>
   <w:style w:type="table" w:styleId="MediumGrid1-Accent2">
     <w:name w:val="Medium Grid 1 Accent 2"/>
@@ -7844,9 +7745,6 @@
         <w:shd w:val="clear" w:color="auto" w:fill="DFA7A6" w:themeFill="accent2" w:themeFillTint="7F"/>
       </w:tcPr>
     </w:tblStylePr>
-    <w:rPr>
-      <w:noProof/>
-    </w:rPr>
   </w:style>
   <w:style w:type="table" w:styleId="MediumGrid1-Accent3">
     <w:name w:val="Medium Grid 1 Accent 3"/>
@@ -7924,9 +7822,6 @@
         <w:shd w:val="clear" w:color="auto" w:fill="CDDDAC" w:themeFill="accent3" w:themeFillTint="7F"/>
       </w:tcPr>
     </w:tblStylePr>
-    <w:rPr>
-      <w:noProof/>
-    </w:rPr>
   </w:style>
   <w:style w:type="table" w:styleId="MediumGrid1-Accent4">
     <w:name w:val="Medium Grid 1 Accent 4"/>
@@ -8004,9 +7899,6 @@
         <w:shd w:val="clear" w:color="auto" w:fill="BFB1D0" w:themeFill="accent4" w:themeFillTint="7F"/>
       </w:tcPr>
     </w:tblStylePr>
-    <w:rPr>
-      <w:noProof/>
-    </w:rPr>
   </w:style>
   <w:style w:type="table" w:styleId="MediumGrid1-Accent5">
     <w:name w:val="Medium Grid 1 Accent 5"/>
@@ -8084,9 +7976,6 @@
         <w:shd w:val="clear" w:color="auto" w:fill="A5D5E2" w:themeFill="accent5" w:themeFillTint="7F"/>
       </w:tcPr>
     </w:tblStylePr>
-    <w:rPr>
-      <w:noProof/>
-    </w:rPr>
   </w:style>
   <w:style w:type="table" w:styleId="MediumGrid1-Accent6">
     <w:name w:val="Medium Grid 1 Accent 6"/>
@@ -8164,9 +8053,6 @@
         <w:shd w:val="clear" w:color="auto" w:fill="FBCAA2" w:themeFill="accent6" w:themeFillTint="7F"/>
       </w:tcPr>
     </w:tblStylePr>
-    <w:rPr>
-      <w:noProof/>
-    </w:rPr>
   </w:style>
   <w:style w:type="table" w:styleId="MediumGrid2">
     <w:name w:val="Medium Grid 2"/>
@@ -9222,9 +9108,6 @@
         <w:shd w:val="clear" w:color="auto" w:fill="808080" w:themeFill="text1" w:themeFillTint="7F"/>
       </w:tcPr>
     </w:tblStylePr>
-    <w:rPr>
-      <w:noProof/>
-    </w:rPr>
   </w:style>
   <w:style w:type="table" w:styleId="MediumGrid3-Accent1">
     <w:name w:val="Medium Grid 3 Accent 1"/>
@@ -9370,9 +9253,6 @@
         <w:shd w:val="clear" w:color="auto" w:fill="A7BFDE" w:themeFill="accent1" w:themeFillTint="7F"/>
       </w:tcPr>
     </w:tblStylePr>
-    <w:rPr>
-      <w:noProof/>
-    </w:rPr>
   </w:style>
   <w:style w:type="table" w:styleId="MediumGrid3-Accent2">
     <w:name w:val="Medium Grid 3 Accent 2"/>
@@ -9518,9 +9398,6 @@
         <w:shd w:val="clear" w:color="auto" w:fill="DFA7A6" w:themeFill="accent2" w:themeFillTint="7F"/>
       </w:tcPr>
     </w:tblStylePr>
-    <w:rPr>
-      <w:noProof/>
-    </w:rPr>
   </w:style>
   <w:style w:type="table" w:styleId="MediumGrid3-Accent3">
     <w:name w:val="Medium Grid 3 Accent 3"/>
@@ -9666,9 +9543,6 @@
         <w:shd w:val="clear" w:color="auto" w:fill="CDDDAC" w:themeFill="accent3" w:themeFillTint="7F"/>
       </w:tcPr>
     </w:tblStylePr>
-    <w:rPr>
-      <w:noProof/>
-    </w:rPr>
   </w:style>
   <w:style w:type="table" w:styleId="MediumGrid3-Accent4">
     <w:name w:val="Medium Grid 3 Accent 4"/>
@@ -9814,9 +9688,6 @@
         <w:shd w:val="clear" w:color="auto" w:fill="BFB1D0" w:themeFill="accent4" w:themeFillTint="7F"/>
       </w:tcPr>
     </w:tblStylePr>
-    <w:rPr>
-      <w:noProof/>
-    </w:rPr>
   </w:style>
   <w:style w:type="table" w:styleId="MediumGrid3-Accent5">
     <w:name w:val="Medium Grid 3 Accent 5"/>
@@ -9962,9 +9833,6 @@
         <w:shd w:val="clear" w:color="auto" w:fill="A5D5E2" w:themeFill="accent5" w:themeFillTint="7F"/>
       </w:tcPr>
     </w:tblStylePr>
-    <w:rPr>
-      <w:noProof/>
-    </w:rPr>
   </w:style>
   <w:style w:type="table" w:styleId="MediumGrid3-Accent6">
     <w:name w:val="Medium Grid 3 Accent 6"/>
@@ -10110,9 +9978,6 @@
         <w:shd w:val="clear" w:color="auto" w:fill="FBCAA2" w:themeFill="accent6" w:themeFillTint="7F"/>
       </w:tcPr>
     </w:tblStylePr>
-    <w:rPr>
-      <w:noProof/>
-    </w:rPr>
   </w:style>
   <w:style w:type="table" w:styleId="DarkList">
     <w:name w:val="Dark List"/>

</xml_diff>